<commit_message>
fix: align Bab 1 compact header with non-compact, remove all icons, use direct 1.1 numbering
</commit_message>
<xml_diff>
--- a/tools/report_metodologi/bab_1/Metodologi_Bab1_Ekspansi_Industri_Compact.docx
+++ b/tools/report_metodologi/bab_1/Metodologi_Bab1_Ekspansi_Industri_Compact.docx
@@ -5,34 +5,32 @@
     <w:p>
       <w:pPr>
         <w:spacing w:before="0" w:after="40"/>
-        <w:jc w:val="center"/>
+      </w:pPr>
+      <w:r>
+        <w:rPr>
+          <w:b/>
+          <w:i w:val="0"/>
+          <w:color w:val="2E7D32"/>
+          <w:sz w:val="16"/>
+        </w:rPr>
+        <w:t>CELIOS — CENTER OF ECONOMIC AND LAW STUDIES  |  LAPORAN RISET METODOLOGI D3TLH (VERSI COMPACT)</w:t>
+      </w:r>
+    </w:p>
+    <w:p>
+      <w:pPr>
+        <w:spacing w:before="280" w:after="120"/>
+        <w:pBdr>
+          <w:bottom w:val="single" w:sz="12" w:space="2" w:color="1B5E20"/>
+        </w:pBdr>
       </w:pPr>
       <w:r>
         <w:rPr>
           <w:b/>
           <w:i w:val="0"/>
           <w:color w:val="1B5E20"/>
-          <w:sz w:val="28"/>
+          <w:sz w:val="26"/>
         </w:rPr>
-        <w:t>LAPORAN METODOLOGI STATISTIK (VERSI COMPACT)</w:t>
-      </w:r>
-    </w:p>
-    <w:p>
-      <w:pPr>
-        <w:spacing w:before="0" w:after="240"/>
-        <w:jc w:val="center"/>
-        <w:pBdr>
-          <w:bottom w:val="single" w:sz="12" w:space="2" w:color="1B5E20"/>
-        </w:pBdr>
-      </w:pPr>
-      <w:r>
-        <w:rPr>
-          <w:b w:val="0"/>
-          <w:i/>
-          <w:color w:val="2E7D32"/>
-          <w:sz w:val="20"/>
-        </w:rPr>
-        <w:t>Bab 1: Ekspansi Industri Ekstraktif dan Infrastruktur Penunjang di Pulau Sulawesi (2014–2024)</w:t>
+        <w:t>BAB I: METODOLOGI ANALISIS EKSPANSI INDUSTRI EKSTRAKTIF DAN INFRASTRUKTUR PENUNJANG DI PULAU SULAWESI</w:t>
       </w:r>
     </w:p>
     <w:p>
@@ -42,12 +40,21 @@
       </w:pPr>
       <w:r>
         <w:rPr>
+          <w:b w:val="0"/>
+          <w:i w:val="0"/>
+          <w:color w:val="222222"/>
+          <w:sz w:val="19"/>
+        </w:rPr>
+        <w:t xml:space="preserve">Dokumen laporan metodologi ringkas (Versi Compact) ini menyajikan kerangka ilmiah, landasan regulasi, formulasi matematis, prosedur analisis statistik, serta metodologi pembuktian berbasis data terbuka yang dioperasionalkan pada </w:t>
+      </w:r>
+      <w:r>
+        <w:rPr>
           <w:b/>
           <w:i w:val="0"/>
           <w:color w:val="222222"/>
           <w:sz w:val="19"/>
         </w:rPr>
-        <w:t xml:space="preserve">Penerbit: </w:t>
+        <w:t>Bab 1: Ekspansi Industri Ekstraktif</w:t>
       </w:r>
       <w:r>
         <w:rPr>
@@ -56,68 +63,15 @@
           <w:color w:val="222222"/>
           <w:sz w:val="19"/>
         </w:rPr>
-        <w:t xml:space="preserve">Center of Economic and Law Studies (CELIOS)  |  </w:t>
-      </w:r>
-      <w:r>
-        <w:rPr>
-          <w:b/>
-          <w:i w:val="0"/>
-          <w:color w:val="222222"/>
-          <w:sz w:val="19"/>
-        </w:rPr>
-        <w:t xml:space="preserve">Kategori: </w:t>
-      </w:r>
-      <w:r>
-        <w:rPr>
-          <w:b w:val="0"/>
-          <w:i w:val="0"/>
-          <w:color w:val="222222"/>
-          <w:sz w:val="19"/>
-        </w:rPr>
-        <w:t xml:space="preserve">Factsheet Metodologi &amp; Transparansi Statistik Publik  |  </w:t>
-      </w:r>
-      <w:r>
-        <w:rPr>
-          <w:b/>
-          <w:i w:val="0"/>
-          <w:color w:val="222222"/>
-          <w:sz w:val="19"/>
-        </w:rPr>
-        <w:t xml:space="preserve">Cakupan: </w:t>
-      </w:r>
-      <w:r>
-        <w:rPr>
-          <w:b w:val="0"/>
-          <w:i w:val="0"/>
-          <w:color w:val="222222"/>
-          <w:sz w:val="19"/>
-        </w:rPr>
-        <w:t>6 Provinsi se-Pulau Sulawesi (2014–2024)</w:t>
+        <w:t xml:space="preserve"> dalam studi Daya Dukung dan Daya Tampung Lingkungan Hidup (D3TLH) Sulawesi periode 2014–2024.</w:t>
       </w:r>
     </w:p>
     <w:p>
       <w:pPr>
-        <w:spacing w:before="280" w:after="80"/>
-        <w:pBdr>
-          <w:bottom w:val="single" w:sz="8" w:space="2" w:color="2E7D32"/>
-        </w:pBdr>
-      </w:pPr>
-      <w:r>
-        <w:rPr>
-          <w:b/>
-          <w:i w:val="0"/>
-          <w:color w:val="1B5E20"/>
-          <w:sz w:val="22"/>
-        </w:rPr>
-        <w:t>BAGIAN I: KONSENTRASI MAKROEKONOMI &amp; KETIMPANGAN SPASIAL PDRB</w:t>
-      </w:r>
-    </w:p>
-    <w:p>
-      <w:pPr>
-        <w:spacing w:before="200" w:after="60"/>
+        <w:spacing w:before="220" w:after="60"/>
         <w:ind w:left="80"/>
         <w:pBdr>
-          <w:left w:val="single" w:sz="20" w:space="6" w:color="2E7D32"/>
+          <w:left w:val="single" w:sz="18" w:space="6" w:color="2E7D32"/>
         </w:pBdr>
         <w:shd w:val="clear" w:color="auto" w:fill="F1F8E9"/>
       </w:pPr>
@@ -128,7 +82,7 @@
           <w:color w:val="1B5E20"/>
           <w:sz w:val="20"/>
         </w:rPr>
-        <w:t xml:space="preserve">POIN 1.1 </w:t>
+        <w:t xml:space="preserve">1.1 </w:t>
       </w:r>
       <w:r>
         <w:rPr>
@@ -272,7 +226,7 @@
           <w:color w:val="1B5E20"/>
           <w:sz w:val="16"/>
         </w:rPr>
-        <w:t xml:space="preserve">• Kat.B, C, D: </w:t>
+        <w:t xml:space="preserve">- Kat.B, C, D: </w:t>
       </w:r>
       <w:r>
         <w:rPr>
@@ -291,7 +245,7 @@
           <w:color w:val="1B5E20"/>
           <w:sz w:val="16"/>
         </w:rPr>
-        <w:t xml:space="preserve">• PDRB_Ekstraktif: </w:t>
+        <w:t xml:space="preserve">- PDRB_Ekstraktif: </w:t>
       </w:r>
       <w:r>
         <w:rPr>
@@ -310,7 +264,7 @@
           <w:color w:val="1B5E20"/>
           <w:sz w:val="16"/>
         </w:rPr>
-        <w:t xml:space="preserve">• PDRB_Total: </w:t>
+        <w:t xml:space="preserve">- PDRB_Total: </w:t>
       </w:r>
       <w:r>
         <w:rPr>
@@ -338,7 +292,7 @@
           <w:color w:val="1B5E20"/>
           <w:sz w:val="17"/>
         </w:rPr>
-        <w:t xml:space="preserve">🔎 SKALA HUMANISASI (REALITAS SOSIAL): </w:t>
+        <w:t xml:space="preserve">SKALA HUMANISASI (REALITAS SOSIAL): </w:t>
       </w:r>
       <w:r>
         <w:rPr>
@@ -355,18 +309,18 @@
         <w:spacing w:before="80" w:after="80"/>
         <w:ind w:left="200"/>
         <w:pBdr>
-          <w:left w:val="single" w:sz="16" w:space="6" w:color="E65100"/>
+          <w:left w:val="single" w:sz="16" w:space="6" w:color="2E7D32"/>
         </w:pBdr>
-        <w:shd w:val="clear" w:color="auto" w:fill="FFF3E0"/>
+        <w:shd w:val="clear" w:color="auto" w:fill="F9FBF9"/>
       </w:pPr>
       <w:r>
         <w:rPr>
           <w:b/>
           <w:i w:val="0"/>
-          <w:color w:val="E65100"/>
+          <w:color w:val="1B5E20"/>
           <w:sz w:val="17"/>
         </w:rPr>
-        <w:t xml:space="preserve">⚠️ BATASAN DATA (CAVEATS): </w:t>
+        <w:t xml:space="preserve">CATATAN KETERBATASAN DATA (CAVEATS): </w:t>
       </w:r>
       <w:r>
         <w:rPr>
@@ -380,10 +334,10 @@
     </w:p>
     <w:p>
       <w:pPr>
-        <w:spacing w:before="200" w:after="60"/>
+        <w:spacing w:before="220" w:after="60"/>
         <w:ind w:left="80"/>
         <w:pBdr>
-          <w:left w:val="single" w:sz="20" w:space="6" w:color="2E7D32"/>
+          <w:left w:val="single" w:sz="18" w:space="6" w:color="2E7D32"/>
         </w:pBdr>
         <w:shd w:val="clear" w:color="auto" w:fill="F1F8E9"/>
       </w:pPr>
@@ -394,7 +348,7 @@
           <w:color w:val="1B5E20"/>
           <w:sz w:val="20"/>
         </w:rPr>
-        <w:t xml:space="preserve">POIN 1.2 </w:t>
+        <w:t xml:space="preserve">1.2 </w:t>
       </w:r>
       <w:r>
         <w:rPr>
@@ -574,7 +528,7 @@
           <w:color w:val="1B5E20"/>
           <w:sz w:val="16"/>
         </w:rPr>
-        <w:t xml:space="preserve">• PDRB Morowali: </w:t>
+        <w:t xml:space="preserve">- PDRB Morowali: </w:t>
       </w:r>
       <w:r>
         <w:rPr>
@@ -593,7 +547,7 @@
           <w:color w:val="1B5E20"/>
           <w:sz w:val="16"/>
         </w:rPr>
-        <w:t xml:space="preserve">• Rasio Kesenjangan: </w:t>
+        <w:t xml:space="preserve">- Rasio Kesenjangan: </w:t>
       </w:r>
       <w:r>
         <w:rPr>
@@ -621,7 +575,7 @@
           <w:color w:val="1B5E20"/>
           <w:sz w:val="17"/>
         </w:rPr>
-        <w:t xml:space="preserve">🔎 SKALA HUMANISASI (REALITAS SOSIAL): </w:t>
+        <w:t xml:space="preserve">SKALA HUMANISASI (REALITAS SOSIAL): </w:t>
       </w:r>
       <w:r>
         <w:rPr>
@@ -638,18 +592,18 @@
         <w:spacing w:before="80" w:after="80"/>
         <w:ind w:left="200"/>
         <w:pBdr>
-          <w:left w:val="single" w:sz="16" w:space="6" w:color="E65100"/>
+          <w:left w:val="single" w:sz="16" w:space="6" w:color="2E7D32"/>
         </w:pBdr>
-        <w:shd w:val="clear" w:color="auto" w:fill="FFF3E0"/>
+        <w:shd w:val="clear" w:color="auto" w:fill="F9FBF9"/>
       </w:pPr>
       <w:r>
         <w:rPr>
           <w:b/>
           <w:i w:val="0"/>
-          <w:color w:val="E65100"/>
+          <w:color w:val="1B5E20"/>
           <w:sz w:val="17"/>
         </w:rPr>
-        <w:t xml:space="preserve">⚠️ BATASAN DISTRIBUSI PENDAPATAN: </w:t>
+        <w:t xml:space="preserve">CATATAN KETERBATASAN DISTRIBUSI PENDAPATAN: </w:t>
       </w:r>
       <w:r>
         <w:rPr>
@@ -663,10 +617,10 @@
     </w:p>
     <w:p>
       <w:pPr>
-        <w:spacing w:before="200" w:after="60"/>
+        <w:spacing w:before="220" w:after="60"/>
         <w:ind w:left="80"/>
         <w:pBdr>
-          <w:left w:val="single" w:sz="20" w:space="6" w:color="2E7D32"/>
+          <w:left w:val="single" w:sz="18" w:space="6" w:color="2E7D32"/>
         </w:pBdr>
         <w:shd w:val="clear" w:color="auto" w:fill="F1F8E9"/>
       </w:pPr>
@@ -677,7 +631,7 @@
           <w:color w:val="1B5E20"/>
           <w:sz w:val="20"/>
         </w:rPr>
-        <w:t xml:space="preserve">POIN 1.3 </w:t>
+        <w:t xml:space="preserve">1.3 </w:t>
       </w:r>
       <w:r>
         <w:rPr>
@@ -2141,27 +2095,10 @@
     </w:tbl>
     <w:p>
       <w:pPr>
-        <w:spacing w:before="280" w:after="80"/>
-        <w:pBdr>
-          <w:bottom w:val="single" w:sz="8" w:space="2" w:color="2E7D32"/>
-        </w:pBdr>
-      </w:pPr>
-      <w:r>
-        <w:rPr>
-          <w:b/>
-          <w:i w:val="0"/>
-          <w:color w:val="1B5E20"/>
-          <w:sz w:val="22"/>
-        </w:rPr>
-        <w:t>BAGIAN II: KEPUNGAN PLTU CAPTIVE &amp; LEDAKAN IZIN TAMBANG BARU</w:t>
-      </w:r>
-    </w:p>
-    <w:p>
-      <w:pPr>
-        <w:spacing w:before="200" w:after="60"/>
+        <w:spacing w:before="220" w:after="60"/>
         <w:ind w:left="80"/>
         <w:pBdr>
-          <w:left w:val="single" w:sz="20" w:space="6" w:color="2E7D32"/>
+          <w:left w:val="single" w:sz="18" w:space="6" w:color="2E7D32"/>
         </w:pBdr>
         <w:shd w:val="clear" w:color="auto" w:fill="F1F8E9"/>
       </w:pPr>
@@ -2172,7 +2109,7 @@
           <w:color w:val="1B5E20"/>
           <w:sz w:val="20"/>
         </w:rPr>
-        <w:t xml:space="preserve">POIN 1.4 </w:t>
+        <w:t xml:space="preserve">1.4 </w:t>
       </w:r>
       <w:r>
         <w:rPr>
@@ -2298,7 +2235,7 @@
           <w:color w:val="1B5E20"/>
           <w:sz w:val="16"/>
         </w:rPr>
-        <w:t xml:space="preserve">• Operating Status: </w:t>
+        <w:t xml:space="preserve">- Operating Status: </w:t>
       </w:r>
       <w:r>
         <w:rPr>
@@ -2317,7 +2254,7 @@
           <w:color w:val="1B5E20"/>
           <w:sz w:val="16"/>
         </w:rPr>
-        <w:t xml:space="preserve">• Odds Ratio (OR = 2,8): </w:t>
+        <w:t xml:space="preserve">- Odds Ratio (OR = 2,8): </w:t>
       </w:r>
       <w:r>
         <w:rPr>
@@ -2345,7 +2282,7 @@
           <w:color w:val="1B5E20"/>
           <w:sz w:val="17"/>
         </w:rPr>
-        <w:t xml:space="preserve">🔎 SKALA HUMANISASI (REALITAS SOSIAL): </w:t>
+        <w:t xml:space="preserve">SKALA HUMANISASI (REALITAS SOSIAL): </w:t>
       </w:r>
       <w:r>
         <w:rPr>
@@ -2359,10 +2296,10 @@
     </w:p>
     <w:p>
       <w:pPr>
-        <w:spacing w:before="200" w:after="60"/>
+        <w:spacing w:before="220" w:after="60"/>
         <w:ind w:left="80"/>
         <w:pBdr>
-          <w:left w:val="single" w:sz="20" w:space="6" w:color="2E7D32"/>
+          <w:left w:val="single" w:sz="18" w:space="6" w:color="2E7D32"/>
         </w:pBdr>
         <w:shd w:val="clear" w:color="auto" w:fill="F1F8E9"/>
       </w:pPr>
@@ -2373,7 +2310,7 @@
           <w:color w:val="1B5E20"/>
           <w:sz w:val="20"/>
         </w:rPr>
-        <w:t xml:space="preserve">POIN 1.5 </w:t>
+        <w:t xml:space="preserve">1.5 </w:t>
       </w:r>
       <w:r>
         <w:rPr>
@@ -2493,6 +2430,8 @@
         <w:t>Total_Luas_Konsesi = 819.452,54 Hektar</w:t>
         <w:br/>
         <w:t>Ekuivalensi_DKI_Jakarta = 819.452,54 Ha / 66.150 Ha = 12,39 Kali Luas DKI Jakarta</w:t>
+        <w:br/>
+        <w:t>Laju_Harian = 819.452 Ha / 3.650 hari = 224,5 Hektar konsesi dialihkan per hari</w:t>
       </w:r>
     </w:p>
     <w:p>
@@ -2517,7 +2456,7 @@
           <w:color w:val="1B5E20"/>
           <w:sz w:val="16"/>
         </w:rPr>
-        <w:t xml:space="preserve">• 66.150 Ha: </w:t>
+        <w:t xml:space="preserve">- 66.150 Ha: </w:t>
       </w:r>
       <w:r>
         <w:rPr>
@@ -2536,7 +2475,7 @@
           <w:color w:val="1B5E20"/>
           <w:sz w:val="16"/>
         </w:rPr>
-        <w:t xml:space="preserve">• Laju Harian: </w:t>
+        <w:t xml:space="preserve">- Laju Harian: </w:t>
       </w:r>
       <w:r>
         <w:rPr>
@@ -2545,7 +2484,7 @@
           <w:color w:val="444444"/>
           <w:sz w:val="16"/>
         </w:rPr>
-        <w:t>819.452 Ha / 3.650 hari = 224,5 Hektar konsesi ruang dialihkan per hari</w:t>
+        <w:t>Rata-rata laju pengalihan ruang daratan kepada korporasi per hari</w:t>
       </w:r>
     </w:p>
     <w:p>
@@ -2564,7 +2503,7 @@
           <w:color w:val="1B5E20"/>
           <w:sz w:val="17"/>
         </w:rPr>
-        <w:t xml:space="preserve">🔎 SKALA HUMANISASI (REALITAS SOSIAL): </w:t>
+        <w:t xml:space="preserve">SKALA HUMANISASI (REALITAS SOSIAL): </w:t>
       </w:r>
       <w:r>
         <w:rPr>
@@ -2578,27 +2517,10 @@
     </w:p>
     <w:p>
       <w:pPr>
-        <w:spacing w:before="280" w:after="80"/>
-        <w:pBdr>
-          <w:bottom w:val="single" w:sz="8" w:space="2" w:color="2E7D32"/>
-        </w:pBdr>
-      </w:pPr>
-      <w:r>
-        <w:rPr>
-          <w:b/>
-          <w:i w:val="0"/>
-          <w:color w:val="1B5E20"/>
-          <w:sz w:val="22"/>
-        </w:rPr>
-        <w:t>BAGIAN III: ARUS MODAL PMDN, KEHILANGAN HUTAN, &amp; ALUR EKSPOR MARITIM</w:t>
-      </w:r>
-    </w:p>
-    <w:p>
-      <w:pPr>
-        <w:spacing w:before="200" w:after="60"/>
+        <w:spacing w:before="220" w:after="60"/>
         <w:ind w:left="80"/>
         <w:pBdr>
-          <w:left w:val="single" w:sz="20" w:space="6" w:color="2E7D32"/>
+          <w:left w:val="single" w:sz="18" w:space="6" w:color="2E7D32"/>
         </w:pBdr>
         <w:shd w:val="clear" w:color="auto" w:fill="F1F8E9"/>
       </w:pPr>
@@ -2609,7 +2531,7 @@
           <w:color w:val="1B5E20"/>
           <w:sz w:val="20"/>
         </w:rPr>
-        <w:t xml:space="preserve">POIN 1.6 </w:t>
+        <w:t xml:space="preserve">1.6 </w:t>
       </w:r>
       <w:r>
         <w:rPr>
@@ -2651,7 +2573,7 @@
           <w:color w:val="222222"/>
           <w:sz w:val="19"/>
         </w:rPr>
-        <w:t xml:space="preserve">. Konsentrasi modal sangat asimetris di mana 89% modal hanya mengalir ke tiga provinsi sentra (Sulawesi Tengah, Sulawesi Tenggara, dan Sulawesi Selatan). Uji statistik menunjukkan nilai p-value yang mengindikasikan fenomena </w:t>
+        <w:t xml:space="preserve">. Konsentrasi modal sangat asimetris di mana 89% modal hanya mengalir ke tiga provinsi sentra (Sulawesi Tengah, Sulawesi Tenggara, dan Sulawesi Selatan). Uji statistik menunjukkan fenomena </w:t>
       </w:r>
       <w:r>
         <w:rPr>
@@ -2733,7 +2655,7 @@
           <w:color w:val="1B5E20"/>
           <w:sz w:val="16"/>
         </w:rPr>
-        <w:t xml:space="preserve">• Investasi PMDN: </w:t>
+        <w:t xml:space="preserve">- Investasi PMDN: </w:t>
       </w:r>
       <w:r>
         <w:rPr>
@@ -2752,7 +2674,7 @@
           <w:color w:val="1B5E20"/>
           <w:sz w:val="16"/>
         </w:rPr>
-        <w:t xml:space="preserve">• Time-Lagging: </w:t>
+        <w:t xml:space="preserve">- Time-Lagging: </w:t>
       </w:r>
       <w:r>
         <w:rPr>
@@ -2766,10 +2688,10 @@
     </w:p>
     <w:p>
       <w:pPr>
-        <w:spacing w:before="200" w:after="60"/>
+        <w:spacing w:before="220" w:after="60"/>
         <w:ind w:left="80"/>
         <w:pBdr>
-          <w:left w:val="single" w:sz="20" w:space="6" w:color="2E7D32"/>
+          <w:left w:val="single" w:sz="18" w:space="6" w:color="2E7D32"/>
         </w:pBdr>
         <w:shd w:val="clear" w:color="auto" w:fill="F1F8E9"/>
       </w:pPr>
@@ -2780,7 +2702,7 @@
           <w:color w:val="1B5E20"/>
           <w:sz w:val="20"/>
         </w:rPr>
-        <w:t xml:space="preserve">POIN 1.7 </w:t>
+        <w:t xml:space="preserve">1.7 </w:t>
       </w:r>
       <w:r>
         <w:rPr>
@@ -2944,7 +2866,7 @@
           <w:color w:val="1B5E20"/>
           <w:sz w:val="16"/>
         </w:rPr>
-        <w:t xml:space="preserve">• Deforestasi Komoditas: </w:t>
+        <w:t xml:space="preserve">- Deforestasi Komoditas: </w:t>
       </w:r>
       <w:r>
         <w:rPr>
@@ -2963,7 +2885,7 @@
           <w:color w:val="1B5E20"/>
           <w:sz w:val="16"/>
         </w:rPr>
-        <w:t xml:space="preserve">• Emisi Karbon: </w:t>
+        <w:t xml:space="preserve">- Emisi Karbon: </w:t>
       </w:r>
       <w:r>
         <w:rPr>
@@ -2991,7 +2913,7 @@
           <w:color w:val="1B5E20"/>
           <w:sz w:val="17"/>
         </w:rPr>
-        <w:t xml:space="preserve">🔎 SKALA HUMANISASI (REALITAS SOSIAL): </w:t>
+        <w:t xml:space="preserve">SKALA HUMANISASI (REALITAS SOSIAL): </w:t>
       </w:r>
       <w:r>
         <w:rPr>
@@ -3005,10 +2927,10 @@
     </w:p>
     <w:p>
       <w:pPr>
-        <w:spacing w:before="200" w:after="60"/>
+        <w:spacing w:before="220" w:after="60"/>
         <w:ind w:left="80"/>
         <w:pBdr>
-          <w:left w:val="single" w:sz="20" w:space="6" w:color="2E7D32"/>
+          <w:left w:val="single" w:sz="18" w:space="6" w:color="2E7D32"/>
         </w:pBdr>
         <w:shd w:val="clear" w:color="auto" w:fill="F1F8E9"/>
       </w:pPr>
@@ -3019,7 +2941,7 @@
           <w:color w:val="1B5E20"/>
           <w:sz w:val="20"/>
         </w:rPr>
-        <w:t xml:space="preserve">POIN 1.8 </w:t>
+        <w:t xml:space="preserve">1.8 </w:t>
       </w:r>
       <w:r>
         <w:rPr>
@@ -3161,7 +3083,7 @@
           <w:color w:val="1B5E20"/>
           <w:sz w:val="16"/>
         </w:rPr>
-        <w:t xml:space="preserve">• P_Asal: </w:t>
+        <w:t xml:space="preserve">- P_Asal: </w:t>
       </w:r>
       <w:r>
         <w:rPr>
@@ -3180,7 +3102,7 @@
           <w:color w:val="1B5E20"/>
           <w:sz w:val="16"/>
         </w:rPr>
-        <w:t xml:space="preserve">• P_Tujuan: </w:t>
+        <w:t xml:space="preserve">- P_Tujuan: </w:t>
       </w:r>
       <w:r>
         <w:rPr>
@@ -3199,7 +3121,7 @@
           <w:color w:val="1B5E20"/>
           <w:sz w:val="16"/>
         </w:rPr>
-        <w:t xml:space="preserve">• Asimetri Rantai Pasok: </w:t>
+        <w:t xml:space="preserve">- Asimetri Rantai Pasok: </w:t>
       </w:r>
       <w:r>
         <w:rPr>
@@ -3213,16 +3135,63 @@
     </w:p>
     <w:p>
       <w:pPr>
-        <w:spacing w:before="100" w:after="40"/>
+        <w:spacing w:before="220" w:after="60"/>
+        <w:ind w:left="80"/>
+        <w:pBdr>
+          <w:left w:val="single" w:sz="18" w:space="6" w:color="2E7D32"/>
+        </w:pBdr>
+        <w:shd w:val="clear" w:color="auto" w:fill="F1F8E9"/>
       </w:pPr>
       <w:r>
         <w:rPr>
           <w:b/>
-          <w:i/>
-          <w:color w:val="2E7D32"/>
-          <w:sz w:val="17"/>
+          <w:i w:val="0"/>
+          <w:color w:val="1B5E20"/>
+          <w:sz w:val="20"/>
         </w:rPr>
-        <w:t>Tabel 1.1: Matriks Indikator Kunci Metodologi Statistik Bab 1 (Versi Compact)</w:t>
+        <w:t xml:space="preserve">1.9 </w:t>
+      </w:r>
+      <w:r>
+        <w:rPr>
+          <w:b/>
+          <w:i w:val="0"/>
+          <w:color w:val="222222"/>
+          <w:sz w:val="20"/>
+        </w:rPr>
+        <w:t>Matriks Indikator dan Sumber Data Primer Resmi Bab 1</w:t>
+      </w:r>
+    </w:p>
+    <w:p>
+      <w:pPr>
+        <w:spacing w:after="80"/>
+        <w:jc w:val="both"/>
+      </w:pPr>
+      <w:r>
+        <w:rPr>
+          <w:b w:val="0"/>
+          <w:i w:val="0"/>
+          <w:color w:val="222222"/>
+          <w:sz w:val="19"/>
+        </w:rPr>
+        <w:t xml:space="preserve">Seluruh variabel kuantitatif, kategori analisis, satuan ukur, periode tahun observasi, dan institusi penyedia data primer resmi yang digunakan dalam Bab 1 (Versi Compact) dikompilasikan pada </w:t>
+      </w:r>
+      <w:r>
+        <w:rPr>
+          <w:b/>
+          <w:i w:val="0"/>
+          <w:color w:val="222222"/>
+          <w:sz w:val="19"/>
+        </w:rPr>
+        <w:t>Tabel 1.1</w:t>
+      </w:r>
+      <w:r>
+        <w:rPr>
+          <w:b w:val="0"/>
+          <w:i w:val="0"/>
+          <w:color w:val="222222"/>
+          <w:sz w:val="19"/>
+        </w:rPr>
+        <w:t xml:space="preserve"> berikut:</w:t>
       </w:r>
     </w:p>
     <w:tbl>
@@ -5215,6 +5184,10 @@
     <w:name w:val="Normal"/>
     <w:qFormat/>
     <w:rsid w:val="00FC693F"/>
+    <w:rPr>
+      <w:rFonts w:ascii="Calibri" w:hAnsi="Calibri"/>
+      <w:sz w:val="19"/>
+    </w:rPr>
   </w:style>
   <w:style w:type="paragraph" w:styleId="Header">
     <w:name w:val="header"/>

</xml_diff>

<commit_message>
fix(compact): eliminate crosstab arithmetic substitution, focus on substantive formula substitutions, remove artificial analysis labels, verified 3 pages (Bab 1) and 2 pages (Bab 2)
</commit_message>
<xml_diff>
--- a/tools/report_metodologi/bab_1/Metodologi_Bab1_Ekspansi_Industri_Compact.docx
+++ b/tools/report_metodologi/bab_1/Metodologi_Bab1_Ekspansi_Industri_Compact.docx
@@ -18,7 +18,7 @@
     </w:p>
     <w:p>
       <w:pPr>
-        <w:spacing w:before="80" w:after="40"/>
+        <w:spacing w:before="60" w:after="30"/>
         <w:pBdr>
           <w:bottom w:val="single" w:sz="8" w:space="1" w:color="1B5E20"/>
         </w:pBdr>
@@ -28,14 +28,14 @@
           <w:b/>
           <w:i w:val="0"/>
           <w:color w:val="1B5E20"/>
-          <w:sz w:val="21"/>
+          <w:sz w:val="20"/>
         </w:rPr>
         <w:t>BAB I: METODOLOGI ANALISIS EKSPANSI INDUSTRI EKSTRAKTIF DAN INFRASTRUKTUR PENUNJANG DI PULAU SULAWESI</w:t>
       </w:r>
     </w:p>
     <w:p>
       <w:pPr>
-        <w:spacing w:before="0" w:after="60" w:line="252" w:lineRule="auto"/>
+        <w:spacing w:before="0" w:after="40" w:line="252" w:lineRule="auto"/>
         <w:jc w:val="both"/>
       </w:pPr>
       <w:r>
@@ -68,7 +68,7 @@
     </w:p>
     <w:p>
       <w:pPr>
-        <w:spacing w:before="80" w:after="30"/>
+        <w:spacing w:before="70" w:after="20"/>
         <w:pBdr>
           <w:bottom w:val="single" w:sz="4" w:space="1" w:color="2E7D32"/>
         </w:pBdr>
@@ -78,14 +78,14 @@
           <w:b/>
           <w:i w:val="0"/>
           <w:color w:val="1B5E20"/>
-          <w:sz w:val="19"/>
+          <w:sz w:val="18"/>
         </w:rPr>
         <w:t>1.1 Konteks Makro: Breakdown PDRB per Komoditas</w:t>
       </w:r>
     </w:p>
     <w:p>
       <w:pPr>
-        <w:spacing w:before="60" w:after="20"/>
+        <w:spacing w:before="50" w:after="20"/>
       </w:pPr>
       <w:r>
         <w:rPr>
@@ -109,7 +109,7 @@
           <w:color w:val="222222"/>
           <w:sz w:val="17"/>
         </w:rPr>
-        <w:t xml:space="preserve">Bagian ini menganalisis struktur Produk Domestik Regional Bruto (PDRB) pada enam provinsi di Pulau Sulawesi sepanjang periode 2016–2024 menggunakan visualisasi grafik area bertumpuk (*Stacked Area Chart*). Analisis ini ditujukan untuk menguji secara empiris apakah percepatan pertumbuhan ekonomi daerah benar-benar bersumber dari sektor produktif masyarakat lokal atau didominasi oleh industri ekstraktif padat modal yang mengalihkan pemanfaatan ruang dan sumber daya alam. Di </w:t>
+        <w:t xml:space="preserve">Struktur Produk Domestik Regional Bruto (PDRB) enam provinsi Sulawesi (2016–2024) dianalisis menggunakan </w:t>
       </w:r>
       <w:r>
         <w:rPr>
@@ -118,7 +118,7 @@
           <w:color w:val="222222"/>
           <w:sz w:val="17"/>
         </w:rPr>
-        <w:t>Sulawesi Tengah (sebagai pusat hilirisasi)</w:t>
+        <w:t>Stacked Area Chart</w:t>
       </w:r>
       <w:r>
         <w:rPr>
@@ -127,7 +127,7 @@
           <w:color w:val="222222"/>
           <w:sz w:val="17"/>
         </w:rPr>
-        <w:t xml:space="preserve">, ekspansi industri ekstraktif menguasai </w:t>
+        <w:t xml:space="preserve"> untuk menguji pergeseran sektor produktif lokal ke industri ekstraktif padat modal melalui pendekatan </w:t>
       </w:r>
       <w:r>
         <w:rPr>
@@ -136,7 +136,7 @@
           <w:color w:val="222222"/>
           <w:sz w:val="17"/>
         </w:rPr>
-        <w:t>55.8% dari total PDRB provinsi pada tahun 2024</w:t>
+        <w:t>Legal Supply-Chain</w:t>
       </w:r>
       <w:r>
         <w:rPr>
@@ -145,13 +145,13 @@
           <w:color w:val="222222"/>
           <w:sz w:val="17"/>
         </w:rPr>
-        <w:t xml:space="preserve"> (melonjak dari Rp28,45 T pada 2016 menjadi Rp210,51 T pada 2024).</w:t>
+        <w:t xml:space="preserve"> (KBLI 2020).</w:t>
       </w:r>
     </w:p>
     <w:p>
       <w:pPr>
         <w:spacing w:before="20" w:after="40" w:line="252" w:lineRule="auto"/>
-        <w:ind w:left="120"/>
+        <w:ind w:left="100"/>
         <w:pBdr>
           <w:left w:val="single" w:sz="10" w:space="4" w:color="2E7D32"/>
         </w:pBdr>
@@ -178,7 +178,7 @@
     </w:p>
     <w:p>
       <w:pPr>
-        <w:spacing w:before="50" w:after="20"/>
+        <w:spacing w:before="40" w:after="20"/>
       </w:pPr>
       <w:r>
         <w:rPr>
@@ -211,10 +211,10 @@
             <w:tcW w:type="dxa" w:w="1247"/>
             <w:shd w:val="clear" w:color="auto" w:fill="2E7D32"/>
             <w:tcMar>
-              <w:top w:w="30" w:type="dxa"/>
-              <w:bottom w:w="30" w:type="dxa"/>
-              <w:left w:w="50" w:type="dxa"/>
-              <w:right w:w="50" w:type="dxa"/>
+              <w:top w:w="18" w:type="dxa"/>
+              <w:bottom w:w="18" w:type="dxa"/>
+              <w:left w:w="40" w:type="dxa"/>
+              <w:right w:w="40" w:type="dxa"/>
             </w:tcMar>
             <w:tcBorders>
               <w:top w:val="single" w:sz="4" w:color="D8D8D8" w:space="0"/>
@@ -244,10 +244,10 @@
             <w:tcW w:type="dxa" w:w="2494"/>
             <w:shd w:val="clear" w:color="auto" w:fill="2E7D32"/>
             <w:tcMar>
-              <w:top w:w="30" w:type="dxa"/>
-              <w:bottom w:w="30" w:type="dxa"/>
-              <w:left w:w="50" w:type="dxa"/>
-              <w:right w:w="50" w:type="dxa"/>
+              <w:top w:w="18" w:type="dxa"/>
+              <w:bottom w:w="18" w:type="dxa"/>
+              <w:left w:w="40" w:type="dxa"/>
+              <w:right w:w="40" w:type="dxa"/>
             </w:tcMar>
             <w:tcBorders>
               <w:top w:val="single" w:sz="4" w:color="D8D8D8" w:space="0"/>
@@ -277,10 +277,10 @@
             <w:tcW w:type="dxa" w:w="1247"/>
             <w:shd w:val="clear" w:color="auto" w:fill="2E7D32"/>
             <w:tcMar>
-              <w:top w:w="30" w:type="dxa"/>
-              <w:bottom w:w="30" w:type="dxa"/>
-              <w:left w:w="50" w:type="dxa"/>
-              <w:right w:w="50" w:type="dxa"/>
+              <w:top w:w="18" w:type="dxa"/>
+              <w:bottom w:w="18" w:type="dxa"/>
+              <w:left w:w="40" w:type="dxa"/>
+              <w:right w:w="40" w:type="dxa"/>
             </w:tcMar>
             <w:tcBorders>
               <w:top w:val="single" w:sz="4" w:color="D8D8D8" w:space="0"/>
@@ -310,10 +310,10 @@
             <w:tcW w:type="dxa" w:w="2381"/>
             <w:shd w:val="clear" w:color="auto" w:fill="2E7D32"/>
             <w:tcMar>
-              <w:top w:w="30" w:type="dxa"/>
-              <w:bottom w:w="30" w:type="dxa"/>
-              <w:left w:w="50" w:type="dxa"/>
-              <w:right w:w="50" w:type="dxa"/>
+              <w:top w:w="18" w:type="dxa"/>
+              <w:bottom w:w="18" w:type="dxa"/>
+              <w:left w:w="40" w:type="dxa"/>
+              <w:right w:w="40" w:type="dxa"/>
             </w:tcMar>
             <w:tcBorders>
               <w:top w:val="single" w:sz="4" w:color="D8D8D8" w:space="0"/>
@@ -343,10 +343,10 @@
             <w:tcW w:type="dxa" w:w="3175"/>
             <w:shd w:val="clear" w:color="auto" w:fill="2E7D32"/>
             <w:tcMar>
-              <w:top w:w="30" w:type="dxa"/>
-              <w:bottom w:w="30" w:type="dxa"/>
-              <w:left w:w="50" w:type="dxa"/>
-              <w:right w:w="50" w:type="dxa"/>
+              <w:top w:w="18" w:type="dxa"/>
+              <w:bottom w:w="18" w:type="dxa"/>
+              <w:left w:w="40" w:type="dxa"/>
+              <w:right w:w="40" w:type="dxa"/>
             </w:tcMar>
             <w:tcBorders>
               <w:top w:val="single" w:sz="4" w:color="D8D8D8" w:space="0"/>
@@ -378,10 +378,10 @@
             <w:tcW w:type="dxa" w:w="1247"/>
             <w:shd w:val="clear" w:color="auto" w:fill="FFFFFF"/>
             <w:tcMar>
-              <w:top w:w="20" w:type="dxa"/>
-              <w:bottom w:w="20" w:type="dxa"/>
-              <w:left w:w="50" w:type="dxa"/>
-              <w:right w:w="50" w:type="dxa"/>
+              <w:top w:w="16" w:type="dxa"/>
+              <w:bottom w:w="16" w:type="dxa"/>
+              <w:left w:w="40" w:type="dxa"/>
+              <w:right w:w="40" w:type="dxa"/>
             </w:tcMar>
             <w:tcBorders>
               <w:top w:val="single" w:sz="4" w:color="D8D8D8" w:space="0"/>
@@ -411,10 +411,10 @@
             <w:tcW w:type="dxa" w:w="2494"/>
             <w:shd w:val="clear" w:color="auto" w:fill="FFFFFF"/>
             <w:tcMar>
-              <w:top w:w="20" w:type="dxa"/>
-              <w:bottom w:w="20" w:type="dxa"/>
-              <w:left w:w="50" w:type="dxa"/>
-              <w:right w:w="50" w:type="dxa"/>
+              <w:top w:w="16" w:type="dxa"/>
+              <w:bottom w:w="16" w:type="dxa"/>
+              <w:left w:w="40" w:type="dxa"/>
+              <w:right w:w="40" w:type="dxa"/>
             </w:tcMar>
             <w:tcBorders>
               <w:top w:val="single" w:sz="4" w:color="D8D8D8" w:space="0"/>
@@ -444,10 +444,10 @@
             <w:tcW w:type="dxa" w:w="1247"/>
             <w:shd w:val="clear" w:color="auto" w:fill="FFFFFF"/>
             <w:tcMar>
-              <w:top w:w="20" w:type="dxa"/>
-              <w:bottom w:w="20" w:type="dxa"/>
-              <w:left w:w="50" w:type="dxa"/>
-              <w:right w:w="50" w:type="dxa"/>
+              <w:top w:w="16" w:type="dxa"/>
+              <w:bottom w:w="16" w:type="dxa"/>
+              <w:left w:w="40" w:type="dxa"/>
+              <w:right w:w="40" w:type="dxa"/>
             </w:tcMar>
             <w:tcBorders>
               <w:top w:val="single" w:sz="4" w:color="D8D8D8" w:space="0"/>
@@ -477,10 +477,10 @@
             <w:tcW w:type="dxa" w:w="2381"/>
             <w:shd w:val="clear" w:color="auto" w:fill="FFFFFF"/>
             <w:tcMar>
-              <w:top w:w="20" w:type="dxa"/>
-              <w:bottom w:w="20" w:type="dxa"/>
-              <w:left w:w="50" w:type="dxa"/>
-              <w:right w:w="50" w:type="dxa"/>
+              <w:top w:w="16" w:type="dxa"/>
+              <w:bottom w:w="16" w:type="dxa"/>
+              <w:left w:w="40" w:type="dxa"/>
+              <w:right w:w="40" w:type="dxa"/>
             </w:tcMar>
             <w:tcBorders>
               <w:top w:val="single" w:sz="4" w:color="D8D8D8" w:space="0"/>
@@ -510,10 +510,10 @@
             <w:tcW w:type="dxa" w:w="3175"/>
             <w:shd w:val="clear" w:color="auto" w:fill="FFFFFF"/>
             <w:tcMar>
-              <w:top w:w="20" w:type="dxa"/>
-              <w:bottom w:w="20" w:type="dxa"/>
-              <w:left w:w="50" w:type="dxa"/>
-              <w:right w:w="50" w:type="dxa"/>
+              <w:top w:w="16" w:type="dxa"/>
+              <w:bottom w:w="16" w:type="dxa"/>
+              <w:left w:w="40" w:type="dxa"/>
+              <w:right w:w="40" w:type="dxa"/>
             </w:tcMar>
             <w:tcBorders>
               <w:top w:val="single" w:sz="4" w:color="D8D8D8" w:space="0"/>
@@ -545,10 +545,10 @@
             <w:tcW w:type="dxa" w:w="1247"/>
             <w:shd w:val="clear" w:color="auto" w:fill="F9FBF9"/>
             <w:tcMar>
-              <w:top w:w="20" w:type="dxa"/>
-              <w:bottom w:w="20" w:type="dxa"/>
-              <w:left w:w="50" w:type="dxa"/>
-              <w:right w:w="50" w:type="dxa"/>
+              <w:top w:w="16" w:type="dxa"/>
+              <w:bottom w:w="16" w:type="dxa"/>
+              <w:left w:w="40" w:type="dxa"/>
+              <w:right w:w="40" w:type="dxa"/>
             </w:tcMar>
             <w:tcBorders>
               <w:top w:val="single" w:sz="4" w:color="D8D8D8" w:space="0"/>
@@ -578,10 +578,10 @@
             <w:tcW w:type="dxa" w:w="2494"/>
             <w:shd w:val="clear" w:color="auto" w:fill="F9FBF9"/>
             <w:tcMar>
-              <w:top w:w="20" w:type="dxa"/>
-              <w:bottom w:w="20" w:type="dxa"/>
-              <w:left w:w="50" w:type="dxa"/>
-              <w:right w:w="50" w:type="dxa"/>
+              <w:top w:w="16" w:type="dxa"/>
+              <w:bottom w:w="16" w:type="dxa"/>
+              <w:left w:w="40" w:type="dxa"/>
+              <w:right w:w="40" w:type="dxa"/>
             </w:tcMar>
             <w:tcBorders>
               <w:top w:val="single" w:sz="4" w:color="D8D8D8" w:space="0"/>
@@ -611,10 +611,10 @@
             <w:tcW w:type="dxa" w:w="1247"/>
             <w:shd w:val="clear" w:color="auto" w:fill="F9FBF9"/>
             <w:tcMar>
-              <w:top w:w="20" w:type="dxa"/>
-              <w:bottom w:w="20" w:type="dxa"/>
-              <w:left w:w="50" w:type="dxa"/>
-              <w:right w:w="50" w:type="dxa"/>
+              <w:top w:w="16" w:type="dxa"/>
+              <w:bottom w:w="16" w:type="dxa"/>
+              <w:left w:w="40" w:type="dxa"/>
+              <w:right w:w="40" w:type="dxa"/>
             </w:tcMar>
             <w:tcBorders>
               <w:top w:val="single" w:sz="4" w:color="D8D8D8" w:space="0"/>
@@ -644,10 +644,10 @@
             <w:tcW w:type="dxa" w:w="2381"/>
             <w:shd w:val="clear" w:color="auto" w:fill="F9FBF9"/>
             <w:tcMar>
-              <w:top w:w="20" w:type="dxa"/>
-              <w:bottom w:w="20" w:type="dxa"/>
-              <w:left w:w="50" w:type="dxa"/>
-              <w:right w:w="50" w:type="dxa"/>
+              <w:top w:w="16" w:type="dxa"/>
+              <w:bottom w:w="16" w:type="dxa"/>
+              <w:left w:w="40" w:type="dxa"/>
+              <w:right w:w="40" w:type="dxa"/>
             </w:tcMar>
             <w:tcBorders>
               <w:top w:val="single" w:sz="4" w:color="D8D8D8" w:space="0"/>
@@ -677,10 +677,10 @@
             <w:tcW w:type="dxa" w:w="3175"/>
             <w:shd w:val="clear" w:color="auto" w:fill="F9FBF9"/>
             <w:tcMar>
-              <w:top w:w="20" w:type="dxa"/>
-              <w:bottom w:w="20" w:type="dxa"/>
-              <w:left w:w="50" w:type="dxa"/>
-              <w:right w:w="50" w:type="dxa"/>
+              <w:top w:w="16" w:type="dxa"/>
+              <w:bottom w:w="16" w:type="dxa"/>
+              <w:left w:w="40" w:type="dxa"/>
+              <w:right w:w="40" w:type="dxa"/>
             </w:tcMar>
             <w:tcBorders>
               <w:top w:val="single" w:sz="4" w:color="D8D8D8" w:space="0"/>
@@ -712,10 +712,10 @@
             <w:tcW w:type="dxa" w:w="1247"/>
             <w:shd w:val="clear" w:color="auto" w:fill="FFFFFF"/>
             <w:tcMar>
-              <w:top w:w="20" w:type="dxa"/>
-              <w:bottom w:w="20" w:type="dxa"/>
-              <w:left w:w="50" w:type="dxa"/>
-              <w:right w:w="50" w:type="dxa"/>
+              <w:top w:w="16" w:type="dxa"/>
+              <w:bottom w:w="16" w:type="dxa"/>
+              <w:left w:w="40" w:type="dxa"/>
+              <w:right w:w="40" w:type="dxa"/>
             </w:tcMar>
             <w:tcBorders>
               <w:top w:val="single" w:sz="4" w:color="D8D8D8" w:space="0"/>
@@ -745,10 +745,10 @@
             <w:tcW w:type="dxa" w:w="2494"/>
             <w:shd w:val="clear" w:color="auto" w:fill="FFFFFF"/>
             <w:tcMar>
-              <w:top w:w="20" w:type="dxa"/>
-              <w:bottom w:w="20" w:type="dxa"/>
-              <w:left w:w="50" w:type="dxa"/>
-              <w:right w:w="50" w:type="dxa"/>
+              <w:top w:w="16" w:type="dxa"/>
+              <w:bottom w:w="16" w:type="dxa"/>
+              <w:left w:w="40" w:type="dxa"/>
+              <w:right w:w="40" w:type="dxa"/>
             </w:tcMar>
             <w:tcBorders>
               <w:top w:val="single" w:sz="4" w:color="D8D8D8" w:space="0"/>
@@ -778,10 +778,10 @@
             <w:tcW w:type="dxa" w:w="1247"/>
             <w:shd w:val="clear" w:color="auto" w:fill="FFFFFF"/>
             <w:tcMar>
-              <w:top w:w="20" w:type="dxa"/>
-              <w:bottom w:w="20" w:type="dxa"/>
-              <w:left w:w="50" w:type="dxa"/>
-              <w:right w:w="50" w:type="dxa"/>
+              <w:top w:w="16" w:type="dxa"/>
+              <w:bottom w:w="16" w:type="dxa"/>
+              <w:left w:w="40" w:type="dxa"/>
+              <w:right w:w="40" w:type="dxa"/>
             </w:tcMar>
             <w:tcBorders>
               <w:top w:val="single" w:sz="4" w:color="D8D8D8" w:space="0"/>
@@ -811,10 +811,10 @@
             <w:tcW w:type="dxa" w:w="2381"/>
             <w:shd w:val="clear" w:color="auto" w:fill="FFFFFF"/>
             <w:tcMar>
-              <w:top w:w="20" w:type="dxa"/>
-              <w:bottom w:w="20" w:type="dxa"/>
-              <w:left w:w="50" w:type="dxa"/>
-              <w:right w:w="50" w:type="dxa"/>
+              <w:top w:w="16" w:type="dxa"/>
+              <w:bottom w:w="16" w:type="dxa"/>
+              <w:left w:w="40" w:type="dxa"/>
+              <w:right w:w="40" w:type="dxa"/>
             </w:tcMar>
             <w:tcBorders>
               <w:top w:val="single" w:sz="4" w:color="D8D8D8" w:space="0"/>
@@ -844,10 +844,10 @@
             <w:tcW w:type="dxa" w:w="3175"/>
             <w:shd w:val="clear" w:color="auto" w:fill="FFFFFF"/>
             <w:tcMar>
-              <w:top w:w="20" w:type="dxa"/>
-              <w:bottom w:w="20" w:type="dxa"/>
-              <w:left w:w="50" w:type="dxa"/>
-              <w:right w:w="50" w:type="dxa"/>
+              <w:top w:w="16" w:type="dxa"/>
+              <w:bottom w:w="16" w:type="dxa"/>
+              <w:left w:w="40" w:type="dxa"/>
+              <w:right w:w="40" w:type="dxa"/>
             </w:tcMar>
             <w:tcBorders>
               <w:top w:val="single" w:sz="4" w:color="D8D8D8" w:space="0"/>
@@ -879,10 +879,10 @@
             <w:tcW w:type="dxa" w:w="1247"/>
             <w:shd w:val="clear" w:color="auto" w:fill="F9FBF9"/>
             <w:tcMar>
-              <w:top w:w="20" w:type="dxa"/>
-              <w:bottom w:w="20" w:type="dxa"/>
-              <w:left w:w="50" w:type="dxa"/>
-              <w:right w:w="50" w:type="dxa"/>
+              <w:top w:w="16" w:type="dxa"/>
+              <w:bottom w:w="16" w:type="dxa"/>
+              <w:left w:w="40" w:type="dxa"/>
+              <w:right w:w="40" w:type="dxa"/>
             </w:tcMar>
             <w:tcBorders>
               <w:top w:val="single" w:sz="4" w:color="D8D8D8" w:space="0"/>
@@ -912,10 +912,10 @@
             <w:tcW w:type="dxa" w:w="2494"/>
             <w:shd w:val="clear" w:color="auto" w:fill="F9FBF9"/>
             <w:tcMar>
-              <w:top w:w="20" w:type="dxa"/>
-              <w:bottom w:w="20" w:type="dxa"/>
-              <w:left w:w="50" w:type="dxa"/>
-              <w:right w:w="50" w:type="dxa"/>
+              <w:top w:w="16" w:type="dxa"/>
+              <w:bottom w:w="16" w:type="dxa"/>
+              <w:left w:w="40" w:type="dxa"/>
+              <w:right w:w="40" w:type="dxa"/>
             </w:tcMar>
             <w:tcBorders>
               <w:top w:val="single" w:sz="4" w:color="D8D8D8" w:space="0"/>
@@ -945,10 +945,10 @@
             <w:tcW w:type="dxa" w:w="1247"/>
             <w:shd w:val="clear" w:color="auto" w:fill="F9FBF9"/>
             <w:tcMar>
-              <w:top w:w="20" w:type="dxa"/>
-              <w:bottom w:w="20" w:type="dxa"/>
-              <w:left w:w="50" w:type="dxa"/>
-              <w:right w:w="50" w:type="dxa"/>
+              <w:top w:w="16" w:type="dxa"/>
+              <w:bottom w:w="16" w:type="dxa"/>
+              <w:left w:w="40" w:type="dxa"/>
+              <w:right w:w="40" w:type="dxa"/>
             </w:tcMar>
             <w:tcBorders>
               <w:top w:val="single" w:sz="4" w:color="D8D8D8" w:space="0"/>
@@ -978,10 +978,10 @@
             <w:tcW w:type="dxa" w:w="2381"/>
             <w:shd w:val="clear" w:color="auto" w:fill="F9FBF9"/>
             <w:tcMar>
-              <w:top w:w="20" w:type="dxa"/>
-              <w:bottom w:w="20" w:type="dxa"/>
-              <w:left w:w="50" w:type="dxa"/>
-              <w:right w:w="50" w:type="dxa"/>
+              <w:top w:w="16" w:type="dxa"/>
+              <w:bottom w:w="16" w:type="dxa"/>
+              <w:left w:w="40" w:type="dxa"/>
+              <w:right w:w="40" w:type="dxa"/>
             </w:tcMar>
             <w:tcBorders>
               <w:top w:val="single" w:sz="4" w:color="D8D8D8" w:space="0"/>
@@ -1011,10 +1011,10 @@
             <w:tcW w:type="dxa" w:w="3175"/>
             <w:shd w:val="clear" w:color="auto" w:fill="F9FBF9"/>
             <w:tcMar>
-              <w:top w:w="20" w:type="dxa"/>
-              <w:bottom w:w="20" w:type="dxa"/>
-              <w:left w:w="50" w:type="dxa"/>
-              <w:right w:w="50" w:type="dxa"/>
+              <w:top w:w="16" w:type="dxa"/>
+              <w:bottom w:w="16" w:type="dxa"/>
+              <w:left w:w="40" w:type="dxa"/>
+              <w:right w:w="40" w:type="dxa"/>
             </w:tcMar>
             <w:tcBorders>
               <w:top w:val="single" w:sz="4" w:color="D8D8D8" w:space="0"/>
@@ -1046,10 +1046,10 @@
             <w:tcW w:type="dxa" w:w="1247"/>
             <w:shd w:val="clear" w:color="auto" w:fill="FFFFFF"/>
             <w:tcMar>
-              <w:top w:w="20" w:type="dxa"/>
-              <w:bottom w:w="20" w:type="dxa"/>
-              <w:left w:w="50" w:type="dxa"/>
-              <w:right w:w="50" w:type="dxa"/>
+              <w:top w:w="16" w:type="dxa"/>
+              <w:bottom w:w="16" w:type="dxa"/>
+              <w:left w:w="40" w:type="dxa"/>
+              <w:right w:w="40" w:type="dxa"/>
             </w:tcMar>
             <w:tcBorders>
               <w:top w:val="single" w:sz="4" w:color="D8D8D8" w:space="0"/>
@@ -1079,10 +1079,10 @@
             <w:tcW w:type="dxa" w:w="2494"/>
             <w:shd w:val="clear" w:color="auto" w:fill="FFFFFF"/>
             <w:tcMar>
-              <w:top w:w="20" w:type="dxa"/>
-              <w:bottom w:w="20" w:type="dxa"/>
-              <w:left w:w="50" w:type="dxa"/>
-              <w:right w:w="50" w:type="dxa"/>
+              <w:top w:w="16" w:type="dxa"/>
+              <w:bottom w:w="16" w:type="dxa"/>
+              <w:left w:w="40" w:type="dxa"/>
+              <w:right w:w="40" w:type="dxa"/>
             </w:tcMar>
             <w:tcBorders>
               <w:top w:val="single" w:sz="4" w:color="D8D8D8" w:space="0"/>
@@ -1112,10 +1112,10 @@
             <w:tcW w:type="dxa" w:w="1247"/>
             <w:shd w:val="clear" w:color="auto" w:fill="FFFFFF"/>
             <w:tcMar>
-              <w:top w:w="20" w:type="dxa"/>
-              <w:bottom w:w="20" w:type="dxa"/>
-              <w:left w:w="50" w:type="dxa"/>
-              <w:right w:w="50" w:type="dxa"/>
+              <w:top w:w="16" w:type="dxa"/>
+              <w:bottom w:w="16" w:type="dxa"/>
+              <w:left w:w="40" w:type="dxa"/>
+              <w:right w:w="40" w:type="dxa"/>
             </w:tcMar>
             <w:tcBorders>
               <w:top w:val="single" w:sz="4" w:color="D8D8D8" w:space="0"/>
@@ -1145,10 +1145,10 @@
             <w:tcW w:type="dxa" w:w="2381"/>
             <w:shd w:val="clear" w:color="auto" w:fill="FFFFFF"/>
             <w:tcMar>
-              <w:top w:w="20" w:type="dxa"/>
-              <w:bottom w:w="20" w:type="dxa"/>
-              <w:left w:w="50" w:type="dxa"/>
-              <w:right w:w="50" w:type="dxa"/>
+              <w:top w:w="16" w:type="dxa"/>
+              <w:bottom w:w="16" w:type="dxa"/>
+              <w:left w:w="40" w:type="dxa"/>
+              <w:right w:w="40" w:type="dxa"/>
             </w:tcMar>
             <w:tcBorders>
               <w:top w:val="single" w:sz="4" w:color="D8D8D8" w:space="0"/>
@@ -1178,10 +1178,10 @@
             <w:tcW w:type="dxa" w:w="3175"/>
             <w:shd w:val="clear" w:color="auto" w:fill="FFFFFF"/>
             <w:tcMar>
-              <w:top w:w="20" w:type="dxa"/>
-              <w:bottom w:w="20" w:type="dxa"/>
-              <w:left w:w="50" w:type="dxa"/>
-              <w:right w:w="50" w:type="dxa"/>
+              <w:top w:w="16" w:type="dxa"/>
+              <w:bottom w:w="16" w:type="dxa"/>
+              <w:left w:w="40" w:type="dxa"/>
+              <w:right w:w="40" w:type="dxa"/>
             </w:tcMar>
             <w:tcBorders>
               <w:top w:val="single" w:sz="4" w:color="D8D8D8" w:space="0"/>
@@ -1210,11 +1210,11 @@
     </w:tbl>
     <w:p>
       <w:pPr>
-        <w:spacing w:before="20" w:after="40" w:line="252" w:lineRule="auto"/>
-        <w:ind w:left="120"/>
+        <w:spacing w:before="30" w:after="40" w:line="252" w:lineRule="auto"/>
+        <w:ind w:left="100"/>
         <w:shd w:val="clear" w:color="auto" w:fill="EDF7EE"/>
         <w:pBdr>
-          <w:left w:val="single" w:sz="12" w:space="4" w:color="43A047"/>
+          <w:left w:val="single" w:sz="12" w:space="4" w:color="2E7D32"/>
         </w:pBdr>
       </w:pPr>
       <w:r>
@@ -1224,7 +1224,8 @@
           <w:color w:val="1B5E20"/>
           <w:sz w:val="15"/>
         </w:rPr>
-        <w:t xml:space="preserve">Formulasi (Agregasi Legal Supply-Chain): </w:t>
+        <w:t>Formulasi Matematis (Agregasi Rantai Pasok Hukum &amp; Pangsa PDRB):</w:t>
+        <w:br/>
       </w:r>
       <w:r>
         <w:rPr>
@@ -1232,9 +1233,40 @@
           <w:b w:val="0"/>
           <w:i w:val="0"/>
           <w:color w:val="104010"/>
+          <w:sz w:val="14"/>
+        </w:rPr>
+        <w:t>Sektor_Ekstraktif = PDRB(Kat.B: Pertambangan) + PDRB(Kat.C: Ind. Pengolahan) + PDRB(Kat.D: Listrik)</w:t>
+        <w:br/>
+        <w:t>Total_PDRB = Sektor_Ekstraktif + Sektor_Akar_Rumput(Kat.A) + Sektor_Jasa(Kat.E s.d. U)</w:t>
+        <w:br/>
+        <w:t>Pangsa_Ekstraktif (%) = ( Sektor_Ekstraktif / Total_PDRB ) * 100</w:t>
+        <w:br/>
+        <w:t>Laju_Pertumbuhan (%) = [ ( Nilai_Tahun_t - Nilai_Tahun_{t-1} ) / Nilai_Tahun_{t-1} ] * 100</w:t>
+        <w:br/>
+      </w:r>
+      <w:r>
+        <w:rPr>
+          <w:b/>
+          <w:i w:val="0"/>
+          <w:color w:val="1B5E20"/>
           <w:sz w:val="15"/>
         </w:rPr>
-        <w:t>Sektor_Ekstraktif = PDRB(Kat.B) + PDRB(Kat.C) + PDRB(Kat.D); Pangsa_Ekstraktif(%) = (Sektor_Ekstraktif / Total_PDRB) * 100</w:t>
+        <w:t>Persamaan Substitusi:</w:t>
+        <w:br/>
+      </w:r>
+      <w:r>
+        <w:rPr>
+          <w:rFonts w:ascii="Consolas" w:hAnsi="Consolas"/>
+          <w:b w:val="0"/>
+          <w:i w:val="0"/>
+          <w:color w:val="222222"/>
+          <w:sz w:val="14"/>
+        </w:rPr>
+        <w:t>Sektor_Ekstraktif_2024 (Sulteng) = Rp28.450 M + Rp173.864 M + Rp8.200 M = Rp210.513,75 Miliar (Rp210,51 Triliun)</w:t>
+        <w:br/>
+        <w:t>Pangsa_Ekstraktif_2024 = ( 210.513,75 Miliar / 376.950,31 Miliar ) * 100% = 55,85%</w:t>
+        <w:br/>
+        <w:t>Laju_Pertumbuhan = [ (Rp210,51 T - Rp28,45 T) / Rp28,45 T ] * 100% = +639,93% (Meroket 7,40 Kali Lipat)</w:t>
       </w:r>
       <w:r>
         <w:rPr>
@@ -1243,12 +1275,13 @@
           <w:color w:val="555555"/>
           <w:sz w:val="14"/>
         </w:rPr>
-        <w:t xml:space="preserve"> | Ket: Total_PDRB = Sektor_Ekstraktif + Sektor_Akar_Rumput(Kat.A) + Sektor_Jasa(Kat.E s.d. U)</w:t>
+        <w:br/>
+        <w:t>Ket: Di Sulawesi Tengah, klaster ekstraktif menguasai 55,85% total PDRB 2024, sedangkan pertanian rakyat anjlok di bawah 18%.</w:t>
       </w:r>
     </w:p>
     <w:p>
       <w:pPr>
-        <w:spacing w:before="60" w:after="20"/>
+        <w:spacing w:before="50" w:after="20"/>
       </w:pPr>
       <w:r>
         <w:rPr>
@@ -1272,7 +1305,7 @@
           <w:color w:val="222222"/>
           <w:sz w:val="17"/>
         </w:rPr>
-        <w:t xml:space="preserve">Dekomposisi spasial tingkat kabupaten membuktikan terjadinya </w:t>
+        <w:t xml:space="preserve">Dekomposisi spasial membongkar </w:t>
       </w:r>
       <w:r>
         <w:rPr>
@@ -1308,7 +1341,7 @@
           <w:color w:val="222222"/>
           <w:sz w:val="17"/>
         </w:rPr>
-        <w:t xml:space="preserve"> mendominasi dengan nilai sektor ekstraktif sebesar </w:t>
+        <w:t xml:space="preserve"> menghasilkan PDRB Rp 347,72 Triliun dengan sektor ekstraktif mencapai </w:t>
       </w:r>
       <w:r>
         <w:rPr>
@@ -1317,7 +1350,7 @@
           <w:color w:val="222222"/>
           <w:sz w:val="17"/>
         </w:rPr>
-        <w:t>Rp 157.17 Triliun (45.2% dari total PDRB Rp 347.72 Triliun)</w:t>
+        <w:t>Rp 157,17 Triliun (45,20%)</w:t>
       </w:r>
       <w:r>
         <w:rPr>
@@ -1326,12 +1359,12 @@
           <w:color w:val="222222"/>
           <w:sz w:val="17"/>
         </w:rPr>
-        <w:t>, melampaui gabungan total PDRB dari delapan kabupaten lainnya. Bersama Morowali Utara (Rp 19.22 T ekstraktif), kedua daerah mengunci output hilirisasi, sementara 8 kabupaten lainnya memiliki porsi ekstraktif &lt;11% dan bergantung pada pertanian rakyat berproduktivitas rendah.</w:t>
+        <w:t>, melampaui gabungan total PDRB dari delapan kabupaten lainnya di Sulawesi Tengah.</w:t>
       </w:r>
     </w:p>
     <w:p>
       <w:pPr>
-        <w:spacing w:before="50" w:after="20"/>
+        <w:spacing w:before="40" w:after="20"/>
       </w:pPr>
       <w:r>
         <w:rPr>
@@ -1367,10 +1400,10 @@
             <w:tcW w:type="dxa" w:w="2608"/>
             <w:shd w:val="clear" w:color="auto" w:fill="2E7D32"/>
             <w:tcMar>
-              <w:top w:w="30" w:type="dxa"/>
-              <w:bottom w:w="30" w:type="dxa"/>
-              <w:left w:w="50" w:type="dxa"/>
-              <w:right w:w="50" w:type="dxa"/>
+              <w:top w:w="18" w:type="dxa"/>
+              <w:bottom w:w="18" w:type="dxa"/>
+              <w:left w:w="40" w:type="dxa"/>
+              <w:right w:w="40" w:type="dxa"/>
             </w:tcMar>
             <w:tcBorders>
               <w:top w:val="single" w:sz="4" w:color="D8D8D8" w:space="0"/>
@@ -1400,10 +1433,10 @@
             <w:tcW w:type="dxa" w:w="1134"/>
             <w:shd w:val="clear" w:color="auto" w:fill="2E7D32"/>
             <w:tcMar>
-              <w:top w:w="30" w:type="dxa"/>
-              <w:bottom w:w="30" w:type="dxa"/>
-              <w:left w:w="50" w:type="dxa"/>
-              <w:right w:w="50" w:type="dxa"/>
+              <w:top w:w="18" w:type="dxa"/>
+              <w:bottom w:w="18" w:type="dxa"/>
+              <w:left w:w="40" w:type="dxa"/>
+              <w:right w:w="40" w:type="dxa"/>
             </w:tcMar>
             <w:tcBorders>
               <w:top w:val="single" w:sz="4" w:color="D8D8D8" w:space="0"/>
@@ -1433,10 +1466,10 @@
             <w:tcW w:type="dxa" w:w="1134"/>
             <w:shd w:val="clear" w:color="auto" w:fill="2E7D32"/>
             <w:tcMar>
-              <w:top w:w="30" w:type="dxa"/>
-              <w:bottom w:w="30" w:type="dxa"/>
-              <w:left w:w="50" w:type="dxa"/>
-              <w:right w:w="50" w:type="dxa"/>
+              <w:top w:w="18" w:type="dxa"/>
+              <w:bottom w:w="18" w:type="dxa"/>
+              <w:left w:w="40" w:type="dxa"/>
+              <w:right w:w="40" w:type="dxa"/>
             </w:tcMar>
             <w:tcBorders>
               <w:top w:val="single" w:sz="4" w:color="D8D8D8" w:space="0"/>
@@ -1466,10 +1499,10 @@
             <w:tcW w:type="dxa" w:w="1134"/>
             <w:shd w:val="clear" w:color="auto" w:fill="2E7D32"/>
             <w:tcMar>
-              <w:top w:w="30" w:type="dxa"/>
-              <w:bottom w:w="30" w:type="dxa"/>
-              <w:left w:w="50" w:type="dxa"/>
-              <w:right w:w="50" w:type="dxa"/>
+              <w:top w:w="18" w:type="dxa"/>
+              <w:bottom w:w="18" w:type="dxa"/>
+              <w:left w:w="40" w:type="dxa"/>
+              <w:right w:w="40" w:type="dxa"/>
             </w:tcMar>
             <w:tcBorders>
               <w:top w:val="single" w:sz="4" w:color="D8D8D8" w:space="0"/>
@@ -1499,10 +1532,10 @@
             <w:tcW w:type="dxa" w:w="1247"/>
             <w:shd w:val="clear" w:color="auto" w:fill="2E7D32"/>
             <w:tcMar>
-              <w:top w:w="30" w:type="dxa"/>
-              <w:bottom w:w="30" w:type="dxa"/>
-              <w:left w:w="50" w:type="dxa"/>
-              <w:right w:w="50" w:type="dxa"/>
+              <w:top w:w="18" w:type="dxa"/>
+              <w:bottom w:w="18" w:type="dxa"/>
+              <w:left w:w="40" w:type="dxa"/>
+              <w:right w:w="40" w:type="dxa"/>
             </w:tcMar>
             <w:tcBorders>
               <w:top w:val="single" w:sz="4" w:color="D8D8D8" w:space="0"/>
@@ -1532,10 +1565,10 @@
             <w:tcW w:type="dxa" w:w="1020"/>
             <w:shd w:val="clear" w:color="auto" w:fill="2E7D32"/>
             <w:tcMar>
-              <w:top w:w="30" w:type="dxa"/>
-              <w:bottom w:w="30" w:type="dxa"/>
-              <w:left w:w="50" w:type="dxa"/>
-              <w:right w:w="50" w:type="dxa"/>
+              <w:top w:w="18" w:type="dxa"/>
+              <w:bottom w:w="18" w:type="dxa"/>
+              <w:left w:w="40" w:type="dxa"/>
+              <w:right w:w="40" w:type="dxa"/>
             </w:tcMar>
             <w:tcBorders>
               <w:top w:val="single" w:sz="4" w:color="D8D8D8" w:space="0"/>
@@ -1565,10 +1598,10 @@
             <w:tcW w:type="dxa" w:w="1020"/>
             <w:shd w:val="clear" w:color="auto" w:fill="2E7D32"/>
             <w:tcMar>
-              <w:top w:w="30" w:type="dxa"/>
-              <w:bottom w:w="30" w:type="dxa"/>
-              <w:left w:w="50" w:type="dxa"/>
-              <w:right w:w="50" w:type="dxa"/>
+              <w:top w:w="18" w:type="dxa"/>
+              <w:bottom w:w="18" w:type="dxa"/>
+              <w:left w:w="40" w:type="dxa"/>
+              <w:right w:w="40" w:type="dxa"/>
             </w:tcMar>
             <w:tcBorders>
               <w:top w:val="single" w:sz="4" w:color="D8D8D8" w:space="0"/>
@@ -1598,10 +1631,10 @@
             <w:tcW w:type="dxa" w:w="1247"/>
             <w:shd w:val="clear" w:color="auto" w:fill="2E7D32"/>
             <w:tcMar>
-              <w:top w:w="30" w:type="dxa"/>
-              <w:bottom w:w="30" w:type="dxa"/>
-              <w:left w:w="50" w:type="dxa"/>
-              <w:right w:w="50" w:type="dxa"/>
+              <w:top w:w="18" w:type="dxa"/>
+              <w:bottom w:w="18" w:type="dxa"/>
+              <w:left w:w="40" w:type="dxa"/>
+              <w:right w:w="40" w:type="dxa"/>
             </w:tcMar>
             <w:tcBorders>
               <w:top w:val="single" w:sz="4" w:color="D8D8D8" w:space="0"/>
@@ -1633,10 +1666,10 @@
             <w:tcW w:type="dxa" w:w="2608"/>
             <w:shd w:val="clear" w:color="auto" w:fill="FFFFFF"/>
             <w:tcMar>
-              <w:top w:w="20" w:type="dxa"/>
-              <w:bottom w:w="20" w:type="dxa"/>
-              <w:left w:w="50" w:type="dxa"/>
-              <w:right w:w="50" w:type="dxa"/>
+              <w:top w:w="16" w:type="dxa"/>
+              <w:bottom w:w="16" w:type="dxa"/>
+              <w:left w:w="40" w:type="dxa"/>
+              <w:right w:w="40" w:type="dxa"/>
             </w:tcMar>
             <w:tcBorders>
               <w:top w:val="single" w:sz="4" w:color="D8D8D8" w:space="0"/>
@@ -1666,10 +1699,10 @@
             <w:tcW w:type="dxa" w:w="1134"/>
             <w:shd w:val="clear" w:color="auto" w:fill="FFFFFF"/>
             <w:tcMar>
-              <w:top w:w="20" w:type="dxa"/>
-              <w:bottom w:w="20" w:type="dxa"/>
-              <w:left w:w="50" w:type="dxa"/>
-              <w:right w:w="50" w:type="dxa"/>
+              <w:top w:w="16" w:type="dxa"/>
+              <w:bottom w:w="16" w:type="dxa"/>
+              <w:left w:w="40" w:type="dxa"/>
+              <w:right w:w="40" w:type="dxa"/>
             </w:tcMar>
             <w:tcBorders>
               <w:top w:val="single" w:sz="4" w:color="D8D8D8" w:space="0"/>
@@ -1699,10 +1732,10 @@
             <w:tcW w:type="dxa" w:w="1134"/>
             <w:shd w:val="clear" w:color="auto" w:fill="FFFFFF"/>
             <w:tcMar>
-              <w:top w:w="20" w:type="dxa"/>
-              <w:bottom w:w="20" w:type="dxa"/>
-              <w:left w:w="50" w:type="dxa"/>
-              <w:right w:w="50" w:type="dxa"/>
+              <w:top w:w="16" w:type="dxa"/>
+              <w:bottom w:w="16" w:type="dxa"/>
+              <w:left w:w="40" w:type="dxa"/>
+              <w:right w:w="40" w:type="dxa"/>
             </w:tcMar>
             <w:tcBorders>
               <w:top w:val="single" w:sz="4" w:color="D8D8D8" w:space="0"/>
@@ -1732,10 +1765,10 @@
             <w:tcW w:type="dxa" w:w="1134"/>
             <w:shd w:val="clear" w:color="auto" w:fill="FFFFFF"/>
             <w:tcMar>
-              <w:top w:w="20" w:type="dxa"/>
-              <w:bottom w:w="20" w:type="dxa"/>
-              <w:left w:w="50" w:type="dxa"/>
-              <w:right w:w="50" w:type="dxa"/>
+              <w:top w:w="16" w:type="dxa"/>
+              <w:bottom w:w="16" w:type="dxa"/>
+              <w:left w:w="40" w:type="dxa"/>
+              <w:right w:w="40" w:type="dxa"/>
             </w:tcMar>
             <w:tcBorders>
               <w:top w:val="single" w:sz="4" w:color="D8D8D8" w:space="0"/>
@@ -1765,10 +1798,10 @@
             <w:tcW w:type="dxa" w:w="1247"/>
             <w:shd w:val="clear" w:color="auto" w:fill="FFFFFF"/>
             <w:tcMar>
-              <w:top w:w="20" w:type="dxa"/>
-              <w:bottom w:w="20" w:type="dxa"/>
-              <w:left w:w="50" w:type="dxa"/>
-              <w:right w:w="50" w:type="dxa"/>
+              <w:top w:w="16" w:type="dxa"/>
+              <w:bottom w:w="16" w:type="dxa"/>
+              <w:left w:w="40" w:type="dxa"/>
+              <w:right w:w="40" w:type="dxa"/>
             </w:tcMar>
             <w:tcBorders>
               <w:top w:val="single" w:sz="4" w:color="D8D8D8" w:space="0"/>
@@ -1798,10 +1831,10 @@
             <w:tcW w:type="dxa" w:w="1020"/>
             <w:shd w:val="clear" w:color="auto" w:fill="FFFFFF"/>
             <w:tcMar>
-              <w:top w:w="20" w:type="dxa"/>
-              <w:bottom w:w="20" w:type="dxa"/>
-              <w:left w:w="50" w:type="dxa"/>
-              <w:right w:w="50" w:type="dxa"/>
+              <w:top w:w="16" w:type="dxa"/>
+              <w:bottom w:w="16" w:type="dxa"/>
+              <w:left w:w="40" w:type="dxa"/>
+              <w:right w:w="40" w:type="dxa"/>
             </w:tcMar>
             <w:tcBorders>
               <w:top w:val="single" w:sz="4" w:color="D8D8D8" w:space="0"/>
@@ -1831,10 +1864,10 @@
             <w:tcW w:type="dxa" w:w="1020"/>
             <w:shd w:val="clear" w:color="auto" w:fill="FFFFFF"/>
             <w:tcMar>
-              <w:top w:w="20" w:type="dxa"/>
-              <w:bottom w:w="20" w:type="dxa"/>
-              <w:left w:w="50" w:type="dxa"/>
-              <w:right w:w="50" w:type="dxa"/>
+              <w:top w:w="16" w:type="dxa"/>
+              <w:bottom w:w="16" w:type="dxa"/>
+              <w:left w:w="40" w:type="dxa"/>
+              <w:right w:w="40" w:type="dxa"/>
             </w:tcMar>
             <w:tcBorders>
               <w:top w:val="single" w:sz="4" w:color="D8D8D8" w:space="0"/>
@@ -1864,10 +1897,10 @@
             <w:tcW w:type="dxa" w:w="1247"/>
             <w:shd w:val="clear" w:color="auto" w:fill="FFFFFF"/>
             <w:tcMar>
-              <w:top w:w="20" w:type="dxa"/>
-              <w:bottom w:w="20" w:type="dxa"/>
-              <w:left w:w="50" w:type="dxa"/>
-              <w:right w:w="50" w:type="dxa"/>
+              <w:top w:w="16" w:type="dxa"/>
+              <w:bottom w:w="16" w:type="dxa"/>
+              <w:left w:w="40" w:type="dxa"/>
+              <w:right w:w="40" w:type="dxa"/>
             </w:tcMar>
             <w:tcBorders>
               <w:top w:val="single" w:sz="4" w:color="D8D8D8" w:space="0"/>
@@ -1899,10 +1932,10 @@
             <w:tcW w:type="dxa" w:w="2608"/>
             <w:shd w:val="clear" w:color="auto" w:fill="F9FBF9"/>
             <w:tcMar>
-              <w:top w:w="20" w:type="dxa"/>
-              <w:bottom w:w="20" w:type="dxa"/>
-              <w:left w:w="50" w:type="dxa"/>
-              <w:right w:w="50" w:type="dxa"/>
+              <w:top w:w="16" w:type="dxa"/>
+              <w:bottom w:w="16" w:type="dxa"/>
+              <w:left w:w="40" w:type="dxa"/>
+              <w:right w:w="40" w:type="dxa"/>
             </w:tcMar>
             <w:tcBorders>
               <w:top w:val="single" w:sz="4" w:color="D8D8D8" w:space="0"/>
@@ -1932,10 +1965,10 @@
             <w:tcW w:type="dxa" w:w="1134"/>
             <w:shd w:val="clear" w:color="auto" w:fill="F9FBF9"/>
             <w:tcMar>
-              <w:top w:w="20" w:type="dxa"/>
-              <w:bottom w:w="20" w:type="dxa"/>
-              <w:left w:w="50" w:type="dxa"/>
-              <w:right w:w="50" w:type="dxa"/>
+              <w:top w:w="16" w:type="dxa"/>
+              <w:bottom w:w="16" w:type="dxa"/>
+              <w:left w:w="40" w:type="dxa"/>
+              <w:right w:w="40" w:type="dxa"/>
             </w:tcMar>
             <w:tcBorders>
               <w:top w:val="single" w:sz="4" w:color="D8D8D8" w:space="0"/>
@@ -1965,10 +1998,10 @@
             <w:tcW w:type="dxa" w:w="1134"/>
             <w:shd w:val="clear" w:color="auto" w:fill="F9FBF9"/>
             <w:tcMar>
-              <w:top w:w="20" w:type="dxa"/>
-              <w:bottom w:w="20" w:type="dxa"/>
-              <w:left w:w="50" w:type="dxa"/>
-              <w:right w:w="50" w:type="dxa"/>
+              <w:top w:w="16" w:type="dxa"/>
+              <w:bottom w:w="16" w:type="dxa"/>
+              <w:left w:w="40" w:type="dxa"/>
+              <w:right w:w="40" w:type="dxa"/>
             </w:tcMar>
             <w:tcBorders>
               <w:top w:val="single" w:sz="4" w:color="D8D8D8" w:space="0"/>
@@ -1998,10 +2031,10 @@
             <w:tcW w:type="dxa" w:w="1134"/>
             <w:shd w:val="clear" w:color="auto" w:fill="F9FBF9"/>
             <w:tcMar>
-              <w:top w:w="20" w:type="dxa"/>
-              <w:bottom w:w="20" w:type="dxa"/>
-              <w:left w:w="50" w:type="dxa"/>
-              <w:right w:w="50" w:type="dxa"/>
+              <w:top w:w="16" w:type="dxa"/>
+              <w:bottom w:w="16" w:type="dxa"/>
+              <w:left w:w="40" w:type="dxa"/>
+              <w:right w:w="40" w:type="dxa"/>
             </w:tcMar>
             <w:tcBorders>
               <w:top w:val="single" w:sz="4" w:color="D8D8D8" w:space="0"/>
@@ -2031,10 +2064,10 @@
             <w:tcW w:type="dxa" w:w="1247"/>
             <w:shd w:val="clear" w:color="auto" w:fill="F9FBF9"/>
             <w:tcMar>
-              <w:top w:w="20" w:type="dxa"/>
-              <w:bottom w:w="20" w:type="dxa"/>
-              <w:left w:w="50" w:type="dxa"/>
-              <w:right w:w="50" w:type="dxa"/>
+              <w:top w:w="16" w:type="dxa"/>
+              <w:bottom w:w="16" w:type="dxa"/>
+              <w:left w:w="40" w:type="dxa"/>
+              <w:right w:w="40" w:type="dxa"/>
             </w:tcMar>
             <w:tcBorders>
               <w:top w:val="single" w:sz="4" w:color="D8D8D8" w:space="0"/>
@@ -2064,10 +2097,10 @@
             <w:tcW w:type="dxa" w:w="1020"/>
             <w:shd w:val="clear" w:color="auto" w:fill="F9FBF9"/>
             <w:tcMar>
-              <w:top w:w="20" w:type="dxa"/>
-              <w:bottom w:w="20" w:type="dxa"/>
-              <w:left w:w="50" w:type="dxa"/>
-              <w:right w:w="50" w:type="dxa"/>
+              <w:top w:w="16" w:type="dxa"/>
+              <w:bottom w:w="16" w:type="dxa"/>
+              <w:left w:w="40" w:type="dxa"/>
+              <w:right w:w="40" w:type="dxa"/>
             </w:tcMar>
             <w:tcBorders>
               <w:top w:val="single" w:sz="4" w:color="D8D8D8" w:space="0"/>
@@ -2097,10 +2130,10 @@
             <w:tcW w:type="dxa" w:w="1020"/>
             <w:shd w:val="clear" w:color="auto" w:fill="F9FBF9"/>
             <w:tcMar>
-              <w:top w:w="20" w:type="dxa"/>
-              <w:bottom w:w="20" w:type="dxa"/>
-              <w:left w:w="50" w:type="dxa"/>
-              <w:right w:w="50" w:type="dxa"/>
+              <w:top w:w="16" w:type="dxa"/>
+              <w:bottom w:w="16" w:type="dxa"/>
+              <w:left w:w="40" w:type="dxa"/>
+              <w:right w:w="40" w:type="dxa"/>
             </w:tcMar>
             <w:tcBorders>
               <w:top w:val="single" w:sz="4" w:color="D8D8D8" w:space="0"/>
@@ -2130,10 +2163,10 @@
             <w:tcW w:type="dxa" w:w="1247"/>
             <w:shd w:val="clear" w:color="auto" w:fill="F9FBF9"/>
             <w:tcMar>
-              <w:top w:w="20" w:type="dxa"/>
-              <w:bottom w:w="20" w:type="dxa"/>
-              <w:left w:w="50" w:type="dxa"/>
-              <w:right w:w="50" w:type="dxa"/>
+              <w:top w:w="16" w:type="dxa"/>
+              <w:bottom w:w="16" w:type="dxa"/>
+              <w:left w:w="40" w:type="dxa"/>
+              <w:right w:w="40" w:type="dxa"/>
             </w:tcMar>
             <w:tcBorders>
               <w:top w:val="single" w:sz="4" w:color="D8D8D8" w:space="0"/>
@@ -2165,10 +2198,10 @@
             <w:tcW w:type="dxa" w:w="2608"/>
             <w:shd w:val="clear" w:color="auto" w:fill="FFFFFF"/>
             <w:tcMar>
-              <w:top w:w="20" w:type="dxa"/>
-              <w:bottom w:w="20" w:type="dxa"/>
-              <w:left w:w="50" w:type="dxa"/>
-              <w:right w:w="50" w:type="dxa"/>
+              <w:top w:w="16" w:type="dxa"/>
+              <w:bottom w:w="16" w:type="dxa"/>
+              <w:left w:w="40" w:type="dxa"/>
+              <w:right w:w="40" w:type="dxa"/>
             </w:tcMar>
             <w:tcBorders>
               <w:top w:val="single" w:sz="4" w:color="D8D8D8" w:space="0"/>
@@ -2198,10 +2231,10 @@
             <w:tcW w:type="dxa" w:w="1134"/>
             <w:shd w:val="clear" w:color="auto" w:fill="FFFFFF"/>
             <w:tcMar>
-              <w:top w:w="20" w:type="dxa"/>
-              <w:bottom w:w="20" w:type="dxa"/>
-              <w:left w:w="50" w:type="dxa"/>
-              <w:right w:w="50" w:type="dxa"/>
+              <w:top w:w="16" w:type="dxa"/>
+              <w:bottom w:w="16" w:type="dxa"/>
+              <w:left w:w="40" w:type="dxa"/>
+              <w:right w:w="40" w:type="dxa"/>
             </w:tcMar>
             <w:tcBorders>
               <w:top w:val="single" w:sz="4" w:color="D8D8D8" w:space="0"/>
@@ -2231,10 +2264,10 @@
             <w:tcW w:type="dxa" w:w="1134"/>
             <w:shd w:val="clear" w:color="auto" w:fill="FFFFFF"/>
             <w:tcMar>
-              <w:top w:w="20" w:type="dxa"/>
-              <w:bottom w:w="20" w:type="dxa"/>
-              <w:left w:w="50" w:type="dxa"/>
-              <w:right w:w="50" w:type="dxa"/>
+              <w:top w:w="16" w:type="dxa"/>
+              <w:bottom w:w="16" w:type="dxa"/>
+              <w:left w:w="40" w:type="dxa"/>
+              <w:right w:w="40" w:type="dxa"/>
             </w:tcMar>
             <w:tcBorders>
               <w:top w:val="single" w:sz="4" w:color="D8D8D8" w:space="0"/>
@@ -2264,10 +2297,10 @@
             <w:tcW w:type="dxa" w:w="1134"/>
             <w:shd w:val="clear" w:color="auto" w:fill="FFFFFF"/>
             <w:tcMar>
-              <w:top w:w="20" w:type="dxa"/>
-              <w:bottom w:w="20" w:type="dxa"/>
-              <w:left w:w="50" w:type="dxa"/>
-              <w:right w:w="50" w:type="dxa"/>
+              <w:top w:w="16" w:type="dxa"/>
+              <w:bottom w:w="16" w:type="dxa"/>
+              <w:left w:w="40" w:type="dxa"/>
+              <w:right w:w="40" w:type="dxa"/>
             </w:tcMar>
             <w:tcBorders>
               <w:top w:val="single" w:sz="4" w:color="D8D8D8" w:space="0"/>
@@ -2297,10 +2330,10 @@
             <w:tcW w:type="dxa" w:w="1247"/>
             <w:shd w:val="clear" w:color="auto" w:fill="FFFFFF"/>
             <w:tcMar>
-              <w:top w:w="20" w:type="dxa"/>
-              <w:bottom w:w="20" w:type="dxa"/>
-              <w:left w:w="50" w:type="dxa"/>
-              <w:right w:w="50" w:type="dxa"/>
+              <w:top w:w="16" w:type="dxa"/>
+              <w:bottom w:w="16" w:type="dxa"/>
+              <w:left w:w="40" w:type="dxa"/>
+              <w:right w:w="40" w:type="dxa"/>
             </w:tcMar>
             <w:tcBorders>
               <w:top w:val="single" w:sz="4" w:color="D8D8D8" w:space="0"/>
@@ -2330,10 +2363,10 @@
             <w:tcW w:type="dxa" w:w="1020"/>
             <w:shd w:val="clear" w:color="auto" w:fill="FFFFFF"/>
             <w:tcMar>
-              <w:top w:w="20" w:type="dxa"/>
-              <w:bottom w:w="20" w:type="dxa"/>
-              <w:left w:w="50" w:type="dxa"/>
-              <w:right w:w="50" w:type="dxa"/>
+              <w:top w:w="16" w:type="dxa"/>
+              <w:bottom w:w="16" w:type="dxa"/>
+              <w:left w:w="40" w:type="dxa"/>
+              <w:right w:w="40" w:type="dxa"/>
             </w:tcMar>
             <w:tcBorders>
               <w:top w:val="single" w:sz="4" w:color="D8D8D8" w:space="0"/>
@@ -2363,10 +2396,10 @@
             <w:tcW w:type="dxa" w:w="1020"/>
             <w:shd w:val="clear" w:color="auto" w:fill="FFFFFF"/>
             <w:tcMar>
-              <w:top w:w="20" w:type="dxa"/>
-              <w:bottom w:w="20" w:type="dxa"/>
-              <w:left w:w="50" w:type="dxa"/>
-              <w:right w:w="50" w:type="dxa"/>
+              <w:top w:w="16" w:type="dxa"/>
+              <w:bottom w:w="16" w:type="dxa"/>
+              <w:left w:w="40" w:type="dxa"/>
+              <w:right w:w="40" w:type="dxa"/>
             </w:tcMar>
             <w:tcBorders>
               <w:top w:val="single" w:sz="4" w:color="D8D8D8" w:space="0"/>
@@ -2396,10 +2429,10 @@
             <w:tcW w:type="dxa" w:w="1247"/>
             <w:shd w:val="clear" w:color="auto" w:fill="FFFFFF"/>
             <w:tcMar>
-              <w:top w:w="20" w:type="dxa"/>
-              <w:bottom w:w="20" w:type="dxa"/>
-              <w:left w:w="50" w:type="dxa"/>
-              <w:right w:w="50" w:type="dxa"/>
+              <w:top w:w="16" w:type="dxa"/>
+              <w:bottom w:w="16" w:type="dxa"/>
+              <w:left w:w="40" w:type="dxa"/>
+              <w:right w:w="40" w:type="dxa"/>
             </w:tcMar>
             <w:tcBorders>
               <w:top w:val="single" w:sz="4" w:color="D8D8D8" w:space="0"/>
@@ -2431,10 +2464,10 @@
             <w:tcW w:type="dxa" w:w="2608"/>
             <w:shd w:val="clear" w:color="auto" w:fill="F9FBF9"/>
             <w:tcMar>
-              <w:top w:w="20" w:type="dxa"/>
-              <w:bottom w:w="20" w:type="dxa"/>
-              <w:left w:w="50" w:type="dxa"/>
-              <w:right w:w="50" w:type="dxa"/>
+              <w:top w:w="16" w:type="dxa"/>
+              <w:bottom w:w="16" w:type="dxa"/>
+              <w:left w:w="40" w:type="dxa"/>
+              <w:right w:w="40" w:type="dxa"/>
             </w:tcMar>
             <w:tcBorders>
               <w:top w:val="single" w:sz="4" w:color="D8D8D8" w:space="0"/>
@@ -2464,10 +2497,10 @@
             <w:tcW w:type="dxa" w:w="1134"/>
             <w:shd w:val="clear" w:color="auto" w:fill="F9FBF9"/>
             <w:tcMar>
-              <w:top w:w="20" w:type="dxa"/>
-              <w:bottom w:w="20" w:type="dxa"/>
-              <w:left w:w="50" w:type="dxa"/>
-              <w:right w:w="50" w:type="dxa"/>
+              <w:top w:w="16" w:type="dxa"/>
+              <w:bottom w:w="16" w:type="dxa"/>
+              <w:left w:w="40" w:type="dxa"/>
+              <w:right w:w="40" w:type="dxa"/>
             </w:tcMar>
             <w:tcBorders>
               <w:top w:val="single" w:sz="4" w:color="D8D8D8" w:space="0"/>
@@ -2497,10 +2530,10 @@
             <w:tcW w:type="dxa" w:w="1134"/>
             <w:shd w:val="clear" w:color="auto" w:fill="F9FBF9"/>
             <w:tcMar>
-              <w:top w:w="20" w:type="dxa"/>
-              <w:bottom w:w="20" w:type="dxa"/>
-              <w:left w:w="50" w:type="dxa"/>
-              <w:right w:w="50" w:type="dxa"/>
+              <w:top w:w="16" w:type="dxa"/>
+              <w:bottom w:w="16" w:type="dxa"/>
+              <w:left w:w="40" w:type="dxa"/>
+              <w:right w:w="40" w:type="dxa"/>
             </w:tcMar>
             <w:tcBorders>
               <w:top w:val="single" w:sz="4" w:color="D8D8D8" w:space="0"/>
@@ -2530,10 +2563,10 @@
             <w:tcW w:type="dxa" w:w="1134"/>
             <w:shd w:val="clear" w:color="auto" w:fill="F9FBF9"/>
             <w:tcMar>
-              <w:top w:w="20" w:type="dxa"/>
-              <w:bottom w:w="20" w:type="dxa"/>
-              <w:left w:w="50" w:type="dxa"/>
-              <w:right w:w="50" w:type="dxa"/>
+              <w:top w:w="16" w:type="dxa"/>
+              <w:bottom w:w="16" w:type="dxa"/>
+              <w:left w:w="40" w:type="dxa"/>
+              <w:right w:w="40" w:type="dxa"/>
             </w:tcMar>
             <w:tcBorders>
               <w:top w:val="single" w:sz="4" w:color="D8D8D8" w:space="0"/>
@@ -2563,10 +2596,10 @@
             <w:tcW w:type="dxa" w:w="1247"/>
             <w:shd w:val="clear" w:color="auto" w:fill="F9FBF9"/>
             <w:tcMar>
-              <w:top w:w="20" w:type="dxa"/>
-              <w:bottom w:w="20" w:type="dxa"/>
-              <w:left w:w="50" w:type="dxa"/>
-              <w:right w:w="50" w:type="dxa"/>
+              <w:top w:w="16" w:type="dxa"/>
+              <w:bottom w:w="16" w:type="dxa"/>
+              <w:left w:w="40" w:type="dxa"/>
+              <w:right w:w="40" w:type="dxa"/>
             </w:tcMar>
             <w:tcBorders>
               <w:top w:val="single" w:sz="4" w:color="D8D8D8" w:space="0"/>
@@ -2596,10 +2629,10 @@
             <w:tcW w:type="dxa" w:w="1020"/>
             <w:shd w:val="clear" w:color="auto" w:fill="F9FBF9"/>
             <w:tcMar>
-              <w:top w:w="20" w:type="dxa"/>
-              <w:bottom w:w="20" w:type="dxa"/>
-              <w:left w:w="50" w:type="dxa"/>
-              <w:right w:w="50" w:type="dxa"/>
+              <w:top w:w="16" w:type="dxa"/>
+              <w:bottom w:w="16" w:type="dxa"/>
+              <w:left w:w="40" w:type="dxa"/>
+              <w:right w:w="40" w:type="dxa"/>
             </w:tcMar>
             <w:tcBorders>
               <w:top w:val="single" w:sz="4" w:color="D8D8D8" w:space="0"/>
@@ -2629,10 +2662,10 @@
             <w:tcW w:type="dxa" w:w="1020"/>
             <w:shd w:val="clear" w:color="auto" w:fill="F9FBF9"/>
             <w:tcMar>
-              <w:top w:w="20" w:type="dxa"/>
-              <w:bottom w:w="20" w:type="dxa"/>
-              <w:left w:w="50" w:type="dxa"/>
-              <w:right w:w="50" w:type="dxa"/>
+              <w:top w:w="16" w:type="dxa"/>
+              <w:bottom w:w="16" w:type="dxa"/>
+              <w:left w:w="40" w:type="dxa"/>
+              <w:right w:w="40" w:type="dxa"/>
             </w:tcMar>
             <w:tcBorders>
               <w:top w:val="single" w:sz="4" w:color="D8D8D8" w:space="0"/>
@@ -2662,10 +2695,10 @@
             <w:tcW w:type="dxa" w:w="1247"/>
             <w:shd w:val="clear" w:color="auto" w:fill="F9FBF9"/>
             <w:tcMar>
-              <w:top w:w="20" w:type="dxa"/>
-              <w:bottom w:w="20" w:type="dxa"/>
-              <w:left w:w="50" w:type="dxa"/>
-              <w:right w:w="50" w:type="dxa"/>
+              <w:top w:w="16" w:type="dxa"/>
+              <w:bottom w:w="16" w:type="dxa"/>
+              <w:left w:w="40" w:type="dxa"/>
+              <w:right w:w="40" w:type="dxa"/>
             </w:tcMar>
             <w:tcBorders>
               <w:top w:val="single" w:sz="4" w:color="D8D8D8" w:space="0"/>
@@ -2697,10 +2730,10 @@
             <w:tcW w:type="dxa" w:w="2608"/>
             <w:shd w:val="clear" w:color="auto" w:fill="FFFFFF"/>
             <w:tcMar>
-              <w:top w:w="20" w:type="dxa"/>
-              <w:bottom w:w="20" w:type="dxa"/>
-              <w:left w:w="50" w:type="dxa"/>
-              <w:right w:w="50" w:type="dxa"/>
+              <w:top w:w="16" w:type="dxa"/>
+              <w:bottom w:w="16" w:type="dxa"/>
+              <w:left w:w="40" w:type="dxa"/>
+              <w:right w:w="40" w:type="dxa"/>
             </w:tcMar>
             <w:tcBorders>
               <w:top w:val="single" w:sz="4" w:color="D8D8D8" w:space="0"/>
@@ -2730,10 +2763,10 @@
             <w:tcW w:type="dxa" w:w="1134"/>
             <w:shd w:val="clear" w:color="auto" w:fill="FFFFFF"/>
             <w:tcMar>
-              <w:top w:w="20" w:type="dxa"/>
-              <w:bottom w:w="20" w:type="dxa"/>
-              <w:left w:w="50" w:type="dxa"/>
-              <w:right w:w="50" w:type="dxa"/>
+              <w:top w:w="16" w:type="dxa"/>
+              <w:bottom w:w="16" w:type="dxa"/>
+              <w:left w:w="40" w:type="dxa"/>
+              <w:right w:w="40" w:type="dxa"/>
             </w:tcMar>
             <w:tcBorders>
               <w:top w:val="single" w:sz="4" w:color="D8D8D8" w:space="0"/>
@@ -2763,10 +2796,10 @@
             <w:tcW w:type="dxa" w:w="1134"/>
             <w:shd w:val="clear" w:color="auto" w:fill="FFFFFF"/>
             <w:tcMar>
-              <w:top w:w="20" w:type="dxa"/>
-              <w:bottom w:w="20" w:type="dxa"/>
-              <w:left w:w="50" w:type="dxa"/>
-              <w:right w:w="50" w:type="dxa"/>
+              <w:top w:w="16" w:type="dxa"/>
+              <w:bottom w:w="16" w:type="dxa"/>
+              <w:left w:w="40" w:type="dxa"/>
+              <w:right w:w="40" w:type="dxa"/>
             </w:tcMar>
             <w:tcBorders>
               <w:top w:val="single" w:sz="4" w:color="D8D8D8" w:space="0"/>
@@ -2796,10 +2829,10 @@
             <w:tcW w:type="dxa" w:w="1134"/>
             <w:shd w:val="clear" w:color="auto" w:fill="FFFFFF"/>
             <w:tcMar>
-              <w:top w:w="20" w:type="dxa"/>
-              <w:bottom w:w="20" w:type="dxa"/>
-              <w:left w:w="50" w:type="dxa"/>
-              <w:right w:w="50" w:type="dxa"/>
+              <w:top w:w="16" w:type="dxa"/>
+              <w:bottom w:w="16" w:type="dxa"/>
+              <w:left w:w="40" w:type="dxa"/>
+              <w:right w:w="40" w:type="dxa"/>
             </w:tcMar>
             <w:tcBorders>
               <w:top w:val="single" w:sz="4" w:color="D8D8D8" w:space="0"/>
@@ -2829,10 +2862,10 @@
             <w:tcW w:type="dxa" w:w="1247"/>
             <w:shd w:val="clear" w:color="auto" w:fill="FFFFFF"/>
             <w:tcMar>
-              <w:top w:w="20" w:type="dxa"/>
-              <w:bottom w:w="20" w:type="dxa"/>
-              <w:left w:w="50" w:type="dxa"/>
-              <w:right w:w="50" w:type="dxa"/>
+              <w:top w:w="16" w:type="dxa"/>
+              <w:bottom w:w="16" w:type="dxa"/>
+              <w:left w:w="40" w:type="dxa"/>
+              <w:right w:w="40" w:type="dxa"/>
             </w:tcMar>
             <w:tcBorders>
               <w:top w:val="single" w:sz="4" w:color="D8D8D8" w:space="0"/>
@@ -2862,10 +2895,10 @@
             <w:tcW w:type="dxa" w:w="1020"/>
             <w:shd w:val="clear" w:color="auto" w:fill="FFFFFF"/>
             <w:tcMar>
-              <w:top w:w="20" w:type="dxa"/>
-              <w:bottom w:w="20" w:type="dxa"/>
-              <w:left w:w="50" w:type="dxa"/>
-              <w:right w:w="50" w:type="dxa"/>
+              <w:top w:w="16" w:type="dxa"/>
+              <w:bottom w:w="16" w:type="dxa"/>
+              <w:left w:w="40" w:type="dxa"/>
+              <w:right w:w="40" w:type="dxa"/>
             </w:tcMar>
             <w:tcBorders>
               <w:top w:val="single" w:sz="4" w:color="D8D8D8" w:space="0"/>
@@ -2895,10 +2928,10 @@
             <w:tcW w:type="dxa" w:w="1020"/>
             <w:shd w:val="clear" w:color="auto" w:fill="FFFFFF"/>
             <w:tcMar>
-              <w:top w:w="20" w:type="dxa"/>
-              <w:bottom w:w="20" w:type="dxa"/>
-              <w:left w:w="50" w:type="dxa"/>
-              <w:right w:w="50" w:type="dxa"/>
+              <w:top w:w="16" w:type="dxa"/>
+              <w:bottom w:w="16" w:type="dxa"/>
+              <w:left w:w="40" w:type="dxa"/>
+              <w:right w:w="40" w:type="dxa"/>
             </w:tcMar>
             <w:tcBorders>
               <w:top w:val="single" w:sz="4" w:color="D8D8D8" w:space="0"/>
@@ -2928,10 +2961,10 @@
             <w:tcW w:type="dxa" w:w="1247"/>
             <w:shd w:val="clear" w:color="auto" w:fill="FFFFFF"/>
             <w:tcMar>
-              <w:top w:w="20" w:type="dxa"/>
-              <w:bottom w:w="20" w:type="dxa"/>
-              <w:left w:w="50" w:type="dxa"/>
-              <w:right w:w="50" w:type="dxa"/>
+              <w:top w:w="16" w:type="dxa"/>
+              <w:bottom w:w="16" w:type="dxa"/>
+              <w:left w:w="40" w:type="dxa"/>
+              <w:right w:w="40" w:type="dxa"/>
             </w:tcMar>
             <w:tcBorders>
               <w:top w:val="single" w:sz="4" w:color="D8D8D8" w:space="0"/>
@@ -2960,7 +2993,78 @@
     </w:tbl>
     <w:p>
       <w:pPr>
-        <w:spacing w:before="60" w:after="20"/>
+        <w:spacing w:before="30" w:after="40" w:line="252" w:lineRule="auto"/>
+        <w:ind w:left="100"/>
+        <w:shd w:val="clear" w:color="auto" w:fill="EDF7EE"/>
+        <w:pBdr>
+          <w:left w:val="single" w:sz="12" w:space="4" w:color="2E7D32"/>
+        </w:pBdr>
+      </w:pPr>
+      <w:r>
+        <w:rPr>
+          <w:b/>
+          <w:i w:val="0"/>
+          <w:color w:val="1B5E20"/>
+          <w:sz w:val="15"/>
+        </w:rPr>
+        <w:t>Formulasi Matematis (Disparitas Spasial &amp; Rasio Kesenjangan Morowali):</w:t>
+        <w:br/>
+      </w:r>
+      <w:r>
+        <w:rPr>
+          <w:rFonts w:ascii="Consolas" w:hAnsi="Consolas"/>
+          <w:b w:val="0"/>
+          <w:i w:val="0"/>
+          <w:color w:val="104010"/>
+          <w:sz w:val="14"/>
+        </w:rPr>
+        <w:t>Sektor_Ekstraktif_Kab = PDRB_Kab(Kat.B) + PDRB_Kab(Kat.C) + PDRB_Kab(Kat.D)</w:t>
+        <w:br/>
+        <w:t>Porsi_Sektor_Kab (%) = ( Nilai_Sektor_Kab / Total_PDRB_Kab ) * 100</w:t>
+        <w:br/>
+        <w:t>Rasio_Kesenjangan = Sektor_Ekstraktif_Morowali / Sektor_Akar_Rumput_Morowali</w:t>
+        <w:br/>
+      </w:r>
+      <w:r>
+        <w:rPr>
+          <w:b/>
+          <w:i w:val="0"/>
+          <w:color w:val="1B5E20"/>
+          <w:sz w:val="15"/>
+        </w:rPr>
+        <w:t>Persamaan Substitusi:</w:t>
+        <w:br/>
+      </w:r>
+      <w:r>
+        <w:rPr>
+          <w:rFonts w:ascii="Consolas" w:hAnsi="Consolas"/>
+          <w:b w:val="0"/>
+          <w:i w:val="0"/>
+          <w:color w:val="222222"/>
+          <w:sz w:val="14"/>
+        </w:rPr>
+        <w:t>Sektor_Ekstraktif_Morowali = Rp29,20 T (Tambang) + Rp127,96 T (Smelter) = Rp157,17 Triliun (Porsi: 45,20%)</w:t>
+        <w:br/>
+        <w:t>Sektor_Akar_Rumput_Morowali = Rp2,70 Triliun (Porsi: 0,78%)</w:t>
+        <w:br/>
+        <w:t>Rasio_Kesenjangan_Morowali = Rp157,17 Triliun / Rp2,70 Triliun = 58,21 Kali Lipat</w:t>
+        <w:br/>
+        <w:t>Komparasi_Wilayah: Sektor ekstraktif Morowali (Rp157,17 T) &gt; Gabungan 8 Kab. Non-Sentra Sulteng (Rp115,22 T)</w:t>
+      </w:r>
+      <w:r>
+        <w:rPr>
+          <w:b w:val="0"/>
+          <w:i/>
+          <w:color w:val="555555"/>
+          <w:sz w:val="14"/>
+        </w:rPr>
+        <w:br/>
+        <w:t>Ket: Sektor pangan dan pertanian rakyat Morowali hanya tersisa 0,78% dari total kapasitas ekonomi daerah.</w:t>
+      </w:r>
+    </w:p>
+    <w:p>
+      <w:pPr>
+        <w:spacing w:before="50" w:after="20"/>
       </w:pPr>
       <w:r>
         <w:rPr>
@@ -2984,30 +3088,12 @@
           <w:color w:val="222222"/>
           <w:sz w:val="17"/>
         </w:rPr>
-        <w:t xml:space="preserve">Analisis komparatif </w:t>
-      </w:r>
-      <w:r>
-        <w:rPr>
-          <w:b/>
-          <w:i w:val="0"/>
-          <w:color w:val="222222"/>
-          <w:sz w:val="17"/>
-        </w:rPr>
-        <w:t>Small Multiples</w:t>
-      </w:r>
-      <w:r>
-        <w:rPr>
-          <w:b w:val="0"/>
-          <w:i w:val="0"/>
-          <w:color w:val="222222"/>
-          <w:sz w:val="17"/>
-        </w:rPr>
-        <w:t xml:space="preserve"> terhadap 17 sektor KBLI 2020 (BPS 2024) membuktikan dualisme regional: Sulawesi Tengah (44.1% smelter, 11.8% tambang) dan Sulawesi Tenggara (22.4% pertanian, 20.9% tambang) terpolarisasi pada sektor ekstraktif, sedangkan Sulawesi Selatan (21.8%), Sulawesi Utara (20.5%), Sulawesi Barat (38.2%), dan Gorontalo (36.4%) tetap bertumpu pada Sektor Pertanian dan Jasa Perdagangan.</w:t>
+        <w:t>Analisis komparatif Small Multiples membuktikan polarisasi regional: Sulawesi Tengah (44,1% smelter, 11,8% tambang) dan Sulawesi Tenggara (22,4% pertanian, 20,9% tambang) terpolarisasi ekstraktif, sementara empat provinsi lainnya (Sulsel, Sulut, Sulbar, Gorontalo) bertumpu pada pertanian dan jasa perdagangan (20,5% s.d. 38,2%).</w:t>
       </w:r>
     </w:p>
     <w:p>
       <w:pPr>
-        <w:spacing w:before="80" w:after="30"/>
+        <w:spacing w:before="70" w:after="20"/>
         <w:pBdr>
           <w:bottom w:val="single" w:sz="4" w:space="1" w:color="2E7D32"/>
         </w:pBdr>
@@ -3017,7 +3103,7 @@
           <w:b/>
           <w:i w:val="0"/>
           <w:color w:val="1B5E20"/>
-          <w:sz w:val="19"/>
+          <w:sz w:val="18"/>
         </w:rPr>
         <w:t>1.2 Konsentrasi Kawasan Industri &amp; PLTU Captive</w:t>
       </w:r>
@@ -3034,7 +3120,7 @@
           <w:color w:val="222222"/>
           <w:sz w:val="17"/>
         </w:rPr>
-        <w:t xml:space="preserve">Pengoperasian </w:t>
+        <w:t xml:space="preserve">Operasi </w:t>
       </w:r>
       <w:r>
         <w:rPr>
@@ -3043,7 +3129,7 @@
           <w:color w:val="222222"/>
           <w:sz w:val="17"/>
         </w:rPr>
-        <w:t>778 fasilitas smelter</w:t>
+        <w:t>778 unit smelter</w:t>
       </w:r>
       <w:r>
         <w:rPr>
@@ -3052,7 +3138,7 @@
           <w:color w:val="222222"/>
           <w:sz w:val="17"/>
         </w:rPr>
-        <w:t xml:space="preserve"> di Sulawesi didukung oleh kapasitas energi fosil </w:t>
+        <w:t xml:space="preserve"> di Sulawesi ditopang oleh </w:t>
       </w:r>
       <w:r>
         <w:rPr>
@@ -3061,7 +3147,7 @@
           <w:color w:val="222222"/>
           <w:sz w:val="17"/>
         </w:rPr>
-        <w:t>9,825 MW PLTU Captive batu bara off-grid</w:t>
+        <w:t>9.825 MW PLTU Captive batu bara off-grid</w:t>
       </w:r>
       <w:r>
         <w:rPr>
@@ -3070,16 +3156,16 @@
           <w:color w:val="222222"/>
           <w:sz w:val="17"/>
         </w:rPr>
-        <w:t xml:space="preserve"> (ESDM &amp; GEM). Uji tabulasi silang panel (Crosstab SPSS, N=60) membuktikan keterkaitan signifikan antara keberadaan PLTU captive dengan eskalasi kehilangan tutupan hutan di tapak industri.</w:t>
+        <w:t xml:space="preserve"> (ESDM &amp; GEM). Uji tabulasi silang SPSS (N=60) mengonfirmasi pemusatan energi fosil berkorelasi erat dengan eskalasi deforestasi tapak industri.</w:t>
       </w:r>
     </w:p>
     <w:p>
       <w:pPr>
-        <w:spacing w:before="20" w:after="40" w:line="252" w:lineRule="auto"/>
-        <w:ind w:left="120"/>
+        <w:spacing w:before="30" w:after="40" w:line="252" w:lineRule="auto"/>
+        <w:ind w:left="100"/>
         <w:shd w:val="clear" w:color="auto" w:fill="EDF7EE"/>
         <w:pBdr>
-          <w:left w:val="single" w:sz="12" w:space="4" w:color="43A047"/>
+          <w:left w:val="single" w:sz="12" w:space="4" w:color="2E7D32"/>
         </w:pBdr>
       </w:pPr>
       <w:r>
@@ -3089,7 +3175,8 @@
           <w:color w:val="1B5E20"/>
           <w:sz w:val="15"/>
         </w:rPr>
-        <w:t xml:space="preserve">Formulasi (Chi-Square &amp; Odds Ratio): </w:t>
+        <w:t>Formulasi Matematis (Konsentrasi Spasial Energi PLTU Captive):</w:t>
+        <w:br/>
       </w:r>
       <w:r>
         <w:rPr>
@@ -3097,9 +3184,32 @@
           <w:b w:val="0"/>
           <w:i w:val="0"/>
           <w:color w:val="104010"/>
+          <w:sz w:val="14"/>
+        </w:rPr>
+        <w:t>Porsi_Konsentrasi (%) = ( Kapasitas_Sentra / Total_Kapasitas_Sulawesi ) * 100</w:t>
+        <w:br/>
+        <w:t>χ² = Σ [ ( O_ij - E_ij )² / E_ij ]  |  Odds_Ratio (OR) = ( a * d ) / ( b * c )</w:t>
+        <w:br/>
+      </w:r>
+      <w:r>
+        <w:rPr>
+          <w:b/>
+          <w:i w:val="0"/>
+          <w:color w:val="1B5E20"/>
           <w:sz w:val="15"/>
         </w:rPr>
-        <w:t>χ² = Σ [ (O - E)² / E ] ; E_ij = (R_i * C_j) / N ; OR = (a * d) / (b * c)</w:t>
+        <w:t>Persamaan Substitusi:</w:t>
+        <w:br/>
+      </w:r>
+      <w:r>
+        <w:rPr>
+          <w:rFonts w:ascii="Consolas" w:hAnsi="Consolas"/>
+          <w:b w:val="0"/>
+          <w:i w:val="0"/>
+          <w:color w:val="222222"/>
+          <w:sz w:val="14"/>
+        </w:rPr>
+        <w:t>Konsentrasi_Morowali_Konawe = ( 8.750 MW / 9.825 MW ) * 100% = 89,06% Daya Terkunci</w:t>
       </w:r>
       <w:r>
         <w:rPr>
@@ -3108,12 +3218,13 @@
           <w:color w:val="555555"/>
           <w:sz w:val="14"/>
         </w:rPr>
-        <w:t xml:space="preserve"> | Ket: O: observasi aktual, E: frekuensi harapan, OR: kelipatan rasio risiko kelompok perlakuan</w:t>
+        <w:br/>
+        <w:t>Ket: Hasil pengujian statistik tabulasi silang (Chi-Square &amp; Odds Ratio) dirinci secara komprehensif pada Tabel 1.3.</w:t>
       </w:r>
     </w:p>
     <w:p>
       <w:pPr>
-        <w:spacing w:before="80" w:after="30"/>
+        <w:spacing w:before="70" w:after="20"/>
         <w:pBdr>
           <w:bottom w:val="single" w:sz="4" w:space="1" w:color="2E7D32"/>
         </w:pBdr>
@@ -3123,7 +3234,7 @@
           <w:b/>
           <w:i w:val="0"/>
           <w:color w:val="1B5E20"/>
-          <w:sz w:val="19"/>
+          <w:sz w:val="18"/>
         </w:rPr>
         <w:t>1.3 Tren Pertumbuhan Izin Tambang Baru &amp; Uji Signifikansi Statistik</w:t>
       </w:r>
@@ -3140,7 +3251,7 @@
           <w:color w:val="222222"/>
           <w:sz w:val="17"/>
         </w:rPr>
-        <w:t xml:space="preserve">Data Minerbaone mencatat penerbitan </w:t>
+        <w:t xml:space="preserve">Pangkalan data Minerbaone mencatat penerbitan </w:t>
       </w:r>
       <w:r>
         <w:rPr>
@@ -3167,7 +3278,7 @@
           <w:color w:val="222222"/>
           <w:sz w:val="17"/>
         </w:rPr>
-        <w:t>819,452 Hektar</w:t>
+        <w:t>819.452 Hektar</w:t>
       </w:r>
       <w:r>
         <w:rPr>
@@ -3176,7 +3287,7 @@
           <w:color w:val="222222"/>
           <w:sz w:val="17"/>
         </w:rPr>
-        <w:t xml:space="preserve">. Terjadi lonjakan sebesar </w:t>
+        <w:t xml:space="preserve">, dengan lonjakan penerbitan mencapai </w:t>
       </w:r>
       <w:r>
         <w:rPr>
@@ -3194,12 +3305,79 @@
           <w:color w:val="222222"/>
           <w:sz w:val="17"/>
         </w:rPr>
-        <w:t>. Uji inferensial Chi-Square membuktikan peningkatan frekuensi dan luas konsesi izin berkorelasi positif sangat kuat terhadap eskalasi deforestasi alam dan komoditas (p &lt; 0.0001).</w:t>
+        <w:t>. Uji inferensial Chi-Square membuktikan laju perizinan berhubungan positif signifikan dengan deforestasi alam dan komoditas.</w:t>
       </w:r>
     </w:p>
     <w:p>
       <w:pPr>
-        <w:spacing w:before="80" w:after="30"/>
+        <w:spacing w:before="30" w:after="40" w:line="252" w:lineRule="auto"/>
+        <w:ind w:left="100"/>
+        <w:shd w:val="clear" w:color="auto" w:fill="EDF7EE"/>
+        <w:pBdr>
+          <w:left w:val="single" w:sz="12" w:space="4" w:color="2E7D32"/>
+        </w:pBdr>
+      </w:pPr>
+      <w:r>
+        <w:rPr>
+          <w:b/>
+          <w:i w:val="0"/>
+          <w:color w:val="1B5E20"/>
+          <w:sz w:val="15"/>
+        </w:rPr>
+        <w:t>Formulasi Matematis (Laju Pertumbuhan Izin &amp; Alih Fungsi Ruang):</w:t>
+        <w:br/>
+      </w:r>
+      <w:r>
+        <w:rPr>
+          <w:rFonts w:ascii="Consolas" w:hAnsi="Consolas"/>
+          <w:b w:val="0"/>
+          <w:i w:val="0"/>
+          <w:color w:val="104010"/>
+          <w:sz w:val="14"/>
+        </w:rPr>
+        <w:t>Pertumbuhan_Izin (%) = [ ( IUP_t - IUP_{t-1} ) / IUP_{t-1} ] * 100</w:t>
+        <w:br/>
+        <w:t>Laju_Alih_Ruang_Harian = Luas_Konsesi_Total / 3.650 Hari</w:t>
+        <w:br/>
+        <w:t>χ² = Σ [ ( O - E )² / E ]  |  Odds_Ratio (OR) = ( a * d ) / ( b * c )</w:t>
+        <w:br/>
+      </w:r>
+      <w:r>
+        <w:rPr>
+          <w:b/>
+          <w:i w:val="0"/>
+          <w:color w:val="1B5E20"/>
+          <w:sz w:val="15"/>
+        </w:rPr>
+        <w:t>Persamaan Substitusi:</w:t>
+        <w:br/>
+      </w:r>
+      <w:r>
+        <w:rPr>
+          <w:rFonts w:ascii="Consolas" w:hAnsi="Consolas"/>
+          <w:b w:val="0"/>
+          <w:i w:val="0"/>
+          <w:color w:val="222222"/>
+          <w:sz w:val="14"/>
+        </w:rPr>
+        <w:t>Lonjakan_IUP_2022_2024 = [ (194 izin - 56 izin) / 56 izin ] * 100% = +246,43%</w:t>
+        <w:br/>
+        <w:t>Laju_Alih_Ruang = 819.452,54 Ha / 3.650 Hari = 224,51 Hektar/Hari (Setara 314 Lapangan Bola/Hari)</w:t>
+      </w:r>
+      <w:r>
+        <w:rPr>
+          <w:b w:val="0"/>
+          <w:i/>
+          <w:color w:val="555555"/>
+          <w:sz w:val="14"/>
+        </w:rPr>
+        <w:br/>
+        <w:t>Ket: Hasil pengujian statistik tabulasi silang (Chi-Square &amp; Odds Ratio) dirinci secara komprehensif pada Tabel 1.3.</w:t>
+      </w:r>
+    </w:p>
+    <w:p>
+      <w:pPr>
+        <w:spacing w:before="70" w:after="20"/>
         <w:pBdr>
           <w:bottom w:val="single" w:sz="4" w:space="1" w:color="2E7D32"/>
         </w:pBdr>
@@ -3209,7 +3387,7 @@
           <w:b/>
           <w:i w:val="0"/>
           <w:color w:val="1B5E20"/>
-          <w:sz w:val="19"/>
+          <w:sz w:val="18"/>
         </w:rPr>
         <w:t>1.4 Analisis Realisasi Investasi PMDN dan Dampak Terhadap Tutupan Hutan</w:t>
       </w:r>
@@ -3253,7 +3431,7 @@
           <w:color w:val="222222"/>
           <w:sz w:val="17"/>
         </w:rPr>
-        <w:t>1,001,654 Hektar</w:t>
+        <w:t>1.001.654 Hektar</w:t>
       </w:r>
       <w:r>
         <w:rPr>
@@ -3262,7 +3440,7 @@
           <w:color w:val="222222"/>
           <w:sz w:val="17"/>
         </w:rPr>
-        <w:t xml:space="preserve"> kehilangan tutupan hutan komoditas (GFW). Pembedahan data GFW Driver Classification (2001–2025) membuktikan sektor komoditas ekstraktif menyumbang </w:t>
+        <w:t xml:space="preserve"> kehilangan tutupan hutan komoditas (GFW). Pembedahan data GFW Driver Classification (2001–2025) membuktikan sektor ekstraktif menyumbang </w:t>
       </w:r>
       <w:r>
         <w:rPr>
@@ -3271,7 +3449,7 @@
           <w:color w:val="222222"/>
           <w:sz w:val="17"/>
         </w:rPr>
-        <w:t>48.4% (1,890,659 Ha)</w:t>
+        <w:t>48,4% (1.890.659 Ha)</w:t>
       </w:r>
       <w:r>
         <w:rPr>
@@ -3280,30 +3458,79 @@
           <w:color w:val="222222"/>
           <w:sz w:val="17"/>
         </w:rPr>
-        <w:t xml:space="preserve"> dari 3,904,079 Ha kehilangan hutan primer Sulawesi (emisi: 1,28 Miliar Mg CO2), sedangkan perladangan rakyat hanya 2.9% (115,404 Ha). Uji crosstab mengonfirmasi </w:t>
+        <w:t xml:space="preserve"> dari total 3.904.079 Ha kehilangan hutan primer Sulawesi (emisi: 1,28 Miliar Mg CO2), sedangkan perladangan rakyat hanya 2,9% (115.404 Ha).</w:t>
+      </w:r>
+    </w:p>
+    <w:p>
+      <w:pPr>
+        <w:spacing w:before="30" w:after="40" w:line="252" w:lineRule="auto"/>
+        <w:ind w:left="100"/>
+        <w:shd w:val="clear" w:color="auto" w:fill="EDF7EE"/>
+        <w:pBdr>
+          <w:left w:val="single" w:sz="12" w:space="4" w:color="2E7D32"/>
+        </w:pBdr>
+      </w:pPr>
+      <w:r>
+        <w:rPr>
+          <w:b/>
+          <w:i w:val="0"/>
+          <w:color w:val="1B5E20"/>
+          <w:sz w:val="15"/>
+        </w:rPr>
+        <w:t>Formulasi Matematis (Konsentrasi Modal PMDN &amp; Atribusi Deforestasi Komoditas):</w:t>
+        <w:br/>
+      </w:r>
+      <w:r>
+        <w:rPr>
+          <w:rFonts w:ascii="Consolas" w:hAnsi="Consolas"/>
+          <w:b w:val="0"/>
+          <w:i w:val="0"/>
+          <w:color w:val="104010"/>
+          <w:sz w:val="14"/>
+        </w:rPr>
+        <w:t>Konsentrasi_PMDN (%) = ( PMDN_Sentra / Total_PMDN ) * 100</w:t>
+        <w:br/>
+        <w:t>Rasio_Kerusakan = Deforestasi_Komoditas / Deforestasi_Pertanian_Rakyat</w:t>
+        <w:br/>
+        <w:t>χ² = Σ [ ( O - E )² / E ]  |  Odds_Ratio (OR) = ( a * d ) / ( b * c )</w:t>
+        <w:br/>
       </w:r>
       <w:r>
         <w:rPr>
           <w:b/>
           <w:i w:val="0"/>
+          <w:color w:val="1B5E20"/>
+          <w:sz w:val="15"/>
+        </w:rPr>
+        <w:t>Persamaan Substitusi:</w:t>
+        <w:br/>
+      </w:r>
+      <w:r>
+        <w:rPr>
+          <w:rFonts w:ascii="Consolas" w:hAnsi="Consolas"/>
+          <w:b w:val="0"/>
+          <w:i w:val="0"/>
           <w:color w:val="222222"/>
-          <w:sz w:val="17"/>
+          <w:sz w:val="14"/>
         </w:rPr>
-        <w:t>Efek Jeda Waktu (Time-Lagging Effect)</w:t>
+        <w:t>Konsentrasi_PMDN = ( Rp194,89 Triliun / Rp218,98 Triliun ) * 100% = 89,00% Tertumpuk di Sulteng, Sultra, Sulsel</w:t>
+        <w:br/>
+        <w:t>Rasio_Kerusakan = 1.001.654 Ha (Tambang/Sawit) / 55.905 Ha (Pertanian Rakyat) = 17,92 Kali Lipat Lebih Masif</w:t>
       </w:r>
       <w:r>
         <w:rPr>
           <w:b w:val="0"/>
-          <w:i w:val="0"/>
-          <w:color w:val="222222"/>
-          <w:sz w:val="17"/>
+          <w:i/>
+          <w:color w:val="555555"/>
+          <w:sz w:val="14"/>
         </w:rPr>
-        <w:t>: modal yang masuk hari ini tertahan birokrasi dan baru berdampak pada deforestasi fisik 1 hingga 2 tahun berikutnya.</w:t>
+        <w:br/>
+        <w:t>Ket: Hasil pengujian statistik tabulasi silang (Chi-Square &amp; Odds Ratio) dirinci secara komprehensif pada Tabel 1.3.</w:t>
       </w:r>
     </w:p>
     <w:p>
       <w:pPr>
-        <w:spacing w:before="50" w:after="20"/>
+        <w:spacing w:before="40" w:after="20"/>
       </w:pPr>
       <w:r>
         <w:rPr>
@@ -3338,10 +3565,10 @@
             <w:tcW w:type="dxa" w:w="2381"/>
             <w:shd w:val="clear" w:color="auto" w:fill="2E7D32"/>
             <w:tcMar>
-              <w:top w:w="30" w:type="dxa"/>
-              <w:bottom w:w="30" w:type="dxa"/>
-              <w:left w:w="50" w:type="dxa"/>
-              <w:right w:w="50" w:type="dxa"/>
+              <w:top w:w="18" w:type="dxa"/>
+              <w:bottom w:w="18" w:type="dxa"/>
+              <w:left w:w="40" w:type="dxa"/>
+              <w:right w:w="40" w:type="dxa"/>
             </w:tcMar>
             <w:tcBorders>
               <w:top w:val="single" w:sz="4" w:color="D8D8D8" w:space="0"/>
@@ -3371,10 +3598,10 @@
             <w:tcW w:type="dxa" w:w="2494"/>
             <w:shd w:val="clear" w:color="auto" w:fill="2E7D32"/>
             <w:tcMar>
-              <w:top w:w="30" w:type="dxa"/>
-              <w:bottom w:w="30" w:type="dxa"/>
-              <w:left w:w="50" w:type="dxa"/>
-              <w:right w:w="50" w:type="dxa"/>
+              <w:top w:w="18" w:type="dxa"/>
+              <w:bottom w:w="18" w:type="dxa"/>
+              <w:left w:w="40" w:type="dxa"/>
+              <w:right w:w="40" w:type="dxa"/>
             </w:tcMar>
             <w:tcBorders>
               <w:top w:val="single" w:sz="4" w:color="D8D8D8" w:space="0"/>
@@ -3404,10 +3631,10 @@
             <w:tcW w:type="dxa" w:w="1134"/>
             <w:shd w:val="clear" w:color="auto" w:fill="2E7D32"/>
             <w:tcMar>
-              <w:top w:w="30" w:type="dxa"/>
-              <w:bottom w:w="30" w:type="dxa"/>
-              <w:left w:w="50" w:type="dxa"/>
-              <w:right w:w="50" w:type="dxa"/>
+              <w:top w:w="18" w:type="dxa"/>
+              <w:bottom w:w="18" w:type="dxa"/>
+              <w:left w:w="40" w:type="dxa"/>
+              <w:right w:w="40" w:type="dxa"/>
             </w:tcMar>
             <w:tcBorders>
               <w:top w:val="single" w:sz="4" w:color="D8D8D8" w:space="0"/>
@@ -3437,10 +3664,10 @@
             <w:tcW w:type="dxa" w:w="1134"/>
             <w:shd w:val="clear" w:color="auto" w:fill="2E7D32"/>
             <w:tcMar>
-              <w:top w:w="30" w:type="dxa"/>
-              <w:bottom w:w="30" w:type="dxa"/>
-              <w:left w:w="50" w:type="dxa"/>
-              <w:right w:w="50" w:type="dxa"/>
+              <w:top w:w="18" w:type="dxa"/>
+              <w:bottom w:w="18" w:type="dxa"/>
+              <w:left w:w="40" w:type="dxa"/>
+              <w:right w:w="40" w:type="dxa"/>
             </w:tcMar>
             <w:tcBorders>
               <w:top w:val="single" w:sz="4" w:color="D8D8D8" w:space="0"/>
@@ -3470,10 +3697,10 @@
             <w:tcW w:type="dxa" w:w="1020"/>
             <w:shd w:val="clear" w:color="auto" w:fill="2E7D32"/>
             <w:tcMar>
-              <w:top w:w="30" w:type="dxa"/>
-              <w:bottom w:w="30" w:type="dxa"/>
-              <w:left w:w="50" w:type="dxa"/>
-              <w:right w:w="50" w:type="dxa"/>
+              <w:top w:w="18" w:type="dxa"/>
+              <w:bottom w:w="18" w:type="dxa"/>
+              <w:left w:w="40" w:type="dxa"/>
+              <w:right w:w="40" w:type="dxa"/>
             </w:tcMar>
             <w:tcBorders>
               <w:top w:val="single" w:sz="4" w:color="D8D8D8" w:space="0"/>
@@ -3503,10 +3730,10 @@
             <w:tcW w:type="dxa" w:w="567"/>
             <w:shd w:val="clear" w:color="auto" w:fill="2E7D32"/>
             <w:tcMar>
-              <w:top w:w="30" w:type="dxa"/>
-              <w:bottom w:w="30" w:type="dxa"/>
-              <w:left w:w="50" w:type="dxa"/>
-              <w:right w:w="50" w:type="dxa"/>
+              <w:top w:w="18" w:type="dxa"/>
+              <w:bottom w:w="18" w:type="dxa"/>
+              <w:left w:w="40" w:type="dxa"/>
+              <w:right w:w="40" w:type="dxa"/>
             </w:tcMar>
             <w:tcBorders>
               <w:top w:val="single" w:sz="4" w:color="D8D8D8" w:space="0"/>
@@ -3536,10 +3763,10 @@
             <w:tcW w:type="dxa" w:w="1814"/>
             <w:shd w:val="clear" w:color="auto" w:fill="2E7D32"/>
             <w:tcMar>
-              <w:top w:w="30" w:type="dxa"/>
-              <w:bottom w:w="30" w:type="dxa"/>
-              <w:left w:w="50" w:type="dxa"/>
-              <w:right w:w="50" w:type="dxa"/>
+              <w:top w:w="18" w:type="dxa"/>
+              <w:bottom w:w="18" w:type="dxa"/>
+              <w:left w:w="40" w:type="dxa"/>
+              <w:right w:w="40" w:type="dxa"/>
             </w:tcMar>
             <w:tcBorders>
               <w:top w:val="single" w:sz="4" w:color="D8D8D8" w:space="0"/>
@@ -3571,10 +3798,10 @@
             <w:tcW w:type="dxa" w:w="2381"/>
             <w:shd w:val="clear" w:color="auto" w:fill="FFFFFF"/>
             <w:tcMar>
-              <w:top w:w="20" w:type="dxa"/>
-              <w:bottom w:w="20" w:type="dxa"/>
-              <w:left w:w="50" w:type="dxa"/>
-              <w:right w:w="50" w:type="dxa"/>
+              <w:top w:w="16" w:type="dxa"/>
+              <w:bottom w:w="16" w:type="dxa"/>
+              <w:left w:w="40" w:type="dxa"/>
+              <w:right w:w="40" w:type="dxa"/>
             </w:tcMar>
             <w:tcBorders>
               <w:top w:val="single" w:sz="4" w:color="D8D8D8" w:space="0"/>
@@ -3604,10 +3831,10 @@
             <w:tcW w:type="dxa" w:w="2494"/>
             <w:shd w:val="clear" w:color="auto" w:fill="FFFFFF"/>
             <w:tcMar>
-              <w:top w:w="20" w:type="dxa"/>
-              <w:bottom w:w="20" w:type="dxa"/>
-              <w:left w:w="50" w:type="dxa"/>
-              <w:right w:w="50" w:type="dxa"/>
+              <w:top w:w="16" w:type="dxa"/>
+              <w:bottom w:w="16" w:type="dxa"/>
+              <w:left w:w="40" w:type="dxa"/>
+              <w:right w:w="40" w:type="dxa"/>
             </w:tcMar>
             <w:tcBorders>
               <w:top w:val="single" w:sz="4" w:color="D8D8D8" w:space="0"/>
@@ -3637,10 +3864,10 @@
             <w:tcW w:type="dxa" w:w="1134"/>
             <w:shd w:val="clear" w:color="auto" w:fill="FFFFFF"/>
             <w:tcMar>
-              <w:top w:w="20" w:type="dxa"/>
-              <w:bottom w:w="20" w:type="dxa"/>
-              <w:left w:w="50" w:type="dxa"/>
-              <w:right w:w="50" w:type="dxa"/>
+              <w:top w:w="16" w:type="dxa"/>
+              <w:bottom w:w="16" w:type="dxa"/>
+              <w:left w:w="40" w:type="dxa"/>
+              <w:right w:w="40" w:type="dxa"/>
             </w:tcMar>
             <w:tcBorders>
               <w:top w:val="single" w:sz="4" w:color="D8D8D8" w:space="0"/>
@@ -3670,10 +3897,10 @@
             <w:tcW w:type="dxa" w:w="1134"/>
             <w:shd w:val="clear" w:color="auto" w:fill="FFFFFF"/>
             <w:tcMar>
-              <w:top w:w="20" w:type="dxa"/>
-              <w:bottom w:w="20" w:type="dxa"/>
-              <w:left w:w="50" w:type="dxa"/>
-              <w:right w:w="50" w:type="dxa"/>
+              <w:top w:w="16" w:type="dxa"/>
+              <w:bottom w:w="16" w:type="dxa"/>
+              <w:left w:w="40" w:type="dxa"/>
+              <w:right w:w="40" w:type="dxa"/>
             </w:tcMar>
             <w:tcBorders>
               <w:top w:val="single" w:sz="4" w:color="D8D8D8" w:space="0"/>
@@ -3703,10 +3930,10 @@
             <w:tcW w:type="dxa" w:w="1020"/>
             <w:shd w:val="clear" w:color="auto" w:fill="FFFFFF"/>
             <w:tcMar>
-              <w:top w:w="20" w:type="dxa"/>
-              <w:bottom w:w="20" w:type="dxa"/>
-              <w:left w:w="50" w:type="dxa"/>
-              <w:right w:w="50" w:type="dxa"/>
+              <w:top w:w="16" w:type="dxa"/>
+              <w:bottom w:w="16" w:type="dxa"/>
+              <w:left w:w="40" w:type="dxa"/>
+              <w:right w:w="40" w:type="dxa"/>
             </w:tcMar>
             <w:tcBorders>
               <w:top w:val="single" w:sz="4" w:color="D8D8D8" w:space="0"/>
@@ -3736,10 +3963,10 @@
             <w:tcW w:type="dxa" w:w="567"/>
             <w:shd w:val="clear" w:color="auto" w:fill="FFFFFF"/>
             <w:tcMar>
-              <w:top w:w="20" w:type="dxa"/>
-              <w:bottom w:w="20" w:type="dxa"/>
-              <w:left w:w="50" w:type="dxa"/>
-              <w:right w:w="50" w:type="dxa"/>
+              <w:top w:w="16" w:type="dxa"/>
+              <w:bottom w:w="16" w:type="dxa"/>
+              <w:left w:w="40" w:type="dxa"/>
+              <w:right w:w="40" w:type="dxa"/>
             </w:tcMar>
             <w:tcBorders>
               <w:top w:val="single" w:sz="4" w:color="D8D8D8" w:space="0"/>
@@ -3769,10 +3996,10 @@
             <w:tcW w:type="dxa" w:w="1814"/>
             <w:shd w:val="clear" w:color="auto" w:fill="FFFFFF"/>
             <w:tcMar>
-              <w:top w:w="20" w:type="dxa"/>
-              <w:bottom w:w="20" w:type="dxa"/>
-              <w:left w:w="50" w:type="dxa"/>
-              <w:right w:w="50" w:type="dxa"/>
+              <w:top w:w="16" w:type="dxa"/>
+              <w:bottom w:w="16" w:type="dxa"/>
+              <w:left w:w="40" w:type="dxa"/>
+              <w:right w:w="40" w:type="dxa"/>
             </w:tcMar>
             <w:tcBorders>
               <w:top w:val="single" w:sz="4" w:color="D8D8D8" w:space="0"/>
@@ -3788,7 +4015,7 @@
             </w:pPr>
             <w:r>
               <w:rPr>
-                <w:b w:val="0"/>
+                <w:b/>
                 <w:i w:val="0"/>
                 <w:color w:val="222222"/>
                 <w:sz w:val="14"/>
@@ -3804,10 +4031,10 @@
             <w:tcW w:type="dxa" w:w="2381"/>
             <w:shd w:val="clear" w:color="auto" w:fill="F9FBF9"/>
             <w:tcMar>
-              <w:top w:w="20" w:type="dxa"/>
-              <w:bottom w:w="20" w:type="dxa"/>
-              <w:left w:w="50" w:type="dxa"/>
-              <w:right w:w="50" w:type="dxa"/>
+              <w:top w:w="16" w:type="dxa"/>
+              <w:bottom w:w="16" w:type="dxa"/>
+              <w:left w:w="40" w:type="dxa"/>
+              <w:right w:w="40" w:type="dxa"/>
             </w:tcMar>
             <w:tcBorders>
               <w:top w:val="single" w:sz="4" w:color="D8D8D8" w:space="0"/>
@@ -3837,10 +4064,10 @@
             <w:tcW w:type="dxa" w:w="2494"/>
             <w:shd w:val="clear" w:color="auto" w:fill="F9FBF9"/>
             <w:tcMar>
-              <w:top w:w="20" w:type="dxa"/>
-              <w:bottom w:w="20" w:type="dxa"/>
-              <w:left w:w="50" w:type="dxa"/>
-              <w:right w:w="50" w:type="dxa"/>
+              <w:top w:w="16" w:type="dxa"/>
+              <w:bottom w:w="16" w:type="dxa"/>
+              <w:left w:w="40" w:type="dxa"/>
+              <w:right w:w="40" w:type="dxa"/>
             </w:tcMar>
             <w:tcBorders>
               <w:top w:val="single" w:sz="4" w:color="D8D8D8" w:space="0"/>
@@ -3870,10 +4097,10 @@
             <w:tcW w:type="dxa" w:w="1134"/>
             <w:shd w:val="clear" w:color="auto" w:fill="F9FBF9"/>
             <w:tcMar>
-              <w:top w:w="20" w:type="dxa"/>
-              <w:bottom w:w="20" w:type="dxa"/>
-              <w:left w:w="50" w:type="dxa"/>
-              <w:right w:w="50" w:type="dxa"/>
+              <w:top w:w="16" w:type="dxa"/>
+              <w:bottom w:w="16" w:type="dxa"/>
+              <w:left w:w="40" w:type="dxa"/>
+              <w:right w:w="40" w:type="dxa"/>
             </w:tcMar>
             <w:tcBorders>
               <w:top w:val="single" w:sz="4" w:color="D8D8D8" w:space="0"/>
@@ -3903,10 +4130,10 @@
             <w:tcW w:type="dxa" w:w="1134"/>
             <w:shd w:val="clear" w:color="auto" w:fill="F9FBF9"/>
             <w:tcMar>
-              <w:top w:w="20" w:type="dxa"/>
-              <w:bottom w:w="20" w:type="dxa"/>
-              <w:left w:w="50" w:type="dxa"/>
-              <w:right w:w="50" w:type="dxa"/>
+              <w:top w:w="16" w:type="dxa"/>
+              <w:bottom w:w="16" w:type="dxa"/>
+              <w:left w:w="40" w:type="dxa"/>
+              <w:right w:w="40" w:type="dxa"/>
             </w:tcMar>
             <w:tcBorders>
               <w:top w:val="single" w:sz="4" w:color="D8D8D8" w:space="0"/>
@@ -3936,10 +4163,10 @@
             <w:tcW w:type="dxa" w:w="1020"/>
             <w:shd w:val="clear" w:color="auto" w:fill="F9FBF9"/>
             <w:tcMar>
-              <w:top w:w="20" w:type="dxa"/>
-              <w:bottom w:w="20" w:type="dxa"/>
-              <w:left w:w="50" w:type="dxa"/>
-              <w:right w:w="50" w:type="dxa"/>
+              <w:top w:w="16" w:type="dxa"/>
+              <w:bottom w:w="16" w:type="dxa"/>
+              <w:left w:w="40" w:type="dxa"/>
+              <w:right w:w="40" w:type="dxa"/>
             </w:tcMar>
             <w:tcBorders>
               <w:top w:val="single" w:sz="4" w:color="D8D8D8" w:space="0"/>
@@ -3969,10 +4196,10 @@
             <w:tcW w:type="dxa" w:w="567"/>
             <w:shd w:val="clear" w:color="auto" w:fill="F9FBF9"/>
             <w:tcMar>
-              <w:top w:w="20" w:type="dxa"/>
-              <w:bottom w:w="20" w:type="dxa"/>
-              <w:left w:w="50" w:type="dxa"/>
-              <w:right w:w="50" w:type="dxa"/>
+              <w:top w:w="16" w:type="dxa"/>
+              <w:bottom w:w="16" w:type="dxa"/>
+              <w:left w:w="40" w:type="dxa"/>
+              <w:right w:w="40" w:type="dxa"/>
             </w:tcMar>
             <w:tcBorders>
               <w:top w:val="single" w:sz="4" w:color="D8D8D8" w:space="0"/>
@@ -4002,10 +4229,10 @@
             <w:tcW w:type="dxa" w:w="1814"/>
             <w:shd w:val="clear" w:color="auto" w:fill="F9FBF9"/>
             <w:tcMar>
-              <w:top w:w="20" w:type="dxa"/>
-              <w:bottom w:w="20" w:type="dxa"/>
-              <w:left w:w="50" w:type="dxa"/>
-              <w:right w:w="50" w:type="dxa"/>
+              <w:top w:w="16" w:type="dxa"/>
+              <w:bottom w:w="16" w:type="dxa"/>
+              <w:left w:w="40" w:type="dxa"/>
+              <w:right w:w="40" w:type="dxa"/>
             </w:tcMar>
             <w:tcBorders>
               <w:top w:val="single" w:sz="4" w:color="D8D8D8" w:space="0"/>
@@ -4021,7 +4248,7 @@
             </w:pPr>
             <w:r>
               <w:rPr>
-                <w:b w:val="0"/>
+                <w:b/>
                 <w:i w:val="0"/>
                 <w:color w:val="222222"/>
                 <w:sz w:val="14"/>
@@ -4037,10 +4264,10 @@
             <w:tcW w:type="dxa" w:w="2381"/>
             <w:shd w:val="clear" w:color="auto" w:fill="FFFFFF"/>
             <w:tcMar>
-              <w:top w:w="20" w:type="dxa"/>
-              <w:bottom w:w="20" w:type="dxa"/>
-              <w:left w:w="50" w:type="dxa"/>
-              <w:right w:w="50" w:type="dxa"/>
+              <w:top w:w="16" w:type="dxa"/>
+              <w:bottom w:w="16" w:type="dxa"/>
+              <w:left w:w="40" w:type="dxa"/>
+              <w:right w:w="40" w:type="dxa"/>
             </w:tcMar>
             <w:tcBorders>
               <w:top w:val="single" w:sz="4" w:color="D8D8D8" w:space="0"/>
@@ -4070,10 +4297,10 @@
             <w:tcW w:type="dxa" w:w="2494"/>
             <w:shd w:val="clear" w:color="auto" w:fill="FFFFFF"/>
             <w:tcMar>
-              <w:top w:w="20" w:type="dxa"/>
-              <w:bottom w:w="20" w:type="dxa"/>
-              <w:left w:w="50" w:type="dxa"/>
-              <w:right w:w="50" w:type="dxa"/>
+              <w:top w:w="16" w:type="dxa"/>
+              <w:bottom w:w="16" w:type="dxa"/>
+              <w:left w:w="40" w:type="dxa"/>
+              <w:right w:w="40" w:type="dxa"/>
             </w:tcMar>
             <w:tcBorders>
               <w:top w:val="single" w:sz="4" w:color="D8D8D8" w:space="0"/>
@@ -4103,10 +4330,10 @@
             <w:tcW w:type="dxa" w:w="1134"/>
             <w:shd w:val="clear" w:color="auto" w:fill="FFFFFF"/>
             <w:tcMar>
-              <w:top w:w="20" w:type="dxa"/>
-              <w:bottom w:w="20" w:type="dxa"/>
-              <w:left w:w="50" w:type="dxa"/>
-              <w:right w:w="50" w:type="dxa"/>
+              <w:top w:w="16" w:type="dxa"/>
+              <w:bottom w:w="16" w:type="dxa"/>
+              <w:left w:w="40" w:type="dxa"/>
+              <w:right w:w="40" w:type="dxa"/>
             </w:tcMar>
             <w:tcBorders>
               <w:top w:val="single" w:sz="4" w:color="D8D8D8" w:space="0"/>
@@ -4136,10 +4363,10 @@
             <w:tcW w:type="dxa" w:w="1134"/>
             <w:shd w:val="clear" w:color="auto" w:fill="FFFFFF"/>
             <w:tcMar>
-              <w:top w:w="20" w:type="dxa"/>
-              <w:bottom w:w="20" w:type="dxa"/>
-              <w:left w:w="50" w:type="dxa"/>
-              <w:right w:w="50" w:type="dxa"/>
+              <w:top w:w="16" w:type="dxa"/>
+              <w:bottom w:w="16" w:type="dxa"/>
+              <w:left w:w="40" w:type="dxa"/>
+              <w:right w:w="40" w:type="dxa"/>
             </w:tcMar>
             <w:tcBorders>
               <w:top w:val="single" w:sz="4" w:color="D8D8D8" w:space="0"/>
@@ -4169,10 +4396,10 @@
             <w:tcW w:type="dxa" w:w="1020"/>
             <w:shd w:val="clear" w:color="auto" w:fill="FFFFFF"/>
             <w:tcMar>
-              <w:top w:w="20" w:type="dxa"/>
-              <w:bottom w:w="20" w:type="dxa"/>
-              <w:left w:w="50" w:type="dxa"/>
-              <w:right w:w="50" w:type="dxa"/>
+              <w:top w:w="16" w:type="dxa"/>
+              <w:bottom w:w="16" w:type="dxa"/>
+              <w:left w:w="40" w:type="dxa"/>
+              <w:right w:w="40" w:type="dxa"/>
             </w:tcMar>
             <w:tcBorders>
               <w:top w:val="single" w:sz="4" w:color="D8D8D8" w:space="0"/>
@@ -4202,10 +4429,10 @@
             <w:tcW w:type="dxa" w:w="567"/>
             <w:shd w:val="clear" w:color="auto" w:fill="FFFFFF"/>
             <w:tcMar>
-              <w:top w:w="20" w:type="dxa"/>
-              <w:bottom w:w="20" w:type="dxa"/>
-              <w:left w:w="50" w:type="dxa"/>
-              <w:right w:w="50" w:type="dxa"/>
+              <w:top w:w="16" w:type="dxa"/>
+              <w:bottom w:w="16" w:type="dxa"/>
+              <w:left w:w="40" w:type="dxa"/>
+              <w:right w:w="40" w:type="dxa"/>
             </w:tcMar>
             <w:tcBorders>
               <w:top w:val="single" w:sz="4" w:color="D8D8D8" w:space="0"/>
@@ -4235,10 +4462,10 @@
             <w:tcW w:type="dxa" w:w="1814"/>
             <w:shd w:val="clear" w:color="auto" w:fill="FFFFFF"/>
             <w:tcMar>
-              <w:top w:w="20" w:type="dxa"/>
-              <w:bottom w:w="20" w:type="dxa"/>
-              <w:left w:w="50" w:type="dxa"/>
-              <w:right w:w="50" w:type="dxa"/>
+              <w:top w:w="16" w:type="dxa"/>
+              <w:bottom w:w="16" w:type="dxa"/>
+              <w:left w:w="40" w:type="dxa"/>
+              <w:right w:w="40" w:type="dxa"/>
             </w:tcMar>
             <w:tcBorders>
               <w:top w:val="single" w:sz="4" w:color="D8D8D8" w:space="0"/>
@@ -4254,7 +4481,7 @@
             </w:pPr>
             <w:r>
               <w:rPr>
-                <w:b w:val="0"/>
+                <w:b/>
                 <w:i w:val="0"/>
                 <w:color w:val="222222"/>
                 <w:sz w:val="14"/>
@@ -4270,10 +4497,10 @@
             <w:tcW w:type="dxa" w:w="2381"/>
             <w:shd w:val="clear" w:color="auto" w:fill="F9FBF9"/>
             <w:tcMar>
-              <w:top w:w="20" w:type="dxa"/>
-              <w:bottom w:w="20" w:type="dxa"/>
-              <w:left w:w="50" w:type="dxa"/>
-              <w:right w:w="50" w:type="dxa"/>
+              <w:top w:w="16" w:type="dxa"/>
+              <w:bottom w:w="16" w:type="dxa"/>
+              <w:left w:w="40" w:type="dxa"/>
+              <w:right w:w="40" w:type="dxa"/>
             </w:tcMar>
             <w:tcBorders>
               <w:top w:val="single" w:sz="4" w:color="D8D8D8" w:space="0"/>
@@ -4303,10 +4530,10 @@
             <w:tcW w:type="dxa" w:w="2494"/>
             <w:shd w:val="clear" w:color="auto" w:fill="F9FBF9"/>
             <w:tcMar>
-              <w:top w:w="20" w:type="dxa"/>
-              <w:bottom w:w="20" w:type="dxa"/>
-              <w:left w:w="50" w:type="dxa"/>
-              <w:right w:w="50" w:type="dxa"/>
+              <w:top w:w="16" w:type="dxa"/>
+              <w:bottom w:w="16" w:type="dxa"/>
+              <w:left w:w="40" w:type="dxa"/>
+              <w:right w:w="40" w:type="dxa"/>
             </w:tcMar>
             <w:tcBorders>
               <w:top w:val="single" w:sz="4" w:color="D8D8D8" w:space="0"/>
@@ -4336,10 +4563,10 @@
             <w:tcW w:type="dxa" w:w="1134"/>
             <w:shd w:val="clear" w:color="auto" w:fill="F9FBF9"/>
             <w:tcMar>
-              <w:top w:w="20" w:type="dxa"/>
-              <w:bottom w:w="20" w:type="dxa"/>
-              <w:left w:w="50" w:type="dxa"/>
-              <w:right w:w="50" w:type="dxa"/>
+              <w:top w:w="16" w:type="dxa"/>
+              <w:bottom w:w="16" w:type="dxa"/>
+              <w:left w:w="40" w:type="dxa"/>
+              <w:right w:w="40" w:type="dxa"/>
             </w:tcMar>
             <w:tcBorders>
               <w:top w:val="single" w:sz="4" w:color="D8D8D8" w:space="0"/>
@@ -4369,10 +4596,10 @@
             <w:tcW w:type="dxa" w:w="1134"/>
             <w:shd w:val="clear" w:color="auto" w:fill="F9FBF9"/>
             <w:tcMar>
-              <w:top w:w="20" w:type="dxa"/>
-              <w:bottom w:w="20" w:type="dxa"/>
-              <w:left w:w="50" w:type="dxa"/>
-              <w:right w:w="50" w:type="dxa"/>
+              <w:top w:w="16" w:type="dxa"/>
+              <w:bottom w:w="16" w:type="dxa"/>
+              <w:left w:w="40" w:type="dxa"/>
+              <w:right w:w="40" w:type="dxa"/>
             </w:tcMar>
             <w:tcBorders>
               <w:top w:val="single" w:sz="4" w:color="D8D8D8" w:space="0"/>
@@ -4402,10 +4629,10 @@
             <w:tcW w:type="dxa" w:w="1020"/>
             <w:shd w:val="clear" w:color="auto" w:fill="F9FBF9"/>
             <w:tcMar>
-              <w:top w:w="20" w:type="dxa"/>
-              <w:bottom w:w="20" w:type="dxa"/>
-              <w:left w:w="50" w:type="dxa"/>
-              <w:right w:w="50" w:type="dxa"/>
+              <w:top w:w="16" w:type="dxa"/>
+              <w:bottom w:w="16" w:type="dxa"/>
+              <w:left w:w="40" w:type="dxa"/>
+              <w:right w:w="40" w:type="dxa"/>
             </w:tcMar>
             <w:tcBorders>
               <w:top w:val="single" w:sz="4" w:color="D8D8D8" w:space="0"/>
@@ -4435,10 +4662,10 @@
             <w:tcW w:type="dxa" w:w="567"/>
             <w:shd w:val="clear" w:color="auto" w:fill="F9FBF9"/>
             <w:tcMar>
-              <w:top w:w="20" w:type="dxa"/>
-              <w:bottom w:w="20" w:type="dxa"/>
-              <w:left w:w="50" w:type="dxa"/>
-              <w:right w:w="50" w:type="dxa"/>
+              <w:top w:w="16" w:type="dxa"/>
+              <w:bottom w:w="16" w:type="dxa"/>
+              <w:left w:w="40" w:type="dxa"/>
+              <w:right w:w="40" w:type="dxa"/>
             </w:tcMar>
             <w:tcBorders>
               <w:top w:val="single" w:sz="4" w:color="D8D8D8" w:space="0"/>
@@ -4468,10 +4695,10 @@
             <w:tcW w:type="dxa" w:w="1814"/>
             <w:shd w:val="clear" w:color="auto" w:fill="F9FBF9"/>
             <w:tcMar>
-              <w:top w:w="20" w:type="dxa"/>
-              <w:bottom w:w="20" w:type="dxa"/>
-              <w:left w:w="50" w:type="dxa"/>
-              <w:right w:w="50" w:type="dxa"/>
+              <w:top w:w="16" w:type="dxa"/>
+              <w:bottom w:w="16" w:type="dxa"/>
+              <w:left w:w="40" w:type="dxa"/>
+              <w:right w:w="40" w:type="dxa"/>
             </w:tcMar>
             <w:tcBorders>
               <w:top w:val="single" w:sz="4" w:color="D8D8D8" w:space="0"/>
@@ -4487,7 +4714,7 @@
             </w:pPr>
             <w:r>
               <w:rPr>
-                <w:b w:val="0"/>
+                <w:b/>
                 <w:i w:val="0"/>
                 <w:color w:val="222222"/>
                 <w:sz w:val="14"/>
@@ -4503,10 +4730,10 @@
             <w:tcW w:type="dxa" w:w="2381"/>
             <w:shd w:val="clear" w:color="auto" w:fill="FFFFFF"/>
             <w:tcMar>
-              <w:top w:w="20" w:type="dxa"/>
-              <w:bottom w:w="20" w:type="dxa"/>
-              <w:left w:w="50" w:type="dxa"/>
-              <w:right w:w="50" w:type="dxa"/>
+              <w:top w:w="16" w:type="dxa"/>
+              <w:bottom w:w="16" w:type="dxa"/>
+              <w:left w:w="40" w:type="dxa"/>
+              <w:right w:w="40" w:type="dxa"/>
             </w:tcMar>
             <w:tcBorders>
               <w:top w:val="single" w:sz="4" w:color="D8D8D8" w:space="0"/>
@@ -4536,10 +4763,10 @@
             <w:tcW w:type="dxa" w:w="2494"/>
             <w:shd w:val="clear" w:color="auto" w:fill="FFFFFF"/>
             <w:tcMar>
-              <w:top w:w="20" w:type="dxa"/>
-              <w:bottom w:w="20" w:type="dxa"/>
-              <w:left w:w="50" w:type="dxa"/>
-              <w:right w:w="50" w:type="dxa"/>
+              <w:top w:w="16" w:type="dxa"/>
+              <w:bottom w:w="16" w:type="dxa"/>
+              <w:left w:w="40" w:type="dxa"/>
+              <w:right w:w="40" w:type="dxa"/>
             </w:tcMar>
             <w:tcBorders>
               <w:top w:val="single" w:sz="4" w:color="D8D8D8" w:space="0"/>
@@ -4569,10 +4796,10 @@
             <w:tcW w:type="dxa" w:w="1134"/>
             <w:shd w:val="clear" w:color="auto" w:fill="FFFFFF"/>
             <w:tcMar>
-              <w:top w:w="20" w:type="dxa"/>
-              <w:bottom w:w="20" w:type="dxa"/>
-              <w:left w:w="50" w:type="dxa"/>
-              <w:right w:w="50" w:type="dxa"/>
+              <w:top w:w="16" w:type="dxa"/>
+              <w:bottom w:w="16" w:type="dxa"/>
+              <w:left w:w="40" w:type="dxa"/>
+              <w:right w:w="40" w:type="dxa"/>
             </w:tcMar>
             <w:tcBorders>
               <w:top w:val="single" w:sz="4" w:color="D8D8D8" w:space="0"/>
@@ -4602,10 +4829,10 @@
             <w:tcW w:type="dxa" w:w="1134"/>
             <w:shd w:val="clear" w:color="auto" w:fill="FFFFFF"/>
             <w:tcMar>
-              <w:top w:w="20" w:type="dxa"/>
-              <w:bottom w:w="20" w:type="dxa"/>
-              <w:left w:w="50" w:type="dxa"/>
-              <w:right w:w="50" w:type="dxa"/>
+              <w:top w:w="16" w:type="dxa"/>
+              <w:bottom w:w="16" w:type="dxa"/>
+              <w:left w:w="40" w:type="dxa"/>
+              <w:right w:w="40" w:type="dxa"/>
             </w:tcMar>
             <w:tcBorders>
               <w:top w:val="single" w:sz="4" w:color="D8D8D8" w:space="0"/>
@@ -4635,10 +4862,10 @@
             <w:tcW w:type="dxa" w:w="1020"/>
             <w:shd w:val="clear" w:color="auto" w:fill="FFFFFF"/>
             <w:tcMar>
-              <w:top w:w="20" w:type="dxa"/>
-              <w:bottom w:w="20" w:type="dxa"/>
-              <w:left w:w="50" w:type="dxa"/>
-              <w:right w:w="50" w:type="dxa"/>
+              <w:top w:w="16" w:type="dxa"/>
+              <w:bottom w:w="16" w:type="dxa"/>
+              <w:left w:w="40" w:type="dxa"/>
+              <w:right w:w="40" w:type="dxa"/>
             </w:tcMar>
             <w:tcBorders>
               <w:top w:val="single" w:sz="4" w:color="D8D8D8" w:space="0"/>
@@ -4668,10 +4895,10 @@
             <w:tcW w:type="dxa" w:w="567"/>
             <w:shd w:val="clear" w:color="auto" w:fill="FFFFFF"/>
             <w:tcMar>
-              <w:top w:w="20" w:type="dxa"/>
-              <w:bottom w:w="20" w:type="dxa"/>
-              <w:left w:w="50" w:type="dxa"/>
-              <w:right w:w="50" w:type="dxa"/>
+              <w:top w:w="16" w:type="dxa"/>
+              <w:bottom w:w="16" w:type="dxa"/>
+              <w:left w:w="40" w:type="dxa"/>
+              <w:right w:w="40" w:type="dxa"/>
             </w:tcMar>
             <w:tcBorders>
               <w:top w:val="single" w:sz="4" w:color="D8D8D8" w:space="0"/>
@@ -4701,10 +4928,10 @@
             <w:tcW w:type="dxa" w:w="1814"/>
             <w:shd w:val="clear" w:color="auto" w:fill="FFFFFF"/>
             <w:tcMar>
-              <w:top w:w="20" w:type="dxa"/>
-              <w:bottom w:w="20" w:type="dxa"/>
-              <w:left w:w="50" w:type="dxa"/>
-              <w:right w:w="50" w:type="dxa"/>
+              <w:top w:w="16" w:type="dxa"/>
+              <w:bottom w:w="16" w:type="dxa"/>
+              <w:left w:w="40" w:type="dxa"/>
+              <w:right w:w="40" w:type="dxa"/>
             </w:tcMar>
             <w:tcBorders>
               <w:top w:val="single" w:sz="4" w:color="D8D8D8" w:space="0"/>
@@ -4720,7 +4947,7 @@
             </w:pPr>
             <w:r>
               <w:rPr>
-                <w:b w:val="0"/>
+                <w:b/>
                 <w:i w:val="0"/>
                 <w:color w:val="222222"/>
                 <w:sz w:val="14"/>
@@ -4733,7 +4960,7 @@
     </w:tbl>
     <w:p>
       <w:pPr>
-        <w:spacing w:before="80" w:after="30"/>
+        <w:spacing w:before="70" w:after="20"/>
         <w:pBdr>
           <w:bottom w:val="single" w:sz="4" w:space="1" w:color="2E7D32"/>
         </w:pBdr>
@@ -4743,7 +4970,7 @@
           <w:b/>
           <w:i w:val="0"/>
           <w:color w:val="1B5E20"/>
-          <w:sz w:val="19"/>
+          <w:sz w:val="18"/>
         </w:rPr>
         <w:t>1.5 Pelabuhan Ekspor &amp; Peta Jalur Distribusi Logistik Nikel Sulawesi</w:t>
       </w:r>
@@ -4765,7 +4992,7 @@
     </w:p>
     <w:p>
       <w:pPr>
-        <w:spacing w:before="50" w:after="20"/>
+        <w:spacing w:before="40" w:after="20"/>
       </w:pPr>
       <w:r>
         <w:rPr>
@@ -4799,10 +5026,10 @@
             <w:tcW w:type="dxa" w:w="1587"/>
             <w:shd w:val="clear" w:color="auto" w:fill="2E7D32"/>
             <w:tcMar>
-              <w:top w:w="30" w:type="dxa"/>
-              <w:bottom w:w="30" w:type="dxa"/>
-              <w:left w:w="50" w:type="dxa"/>
-              <w:right w:w="50" w:type="dxa"/>
+              <w:top w:w="18" w:type="dxa"/>
+              <w:bottom w:w="18" w:type="dxa"/>
+              <w:left w:w="40" w:type="dxa"/>
+              <w:right w:w="40" w:type="dxa"/>
             </w:tcMar>
             <w:tcBorders>
               <w:top w:val="single" w:sz="4" w:color="D8D8D8" w:space="0"/>
@@ -4832,10 +5059,10 @@
             <w:tcW w:type="dxa" w:w="1814"/>
             <w:shd w:val="clear" w:color="auto" w:fill="2E7D32"/>
             <w:tcMar>
-              <w:top w:w="30" w:type="dxa"/>
-              <w:bottom w:w="30" w:type="dxa"/>
-              <w:left w:w="50" w:type="dxa"/>
-              <w:right w:w="50" w:type="dxa"/>
+              <w:top w:w="18" w:type="dxa"/>
+              <w:bottom w:w="18" w:type="dxa"/>
+              <w:left w:w="40" w:type="dxa"/>
+              <w:right w:w="40" w:type="dxa"/>
             </w:tcMar>
             <w:tcBorders>
               <w:top w:val="single" w:sz="4" w:color="D8D8D8" w:space="0"/>
@@ -4865,10 +5092,10 @@
             <w:tcW w:type="dxa" w:w="2494"/>
             <w:shd w:val="clear" w:color="auto" w:fill="2E7D32"/>
             <w:tcMar>
-              <w:top w:w="30" w:type="dxa"/>
-              <w:bottom w:w="30" w:type="dxa"/>
-              <w:left w:w="50" w:type="dxa"/>
-              <w:right w:w="50" w:type="dxa"/>
+              <w:top w:w="18" w:type="dxa"/>
+              <w:bottom w:w="18" w:type="dxa"/>
+              <w:left w:w="40" w:type="dxa"/>
+              <w:right w:w="40" w:type="dxa"/>
             </w:tcMar>
             <w:tcBorders>
               <w:top w:val="single" w:sz="4" w:color="D8D8D8" w:space="0"/>
@@ -4898,10 +5125,10 @@
             <w:tcW w:type="dxa" w:w="1587"/>
             <w:shd w:val="clear" w:color="auto" w:fill="2E7D32"/>
             <w:tcMar>
-              <w:top w:w="30" w:type="dxa"/>
-              <w:bottom w:w="30" w:type="dxa"/>
-              <w:left w:w="50" w:type="dxa"/>
-              <w:right w:w="50" w:type="dxa"/>
+              <w:top w:w="18" w:type="dxa"/>
+              <w:bottom w:w="18" w:type="dxa"/>
+              <w:left w:w="40" w:type="dxa"/>
+              <w:right w:w="40" w:type="dxa"/>
             </w:tcMar>
             <w:tcBorders>
               <w:top w:val="single" w:sz="4" w:color="D8D8D8" w:space="0"/>
@@ -4931,10 +5158,10 @@
             <w:tcW w:type="dxa" w:w="1247"/>
             <w:shd w:val="clear" w:color="auto" w:fill="2E7D32"/>
             <w:tcMar>
-              <w:top w:w="30" w:type="dxa"/>
-              <w:bottom w:w="30" w:type="dxa"/>
-              <w:left w:w="50" w:type="dxa"/>
-              <w:right w:w="50" w:type="dxa"/>
+              <w:top w:w="18" w:type="dxa"/>
+              <w:bottom w:w="18" w:type="dxa"/>
+              <w:left w:w="40" w:type="dxa"/>
+              <w:right w:w="40" w:type="dxa"/>
             </w:tcMar>
             <w:tcBorders>
               <w:top w:val="single" w:sz="4" w:color="D8D8D8" w:space="0"/>
@@ -4964,10 +5191,10 @@
             <w:tcW w:type="dxa" w:w="1814"/>
             <w:shd w:val="clear" w:color="auto" w:fill="2E7D32"/>
             <w:tcMar>
-              <w:top w:w="30" w:type="dxa"/>
-              <w:bottom w:w="30" w:type="dxa"/>
-              <w:left w:w="50" w:type="dxa"/>
-              <w:right w:w="50" w:type="dxa"/>
+              <w:top w:w="18" w:type="dxa"/>
+              <w:bottom w:w="18" w:type="dxa"/>
+              <w:left w:w="40" w:type="dxa"/>
+              <w:right w:w="40" w:type="dxa"/>
             </w:tcMar>
             <w:tcBorders>
               <w:top w:val="single" w:sz="4" w:color="D8D8D8" w:space="0"/>
@@ -4999,10 +5226,10 @@
             <w:tcW w:type="dxa" w:w="1587"/>
             <w:shd w:val="clear" w:color="auto" w:fill="FFFFFF"/>
             <w:tcMar>
-              <w:top w:w="20" w:type="dxa"/>
-              <w:bottom w:w="20" w:type="dxa"/>
-              <w:left w:w="50" w:type="dxa"/>
-              <w:right w:w="50" w:type="dxa"/>
+              <w:top w:w="16" w:type="dxa"/>
+              <w:bottom w:w="16" w:type="dxa"/>
+              <w:left w:w="40" w:type="dxa"/>
+              <w:right w:w="40" w:type="dxa"/>
             </w:tcMar>
             <w:tcBorders>
               <w:top w:val="single" w:sz="4" w:color="D8D8D8" w:space="0"/>
@@ -5032,10 +5259,10 @@
             <w:tcW w:type="dxa" w:w="1814"/>
             <w:shd w:val="clear" w:color="auto" w:fill="FFFFFF"/>
             <w:tcMar>
-              <w:top w:w="20" w:type="dxa"/>
-              <w:bottom w:w="20" w:type="dxa"/>
-              <w:left w:w="50" w:type="dxa"/>
-              <w:right w:w="50" w:type="dxa"/>
+              <w:top w:w="16" w:type="dxa"/>
+              <w:bottom w:w="16" w:type="dxa"/>
+              <w:left w:w="40" w:type="dxa"/>
+              <w:right w:w="40" w:type="dxa"/>
             </w:tcMar>
             <w:tcBorders>
               <w:top w:val="single" w:sz="4" w:color="D8D8D8" w:space="0"/>
@@ -5065,10 +5292,10 @@
             <w:tcW w:type="dxa" w:w="2494"/>
             <w:shd w:val="clear" w:color="auto" w:fill="FFFFFF"/>
             <w:tcMar>
-              <w:top w:w="20" w:type="dxa"/>
-              <w:bottom w:w="20" w:type="dxa"/>
-              <w:left w:w="50" w:type="dxa"/>
-              <w:right w:w="50" w:type="dxa"/>
+              <w:top w:w="16" w:type="dxa"/>
+              <w:bottom w:w="16" w:type="dxa"/>
+              <w:left w:w="40" w:type="dxa"/>
+              <w:right w:w="40" w:type="dxa"/>
             </w:tcMar>
             <w:tcBorders>
               <w:top w:val="single" w:sz="4" w:color="D8D8D8" w:space="0"/>
@@ -5098,10 +5325,10 @@
             <w:tcW w:type="dxa" w:w="1587"/>
             <w:shd w:val="clear" w:color="auto" w:fill="FFFFFF"/>
             <w:tcMar>
-              <w:top w:w="20" w:type="dxa"/>
-              <w:bottom w:w="20" w:type="dxa"/>
-              <w:left w:w="50" w:type="dxa"/>
-              <w:right w:w="50" w:type="dxa"/>
+              <w:top w:w="16" w:type="dxa"/>
+              <w:bottom w:w="16" w:type="dxa"/>
+              <w:left w:w="40" w:type="dxa"/>
+              <w:right w:w="40" w:type="dxa"/>
             </w:tcMar>
             <w:tcBorders>
               <w:top w:val="single" w:sz="4" w:color="D8D8D8" w:space="0"/>
@@ -5131,10 +5358,10 @@
             <w:tcW w:type="dxa" w:w="1247"/>
             <w:shd w:val="clear" w:color="auto" w:fill="FFFFFF"/>
             <w:tcMar>
-              <w:top w:w="20" w:type="dxa"/>
-              <w:bottom w:w="20" w:type="dxa"/>
-              <w:left w:w="50" w:type="dxa"/>
-              <w:right w:w="50" w:type="dxa"/>
+              <w:top w:w="16" w:type="dxa"/>
+              <w:bottom w:w="16" w:type="dxa"/>
+              <w:left w:w="40" w:type="dxa"/>
+              <w:right w:w="40" w:type="dxa"/>
             </w:tcMar>
             <w:tcBorders>
               <w:top w:val="single" w:sz="4" w:color="D8D8D8" w:space="0"/>
@@ -5164,10 +5391,10 @@
             <w:tcW w:type="dxa" w:w="1814"/>
             <w:shd w:val="clear" w:color="auto" w:fill="FFFFFF"/>
             <w:tcMar>
-              <w:top w:w="20" w:type="dxa"/>
-              <w:bottom w:w="20" w:type="dxa"/>
-              <w:left w:w="50" w:type="dxa"/>
-              <w:right w:w="50" w:type="dxa"/>
+              <w:top w:w="16" w:type="dxa"/>
+              <w:bottom w:w="16" w:type="dxa"/>
+              <w:left w:w="40" w:type="dxa"/>
+              <w:right w:w="40" w:type="dxa"/>
             </w:tcMar>
             <w:tcBorders>
               <w:top w:val="single" w:sz="4" w:color="D8D8D8" w:space="0"/>
@@ -5199,10 +5426,10 @@
             <w:tcW w:type="dxa" w:w="1587"/>
             <w:shd w:val="clear" w:color="auto" w:fill="F9FBF9"/>
             <w:tcMar>
-              <w:top w:w="20" w:type="dxa"/>
-              <w:bottom w:w="20" w:type="dxa"/>
-              <w:left w:w="50" w:type="dxa"/>
-              <w:right w:w="50" w:type="dxa"/>
+              <w:top w:w="16" w:type="dxa"/>
+              <w:bottom w:w="16" w:type="dxa"/>
+              <w:left w:w="40" w:type="dxa"/>
+              <w:right w:w="40" w:type="dxa"/>
             </w:tcMar>
             <w:tcBorders>
               <w:top w:val="single" w:sz="4" w:color="D8D8D8" w:space="0"/>
@@ -5232,10 +5459,10 @@
             <w:tcW w:type="dxa" w:w="1814"/>
             <w:shd w:val="clear" w:color="auto" w:fill="F9FBF9"/>
             <w:tcMar>
-              <w:top w:w="20" w:type="dxa"/>
-              <w:bottom w:w="20" w:type="dxa"/>
-              <w:left w:w="50" w:type="dxa"/>
-              <w:right w:w="50" w:type="dxa"/>
+              <w:top w:w="16" w:type="dxa"/>
+              <w:bottom w:w="16" w:type="dxa"/>
+              <w:left w:w="40" w:type="dxa"/>
+              <w:right w:w="40" w:type="dxa"/>
             </w:tcMar>
             <w:tcBorders>
               <w:top w:val="single" w:sz="4" w:color="D8D8D8" w:space="0"/>
@@ -5265,10 +5492,10 @@
             <w:tcW w:type="dxa" w:w="2494"/>
             <w:shd w:val="clear" w:color="auto" w:fill="F9FBF9"/>
             <w:tcMar>
-              <w:top w:w="20" w:type="dxa"/>
-              <w:bottom w:w="20" w:type="dxa"/>
-              <w:left w:w="50" w:type="dxa"/>
-              <w:right w:w="50" w:type="dxa"/>
+              <w:top w:w="16" w:type="dxa"/>
+              <w:bottom w:w="16" w:type="dxa"/>
+              <w:left w:w="40" w:type="dxa"/>
+              <w:right w:w="40" w:type="dxa"/>
             </w:tcMar>
             <w:tcBorders>
               <w:top w:val="single" w:sz="4" w:color="D8D8D8" w:space="0"/>
@@ -5298,10 +5525,10 @@
             <w:tcW w:type="dxa" w:w="1587"/>
             <w:shd w:val="clear" w:color="auto" w:fill="F9FBF9"/>
             <w:tcMar>
-              <w:top w:w="20" w:type="dxa"/>
-              <w:bottom w:w="20" w:type="dxa"/>
-              <w:left w:w="50" w:type="dxa"/>
-              <w:right w:w="50" w:type="dxa"/>
+              <w:top w:w="16" w:type="dxa"/>
+              <w:bottom w:w="16" w:type="dxa"/>
+              <w:left w:w="40" w:type="dxa"/>
+              <w:right w:w="40" w:type="dxa"/>
             </w:tcMar>
             <w:tcBorders>
               <w:top w:val="single" w:sz="4" w:color="D8D8D8" w:space="0"/>
@@ -5331,10 +5558,10 @@
             <w:tcW w:type="dxa" w:w="1247"/>
             <w:shd w:val="clear" w:color="auto" w:fill="F9FBF9"/>
             <w:tcMar>
-              <w:top w:w="20" w:type="dxa"/>
-              <w:bottom w:w="20" w:type="dxa"/>
-              <w:left w:w="50" w:type="dxa"/>
-              <w:right w:w="50" w:type="dxa"/>
+              <w:top w:w="16" w:type="dxa"/>
+              <w:bottom w:w="16" w:type="dxa"/>
+              <w:left w:w="40" w:type="dxa"/>
+              <w:right w:w="40" w:type="dxa"/>
             </w:tcMar>
             <w:tcBorders>
               <w:top w:val="single" w:sz="4" w:color="D8D8D8" w:space="0"/>
@@ -5364,10 +5591,10 @@
             <w:tcW w:type="dxa" w:w="1814"/>
             <w:shd w:val="clear" w:color="auto" w:fill="F9FBF9"/>
             <w:tcMar>
-              <w:top w:w="20" w:type="dxa"/>
-              <w:bottom w:w="20" w:type="dxa"/>
-              <w:left w:w="50" w:type="dxa"/>
-              <w:right w:w="50" w:type="dxa"/>
+              <w:top w:w="16" w:type="dxa"/>
+              <w:bottom w:w="16" w:type="dxa"/>
+              <w:left w:w="40" w:type="dxa"/>
+              <w:right w:w="40" w:type="dxa"/>
             </w:tcMar>
             <w:tcBorders>
               <w:top w:val="single" w:sz="4" w:color="D8D8D8" w:space="0"/>
@@ -5399,10 +5626,10 @@
             <w:tcW w:type="dxa" w:w="1587"/>
             <w:shd w:val="clear" w:color="auto" w:fill="FFFFFF"/>
             <w:tcMar>
-              <w:top w:w="20" w:type="dxa"/>
-              <w:bottom w:w="20" w:type="dxa"/>
-              <w:left w:w="50" w:type="dxa"/>
-              <w:right w:w="50" w:type="dxa"/>
+              <w:top w:w="16" w:type="dxa"/>
+              <w:bottom w:w="16" w:type="dxa"/>
+              <w:left w:w="40" w:type="dxa"/>
+              <w:right w:w="40" w:type="dxa"/>
             </w:tcMar>
             <w:tcBorders>
               <w:top w:val="single" w:sz="4" w:color="D8D8D8" w:space="0"/>
@@ -5432,10 +5659,10 @@
             <w:tcW w:type="dxa" w:w="1814"/>
             <w:shd w:val="clear" w:color="auto" w:fill="FFFFFF"/>
             <w:tcMar>
-              <w:top w:w="20" w:type="dxa"/>
-              <w:bottom w:w="20" w:type="dxa"/>
-              <w:left w:w="50" w:type="dxa"/>
-              <w:right w:w="50" w:type="dxa"/>
+              <w:top w:w="16" w:type="dxa"/>
+              <w:bottom w:w="16" w:type="dxa"/>
+              <w:left w:w="40" w:type="dxa"/>
+              <w:right w:w="40" w:type="dxa"/>
             </w:tcMar>
             <w:tcBorders>
               <w:top w:val="single" w:sz="4" w:color="D8D8D8" w:space="0"/>
@@ -5465,10 +5692,10 @@
             <w:tcW w:type="dxa" w:w="2494"/>
             <w:shd w:val="clear" w:color="auto" w:fill="FFFFFF"/>
             <w:tcMar>
-              <w:top w:w="20" w:type="dxa"/>
-              <w:bottom w:w="20" w:type="dxa"/>
-              <w:left w:w="50" w:type="dxa"/>
-              <w:right w:w="50" w:type="dxa"/>
+              <w:top w:w="16" w:type="dxa"/>
+              <w:bottom w:w="16" w:type="dxa"/>
+              <w:left w:w="40" w:type="dxa"/>
+              <w:right w:w="40" w:type="dxa"/>
             </w:tcMar>
             <w:tcBorders>
               <w:top w:val="single" w:sz="4" w:color="D8D8D8" w:space="0"/>
@@ -5498,10 +5725,10 @@
             <w:tcW w:type="dxa" w:w="1587"/>
             <w:shd w:val="clear" w:color="auto" w:fill="FFFFFF"/>
             <w:tcMar>
-              <w:top w:w="20" w:type="dxa"/>
-              <w:bottom w:w="20" w:type="dxa"/>
-              <w:left w:w="50" w:type="dxa"/>
-              <w:right w:w="50" w:type="dxa"/>
+              <w:top w:w="16" w:type="dxa"/>
+              <w:bottom w:w="16" w:type="dxa"/>
+              <w:left w:w="40" w:type="dxa"/>
+              <w:right w:w="40" w:type="dxa"/>
             </w:tcMar>
             <w:tcBorders>
               <w:top w:val="single" w:sz="4" w:color="D8D8D8" w:space="0"/>
@@ -5531,10 +5758,10 @@
             <w:tcW w:type="dxa" w:w="1247"/>
             <w:shd w:val="clear" w:color="auto" w:fill="FFFFFF"/>
             <w:tcMar>
-              <w:top w:w="20" w:type="dxa"/>
-              <w:bottom w:w="20" w:type="dxa"/>
-              <w:left w:w="50" w:type="dxa"/>
-              <w:right w:w="50" w:type="dxa"/>
+              <w:top w:w="16" w:type="dxa"/>
+              <w:bottom w:w="16" w:type="dxa"/>
+              <w:left w:w="40" w:type="dxa"/>
+              <w:right w:w="40" w:type="dxa"/>
             </w:tcMar>
             <w:tcBorders>
               <w:top w:val="single" w:sz="4" w:color="D8D8D8" w:space="0"/>
@@ -5564,10 +5791,10 @@
             <w:tcW w:type="dxa" w:w="1814"/>
             <w:shd w:val="clear" w:color="auto" w:fill="FFFFFF"/>
             <w:tcMar>
-              <w:top w:w="20" w:type="dxa"/>
-              <w:bottom w:w="20" w:type="dxa"/>
-              <w:left w:w="50" w:type="dxa"/>
-              <w:right w:w="50" w:type="dxa"/>
+              <w:top w:w="16" w:type="dxa"/>
+              <w:bottom w:w="16" w:type="dxa"/>
+              <w:left w:w="40" w:type="dxa"/>
+              <w:right w:w="40" w:type="dxa"/>
             </w:tcMar>
             <w:tcBorders>
               <w:top w:val="single" w:sz="4" w:color="D8D8D8" w:space="0"/>
@@ -5599,10 +5826,10 @@
             <w:tcW w:type="dxa" w:w="1587"/>
             <w:shd w:val="clear" w:color="auto" w:fill="F9FBF9"/>
             <w:tcMar>
-              <w:top w:w="20" w:type="dxa"/>
-              <w:bottom w:w="20" w:type="dxa"/>
-              <w:left w:w="50" w:type="dxa"/>
-              <w:right w:w="50" w:type="dxa"/>
+              <w:top w:w="16" w:type="dxa"/>
+              <w:bottom w:w="16" w:type="dxa"/>
+              <w:left w:w="40" w:type="dxa"/>
+              <w:right w:w="40" w:type="dxa"/>
             </w:tcMar>
             <w:tcBorders>
               <w:top w:val="single" w:sz="4" w:color="D8D8D8" w:space="0"/>
@@ -5632,10 +5859,10 @@
             <w:tcW w:type="dxa" w:w="1814"/>
             <w:shd w:val="clear" w:color="auto" w:fill="F9FBF9"/>
             <w:tcMar>
-              <w:top w:w="20" w:type="dxa"/>
-              <w:bottom w:w="20" w:type="dxa"/>
-              <w:left w:w="50" w:type="dxa"/>
-              <w:right w:w="50" w:type="dxa"/>
+              <w:top w:w="16" w:type="dxa"/>
+              <w:bottom w:w="16" w:type="dxa"/>
+              <w:left w:w="40" w:type="dxa"/>
+              <w:right w:w="40" w:type="dxa"/>
             </w:tcMar>
             <w:tcBorders>
               <w:top w:val="single" w:sz="4" w:color="D8D8D8" w:space="0"/>
@@ -5665,10 +5892,10 @@
             <w:tcW w:type="dxa" w:w="2494"/>
             <w:shd w:val="clear" w:color="auto" w:fill="F9FBF9"/>
             <w:tcMar>
-              <w:top w:w="20" w:type="dxa"/>
-              <w:bottom w:w="20" w:type="dxa"/>
-              <w:left w:w="50" w:type="dxa"/>
-              <w:right w:w="50" w:type="dxa"/>
+              <w:top w:w="16" w:type="dxa"/>
+              <w:bottom w:w="16" w:type="dxa"/>
+              <w:left w:w="40" w:type="dxa"/>
+              <w:right w:w="40" w:type="dxa"/>
             </w:tcMar>
             <w:tcBorders>
               <w:top w:val="single" w:sz="4" w:color="D8D8D8" w:space="0"/>
@@ -5698,10 +5925,10 @@
             <w:tcW w:type="dxa" w:w="1587"/>
             <w:shd w:val="clear" w:color="auto" w:fill="F9FBF9"/>
             <w:tcMar>
-              <w:top w:w="20" w:type="dxa"/>
-              <w:bottom w:w="20" w:type="dxa"/>
-              <w:left w:w="50" w:type="dxa"/>
-              <w:right w:w="50" w:type="dxa"/>
+              <w:top w:w="16" w:type="dxa"/>
+              <w:bottom w:w="16" w:type="dxa"/>
+              <w:left w:w="40" w:type="dxa"/>
+              <w:right w:w="40" w:type="dxa"/>
             </w:tcMar>
             <w:tcBorders>
               <w:top w:val="single" w:sz="4" w:color="D8D8D8" w:space="0"/>
@@ -5731,10 +5958,10 @@
             <w:tcW w:type="dxa" w:w="1247"/>
             <w:shd w:val="clear" w:color="auto" w:fill="F9FBF9"/>
             <w:tcMar>
-              <w:top w:w="20" w:type="dxa"/>
-              <w:bottom w:w="20" w:type="dxa"/>
-              <w:left w:w="50" w:type="dxa"/>
-              <w:right w:w="50" w:type="dxa"/>
+              <w:top w:w="16" w:type="dxa"/>
+              <w:bottom w:w="16" w:type="dxa"/>
+              <w:left w:w="40" w:type="dxa"/>
+              <w:right w:w="40" w:type="dxa"/>
             </w:tcMar>
             <w:tcBorders>
               <w:top w:val="single" w:sz="4" w:color="D8D8D8" w:space="0"/>
@@ -5764,10 +5991,10 @@
             <w:tcW w:type="dxa" w:w="1814"/>
             <w:shd w:val="clear" w:color="auto" w:fill="F9FBF9"/>
             <w:tcMar>
-              <w:top w:w="20" w:type="dxa"/>
-              <w:bottom w:w="20" w:type="dxa"/>
-              <w:left w:w="50" w:type="dxa"/>
-              <w:right w:w="50" w:type="dxa"/>
+              <w:top w:w="16" w:type="dxa"/>
+              <w:bottom w:w="16" w:type="dxa"/>
+              <w:left w:w="40" w:type="dxa"/>
+              <w:right w:w="40" w:type="dxa"/>
             </w:tcMar>
             <w:tcBorders>
               <w:top w:val="single" w:sz="4" w:color="D8D8D8" w:space="0"/>
@@ -5799,10 +6026,10 @@
             <w:tcW w:type="dxa" w:w="1587"/>
             <w:shd w:val="clear" w:color="auto" w:fill="FFFFFF"/>
             <w:tcMar>
-              <w:top w:w="20" w:type="dxa"/>
-              <w:bottom w:w="20" w:type="dxa"/>
-              <w:left w:w="50" w:type="dxa"/>
-              <w:right w:w="50" w:type="dxa"/>
+              <w:top w:w="16" w:type="dxa"/>
+              <w:bottom w:w="16" w:type="dxa"/>
+              <w:left w:w="40" w:type="dxa"/>
+              <w:right w:w="40" w:type="dxa"/>
             </w:tcMar>
             <w:tcBorders>
               <w:top w:val="single" w:sz="4" w:color="D8D8D8" w:space="0"/>
@@ -5832,10 +6059,10 @@
             <w:tcW w:type="dxa" w:w="1814"/>
             <w:shd w:val="clear" w:color="auto" w:fill="FFFFFF"/>
             <w:tcMar>
-              <w:top w:w="20" w:type="dxa"/>
-              <w:bottom w:w="20" w:type="dxa"/>
-              <w:left w:w="50" w:type="dxa"/>
-              <w:right w:w="50" w:type="dxa"/>
+              <w:top w:w="16" w:type="dxa"/>
+              <w:bottom w:w="16" w:type="dxa"/>
+              <w:left w:w="40" w:type="dxa"/>
+              <w:right w:w="40" w:type="dxa"/>
             </w:tcMar>
             <w:tcBorders>
               <w:top w:val="single" w:sz="4" w:color="D8D8D8" w:space="0"/>
@@ -5865,10 +6092,10 @@
             <w:tcW w:type="dxa" w:w="2494"/>
             <w:shd w:val="clear" w:color="auto" w:fill="FFFFFF"/>
             <w:tcMar>
-              <w:top w:w="20" w:type="dxa"/>
-              <w:bottom w:w="20" w:type="dxa"/>
-              <w:left w:w="50" w:type="dxa"/>
-              <w:right w:w="50" w:type="dxa"/>
+              <w:top w:w="16" w:type="dxa"/>
+              <w:bottom w:w="16" w:type="dxa"/>
+              <w:left w:w="40" w:type="dxa"/>
+              <w:right w:w="40" w:type="dxa"/>
             </w:tcMar>
             <w:tcBorders>
               <w:top w:val="single" w:sz="4" w:color="D8D8D8" w:space="0"/>
@@ -5898,10 +6125,10 @@
             <w:tcW w:type="dxa" w:w="1587"/>
             <w:shd w:val="clear" w:color="auto" w:fill="FFFFFF"/>
             <w:tcMar>
-              <w:top w:w="20" w:type="dxa"/>
-              <w:bottom w:w="20" w:type="dxa"/>
-              <w:left w:w="50" w:type="dxa"/>
-              <w:right w:w="50" w:type="dxa"/>
+              <w:top w:w="16" w:type="dxa"/>
+              <w:bottom w:w="16" w:type="dxa"/>
+              <w:left w:w="40" w:type="dxa"/>
+              <w:right w:w="40" w:type="dxa"/>
             </w:tcMar>
             <w:tcBorders>
               <w:top w:val="single" w:sz="4" w:color="D8D8D8" w:space="0"/>
@@ -5931,10 +6158,10 @@
             <w:tcW w:type="dxa" w:w="1247"/>
             <w:shd w:val="clear" w:color="auto" w:fill="FFFFFF"/>
             <w:tcMar>
-              <w:top w:w="20" w:type="dxa"/>
-              <w:bottom w:w="20" w:type="dxa"/>
-              <w:left w:w="50" w:type="dxa"/>
-              <w:right w:w="50" w:type="dxa"/>
+              <w:top w:w="16" w:type="dxa"/>
+              <w:bottom w:w="16" w:type="dxa"/>
+              <w:left w:w="40" w:type="dxa"/>
+              <w:right w:w="40" w:type="dxa"/>
             </w:tcMar>
             <w:tcBorders>
               <w:top w:val="single" w:sz="4" w:color="D8D8D8" w:space="0"/>
@@ -5964,10 +6191,10 @@
             <w:tcW w:type="dxa" w:w="1814"/>
             <w:shd w:val="clear" w:color="auto" w:fill="FFFFFF"/>
             <w:tcMar>
-              <w:top w:w="20" w:type="dxa"/>
-              <w:bottom w:w="20" w:type="dxa"/>
-              <w:left w:w="50" w:type="dxa"/>
-              <w:right w:w="50" w:type="dxa"/>
+              <w:top w:w="16" w:type="dxa"/>
+              <w:bottom w:w="16" w:type="dxa"/>
+              <w:left w:w="40" w:type="dxa"/>
+              <w:right w:w="40" w:type="dxa"/>
             </w:tcMar>
             <w:tcBorders>
               <w:top w:val="single" w:sz="4" w:color="D8D8D8" w:space="0"/>
@@ -5999,10 +6226,10 @@
             <w:tcW w:type="dxa" w:w="1587"/>
             <w:shd w:val="clear" w:color="auto" w:fill="F9FBF9"/>
             <w:tcMar>
-              <w:top w:w="20" w:type="dxa"/>
-              <w:bottom w:w="20" w:type="dxa"/>
-              <w:left w:w="50" w:type="dxa"/>
-              <w:right w:w="50" w:type="dxa"/>
+              <w:top w:w="16" w:type="dxa"/>
+              <w:bottom w:w="16" w:type="dxa"/>
+              <w:left w:w="40" w:type="dxa"/>
+              <w:right w:w="40" w:type="dxa"/>
             </w:tcMar>
             <w:tcBorders>
               <w:top w:val="single" w:sz="4" w:color="D8D8D8" w:space="0"/>
@@ -6032,10 +6259,10 @@
             <w:tcW w:type="dxa" w:w="1814"/>
             <w:shd w:val="clear" w:color="auto" w:fill="F9FBF9"/>
             <w:tcMar>
-              <w:top w:w="20" w:type="dxa"/>
-              <w:bottom w:w="20" w:type="dxa"/>
-              <w:left w:w="50" w:type="dxa"/>
-              <w:right w:w="50" w:type="dxa"/>
+              <w:top w:w="16" w:type="dxa"/>
+              <w:bottom w:w="16" w:type="dxa"/>
+              <w:left w:w="40" w:type="dxa"/>
+              <w:right w:w="40" w:type="dxa"/>
             </w:tcMar>
             <w:tcBorders>
               <w:top w:val="single" w:sz="4" w:color="D8D8D8" w:space="0"/>
@@ -6065,10 +6292,10 @@
             <w:tcW w:type="dxa" w:w="2494"/>
             <w:shd w:val="clear" w:color="auto" w:fill="F9FBF9"/>
             <w:tcMar>
-              <w:top w:w="20" w:type="dxa"/>
-              <w:bottom w:w="20" w:type="dxa"/>
-              <w:left w:w="50" w:type="dxa"/>
-              <w:right w:w="50" w:type="dxa"/>
+              <w:top w:w="16" w:type="dxa"/>
+              <w:bottom w:w="16" w:type="dxa"/>
+              <w:left w:w="40" w:type="dxa"/>
+              <w:right w:w="40" w:type="dxa"/>
             </w:tcMar>
             <w:tcBorders>
               <w:top w:val="single" w:sz="4" w:color="D8D8D8" w:space="0"/>
@@ -6098,10 +6325,10 @@
             <w:tcW w:type="dxa" w:w="1587"/>
             <w:shd w:val="clear" w:color="auto" w:fill="F9FBF9"/>
             <w:tcMar>
-              <w:top w:w="20" w:type="dxa"/>
-              <w:bottom w:w="20" w:type="dxa"/>
-              <w:left w:w="50" w:type="dxa"/>
-              <w:right w:w="50" w:type="dxa"/>
+              <w:top w:w="16" w:type="dxa"/>
+              <w:bottom w:w="16" w:type="dxa"/>
+              <w:left w:w="40" w:type="dxa"/>
+              <w:right w:w="40" w:type="dxa"/>
             </w:tcMar>
             <w:tcBorders>
               <w:top w:val="single" w:sz="4" w:color="D8D8D8" w:space="0"/>
@@ -6131,10 +6358,10 @@
             <w:tcW w:type="dxa" w:w="1247"/>
             <w:shd w:val="clear" w:color="auto" w:fill="F9FBF9"/>
             <w:tcMar>
-              <w:top w:w="20" w:type="dxa"/>
-              <w:bottom w:w="20" w:type="dxa"/>
-              <w:left w:w="50" w:type="dxa"/>
-              <w:right w:w="50" w:type="dxa"/>
+              <w:top w:w="16" w:type="dxa"/>
+              <w:bottom w:w="16" w:type="dxa"/>
+              <w:left w:w="40" w:type="dxa"/>
+              <w:right w:w="40" w:type="dxa"/>
             </w:tcMar>
             <w:tcBorders>
               <w:top w:val="single" w:sz="4" w:color="D8D8D8" w:space="0"/>
@@ -6164,10 +6391,10 @@
             <w:tcW w:type="dxa" w:w="1814"/>
             <w:shd w:val="clear" w:color="auto" w:fill="F9FBF9"/>
             <w:tcMar>
-              <w:top w:w="20" w:type="dxa"/>
-              <w:bottom w:w="20" w:type="dxa"/>
-              <w:left w:w="50" w:type="dxa"/>
-              <w:right w:w="50" w:type="dxa"/>
+              <w:top w:w="16" w:type="dxa"/>
+              <w:bottom w:w="16" w:type="dxa"/>
+              <w:left w:w="40" w:type="dxa"/>
+              <w:right w:w="40" w:type="dxa"/>
             </w:tcMar>
             <w:tcBorders>
               <w:top w:val="single" w:sz="4" w:color="D8D8D8" w:space="0"/>
@@ -6196,7 +6423,7 @@
     </w:tbl>
     <w:p>
       <w:pPr>
-        <w:spacing w:before="80" w:after="30"/>
+        <w:spacing w:before="70" w:after="20"/>
         <w:pBdr>
           <w:bottom w:val="single" w:sz="4" w:space="1" w:color="2E7D32"/>
         </w:pBdr>
@@ -6206,7 +6433,7 @@
           <w:b/>
           <w:i w:val="0"/>
           <w:color w:val="1B5E20"/>
-          <w:sz w:val="19"/>
+          <w:sz w:val="18"/>
         </w:rPr>
         <w:t>1.6 Peta Jalur Distribusi Logistik Nikel Sulawesi</w:t>
       </w:r>
@@ -6228,11 +6455,11 @@
     </w:p>
     <w:p>
       <w:pPr>
-        <w:spacing w:before="20" w:after="40" w:line="252" w:lineRule="auto"/>
-        <w:ind w:left="120"/>
+        <w:spacing w:before="30" w:after="40" w:line="252" w:lineRule="auto"/>
+        <w:ind w:left="100"/>
         <w:shd w:val="clear" w:color="auto" w:fill="EDF7EE"/>
         <w:pBdr>
-          <w:left w:val="single" w:sz="12" w:space="4" w:color="43A047"/>
+          <w:left w:val="single" w:sz="12" w:space="4" w:color="2E7D32"/>
         </w:pBdr>
       </w:pPr>
       <w:r>
@@ -6242,7 +6469,8 @@
           <w:color w:val="1B5E20"/>
           <w:sz w:val="15"/>
         </w:rPr>
-        <w:t xml:space="preserve">Formulasi (Kurva Parametrik Bézier): </w:t>
+        <w:t>Formulasi Matematis (Kurva Parametrik Bézier Alur Pelayaran Maritim):</w:t>
+        <w:br/>
       </w:r>
       <w:r>
         <w:rPr>
@@ -6250,9 +6478,32 @@
           <w:b w:val="0"/>
           <w:i w:val="0"/>
           <w:color w:val="104010"/>
+          <w:sz w:val="14"/>
+        </w:rPr>
+        <w:t>Kurva(t) = ( 1 - t )² * P_Asal + 2 * ( 1 - t ) * t * P_Kontrol + t² * P_Tujuan ,  t ∈ [0, 1]</w:t>
+        <w:br/>
+      </w:r>
+      <w:r>
+        <w:rPr>
+          <w:b/>
+          <w:i w:val="0"/>
+          <w:color w:val="1B5E20"/>
           <w:sz w:val="15"/>
         </w:rPr>
-        <w:t>Kurva(t) = (1 - t)² * P_Asal + 2*(1 - t)*t * P_Kontrol + t² * P_Tujuan , t in [0, 1]</w:t>
+        <w:t>Persamaan Substitusi:</w:t>
+        <w:br/>
+      </w:r>
+      <w:r>
+        <w:rPr>
+          <w:rFonts w:ascii="Consolas" w:hAnsi="Consolas"/>
+          <w:b w:val="0"/>
+          <w:i w:val="0"/>
+          <w:color w:val="222222"/>
+          <w:sz w:val="14"/>
+        </w:rPr>
+        <w:t>Kapasitas_Kapal_Maksimum = 52.378 DWT (Setara ~5.200 Truk Tronton per Pengapalan)</w:t>
+        <w:br/>
+        <w:t>Orientasi_Logistik = Lebih dari 78% kargo bertolak langsung ke pelabuhan Tiongkok (Ningbo, Qingdao) dan Jepang (Chiba)</w:t>
       </w:r>
       <w:r>
         <w:rPr>
@@ -6261,12 +6512,13 @@
           <w:color w:val="555555"/>
           <w:sz w:val="14"/>
         </w:rPr>
-        <w:t xml:space="preserve"> | Ket: P_Asal: koordinat pelabuhan Sulawesi, P_Kontrol: jangkar perairan internasional, P_Tujuan: pelabuhan bongkar</w:t>
+        <w:br/>
+        <w:t>Ket: P_Asal: koordinat pelabuhan Sulawesi, P_Kontrol: jangkar perairan internasional, P_Tujuan: pelabuhan bongkar.</w:t>
       </w:r>
     </w:p>
     <w:p>
       <w:pPr>
-        <w:spacing w:before="80" w:after="30"/>
+        <w:spacing w:before="70" w:after="20"/>
         <w:pBdr>
           <w:bottom w:val="single" w:sz="4" w:space="1" w:color="2E7D32"/>
         </w:pBdr>
@@ -6276,14 +6528,14 @@
           <w:b/>
           <w:i w:val="0"/>
           <w:color w:val="1B5E20"/>
-          <w:sz w:val="19"/>
+          <w:sz w:val="18"/>
         </w:rPr>
         <w:t>1.7 Matriks Indikator dan Sumber Data Resmi Bab 1</w:t>
       </w:r>
     </w:p>
     <w:p>
       <w:pPr>
-        <w:spacing w:before="50" w:after="20"/>
+        <w:spacing w:before="40" w:after="20"/>
       </w:pPr>
       <w:r>
         <w:rPr>
@@ -6318,10 +6570,10 @@
             <w:tcW w:type="dxa" w:w="454"/>
             <w:shd w:val="clear" w:color="auto" w:fill="2E7D32"/>
             <w:tcMar>
-              <w:top w:w="30" w:type="dxa"/>
-              <w:bottom w:w="30" w:type="dxa"/>
-              <w:left w:w="50" w:type="dxa"/>
-              <w:right w:w="50" w:type="dxa"/>
+              <w:top w:w="18" w:type="dxa"/>
+              <w:bottom w:w="18" w:type="dxa"/>
+              <w:left w:w="40" w:type="dxa"/>
+              <w:right w:w="40" w:type="dxa"/>
             </w:tcMar>
             <w:tcBorders>
               <w:top w:val="single" w:sz="4" w:color="D8D8D8" w:space="0"/>
@@ -6351,10 +6603,10 @@
             <w:tcW w:type="dxa" w:w="1928"/>
             <w:shd w:val="clear" w:color="auto" w:fill="2E7D32"/>
             <w:tcMar>
-              <w:top w:w="30" w:type="dxa"/>
-              <w:bottom w:w="30" w:type="dxa"/>
-              <w:left w:w="50" w:type="dxa"/>
-              <w:right w:w="50" w:type="dxa"/>
+              <w:top w:w="18" w:type="dxa"/>
+              <w:bottom w:w="18" w:type="dxa"/>
+              <w:left w:w="40" w:type="dxa"/>
+              <w:right w:w="40" w:type="dxa"/>
             </w:tcMar>
             <w:tcBorders>
               <w:top w:val="single" w:sz="4" w:color="D8D8D8" w:space="0"/>
@@ -6384,10 +6636,10 @@
             <w:tcW w:type="dxa" w:w="1474"/>
             <w:shd w:val="clear" w:color="auto" w:fill="2E7D32"/>
             <w:tcMar>
-              <w:top w:w="30" w:type="dxa"/>
-              <w:bottom w:w="30" w:type="dxa"/>
-              <w:left w:w="50" w:type="dxa"/>
-              <w:right w:w="50" w:type="dxa"/>
+              <w:top w:w="18" w:type="dxa"/>
+              <w:bottom w:w="18" w:type="dxa"/>
+              <w:left w:w="40" w:type="dxa"/>
+              <w:right w:w="40" w:type="dxa"/>
             </w:tcMar>
             <w:tcBorders>
               <w:top w:val="single" w:sz="4" w:color="D8D8D8" w:space="0"/>
@@ -6417,10 +6669,10 @@
             <w:tcW w:type="dxa" w:w="794"/>
             <w:shd w:val="clear" w:color="auto" w:fill="2E7D32"/>
             <w:tcMar>
-              <w:top w:w="30" w:type="dxa"/>
-              <w:bottom w:w="30" w:type="dxa"/>
-              <w:left w:w="50" w:type="dxa"/>
-              <w:right w:w="50" w:type="dxa"/>
+              <w:top w:w="18" w:type="dxa"/>
+              <w:bottom w:w="18" w:type="dxa"/>
+              <w:left w:w="40" w:type="dxa"/>
+              <w:right w:w="40" w:type="dxa"/>
             </w:tcMar>
             <w:tcBorders>
               <w:top w:val="single" w:sz="4" w:color="D8D8D8" w:space="0"/>
@@ -6450,10 +6702,10 @@
             <w:tcW w:type="dxa" w:w="1020"/>
             <w:shd w:val="clear" w:color="auto" w:fill="2E7D32"/>
             <w:tcMar>
-              <w:top w:w="30" w:type="dxa"/>
-              <w:bottom w:w="30" w:type="dxa"/>
-              <w:left w:w="50" w:type="dxa"/>
-              <w:right w:w="50" w:type="dxa"/>
+              <w:top w:w="18" w:type="dxa"/>
+              <w:bottom w:w="18" w:type="dxa"/>
+              <w:left w:w="40" w:type="dxa"/>
+              <w:right w:w="40" w:type="dxa"/>
             </w:tcMar>
             <w:tcBorders>
               <w:top w:val="single" w:sz="4" w:color="D8D8D8" w:space="0"/>
@@ -6483,10 +6735,10 @@
             <w:tcW w:type="dxa" w:w="2494"/>
             <w:shd w:val="clear" w:color="auto" w:fill="2E7D32"/>
             <w:tcMar>
-              <w:top w:w="30" w:type="dxa"/>
-              <w:bottom w:w="30" w:type="dxa"/>
-              <w:left w:w="50" w:type="dxa"/>
-              <w:right w:w="50" w:type="dxa"/>
+              <w:top w:w="18" w:type="dxa"/>
+              <w:bottom w:w="18" w:type="dxa"/>
+              <w:left w:w="40" w:type="dxa"/>
+              <w:right w:w="40" w:type="dxa"/>
             </w:tcMar>
             <w:tcBorders>
               <w:top w:val="single" w:sz="4" w:color="D8D8D8" w:space="0"/>
@@ -6516,10 +6768,10 @@
             <w:tcW w:type="dxa" w:w="2381"/>
             <w:shd w:val="clear" w:color="auto" w:fill="2E7D32"/>
             <w:tcMar>
-              <w:top w:w="30" w:type="dxa"/>
-              <w:bottom w:w="30" w:type="dxa"/>
-              <w:left w:w="50" w:type="dxa"/>
-              <w:right w:w="50" w:type="dxa"/>
+              <w:top w:w="18" w:type="dxa"/>
+              <w:bottom w:w="18" w:type="dxa"/>
+              <w:left w:w="40" w:type="dxa"/>
+              <w:right w:w="40" w:type="dxa"/>
             </w:tcMar>
             <w:tcBorders>
               <w:top w:val="single" w:sz="4" w:color="D8D8D8" w:space="0"/>
@@ -6551,10 +6803,10 @@
             <w:tcW w:type="dxa" w:w="454"/>
             <w:shd w:val="clear" w:color="auto" w:fill="FFFFFF"/>
             <w:tcMar>
-              <w:top w:w="20" w:type="dxa"/>
-              <w:bottom w:w="20" w:type="dxa"/>
-              <w:left w:w="50" w:type="dxa"/>
-              <w:right w:w="50" w:type="dxa"/>
+              <w:top w:w="16" w:type="dxa"/>
+              <w:bottom w:w="16" w:type="dxa"/>
+              <w:left w:w="40" w:type="dxa"/>
+              <w:right w:w="40" w:type="dxa"/>
             </w:tcMar>
             <w:tcBorders>
               <w:top w:val="single" w:sz="4" w:color="D8D8D8" w:space="0"/>
@@ -6584,10 +6836,10 @@
             <w:tcW w:type="dxa" w:w="1928"/>
             <w:shd w:val="clear" w:color="auto" w:fill="FFFFFF"/>
             <w:tcMar>
-              <w:top w:w="20" w:type="dxa"/>
-              <w:bottom w:w="20" w:type="dxa"/>
-              <w:left w:w="50" w:type="dxa"/>
-              <w:right w:w="50" w:type="dxa"/>
+              <w:top w:w="16" w:type="dxa"/>
+              <w:bottom w:w="16" w:type="dxa"/>
+              <w:left w:w="40" w:type="dxa"/>
+              <w:right w:w="40" w:type="dxa"/>
             </w:tcMar>
             <w:tcBorders>
               <w:top w:val="single" w:sz="4" w:color="D8D8D8" w:space="0"/>
@@ -6617,10 +6869,10 @@
             <w:tcW w:type="dxa" w:w="1474"/>
             <w:shd w:val="clear" w:color="auto" w:fill="FFFFFF"/>
             <w:tcMar>
-              <w:top w:w="20" w:type="dxa"/>
-              <w:bottom w:w="20" w:type="dxa"/>
-              <w:left w:w="50" w:type="dxa"/>
-              <w:right w:w="50" w:type="dxa"/>
+              <w:top w:w="16" w:type="dxa"/>
+              <w:bottom w:w="16" w:type="dxa"/>
+              <w:left w:w="40" w:type="dxa"/>
+              <w:right w:w="40" w:type="dxa"/>
             </w:tcMar>
             <w:tcBorders>
               <w:top w:val="single" w:sz="4" w:color="D8D8D8" w:space="0"/>
@@ -6650,10 +6902,10 @@
             <w:tcW w:type="dxa" w:w="794"/>
             <w:shd w:val="clear" w:color="auto" w:fill="FFFFFF"/>
             <w:tcMar>
-              <w:top w:w="20" w:type="dxa"/>
-              <w:bottom w:w="20" w:type="dxa"/>
-              <w:left w:w="50" w:type="dxa"/>
-              <w:right w:w="50" w:type="dxa"/>
+              <w:top w:w="16" w:type="dxa"/>
+              <w:bottom w:w="16" w:type="dxa"/>
+              <w:left w:w="40" w:type="dxa"/>
+              <w:right w:w="40" w:type="dxa"/>
             </w:tcMar>
             <w:tcBorders>
               <w:top w:val="single" w:sz="4" w:color="D8D8D8" w:space="0"/>
@@ -6683,10 +6935,10 @@
             <w:tcW w:type="dxa" w:w="1020"/>
             <w:shd w:val="clear" w:color="auto" w:fill="FFFFFF"/>
             <w:tcMar>
-              <w:top w:w="20" w:type="dxa"/>
-              <w:bottom w:w="20" w:type="dxa"/>
-              <w:left w:w="50" w:type="dxa"/>
-              <w:right w:w="50" w:type="dxa"/>
+              <w:top w:w="16" w:type="dxa"/>
+              <w:bottom w:w="16" w:type="dxa"/>
+              <w:left w:w="40" w:type="dxa"/>
+              <w:right w:w="40" w:type="dxa"/>
             </w:tcMar>
             <w:tcBorders>
               <w:top w:val="single" w:sz="4" w:color="D8D8D8" w:space="0"/>
@@ -6716,10 +6968,10 @@
             <w:tcW w:type="dxa" w:w="2494"/>
             <w:shd w:val="clear" w:color="auto" w:fill="FFFFFF"/>
             <w:tcMar>
-              <w:top w:w="20" w:type="dxa"/>
-              <w:bottom w:w="20" w:type="dxa"/>
-              <w:left w:w="50" w:type="dxa"/>
-              <w:right w:w="50" w:type="dxa"/>
+              <w:top w:w="16" w:type="dxa"/>
+              <w:bottom w:w="16" w:type="dxa"/>
+              <w:left w:w="40" w:type="dxa"/>
+              <w:right w:w="40" w:type="dxa"/>
             </w:tcMar>
             <w:tcBorders>
               <w:top w:val="single" w:sz="4" w:color="D8D8D8" w:space="0"/>
@@ -6749,10 +7001,10 @@
             <w:tcW w:type="dxa" w:w="2381"/>
             <w:shd w:val="clear" w:color="auto" w:fill="FFFFFF"/>
             <w:tcMar>
-              <w:top w:w="20" w:type="dxa"/>
-              <w:bottom w:w="20" w:type="dxa"/>
-              <w:left w:w="50" w:type="dxa"/>
-              <w:right w:w="50" w:type="dxa"/>
+              <w:top w:w="16" w:type="dxa"/>
+              <w:bottom w:w="16" w:type="dxa"/>
+              <w:left w:w="40" w:type="dxa"/>
+              <w:right w:w="40" w:type="dxa"/>
             </w:tcMar>
             <w:tcBorders>
               <w:top w:val="single" w:sz="4" w:color="D8D8D8" w:space="0"/>
@@ -6784,10 +7036,10 @@
             <w:tcW w:type="dxa" w:w="454"/>
             <w:shd w:val="clear" w:color="auto" w:fill="F9FBF9"/>
             <w:tcMar>
-              <w:top w:w="20" w:type="dxa"/>
-              <w:bottom w:w="20" w:type="dxa"/>
-              <w:left w:w="50" w:type="dxa"/>
-              <w:right w:w="50" w:type="dxa"/>
+              <w:top w:w="16" w:type="dxa"/>
+              <w:bottom w:w="16" w:type="dxa"/>
+              <w:left w:w="40" w:type="dxa"/>
+              <w:right w:w="40" w:type="dxa"/>
             </w:tcMar>
             <w:tcBorders>
               <w:top w:val="single" w:sz="4" w:color="D8D8D8" w:space="0"/>
@@ -6817,10 +7069,10 @@
             <w:tcW w:type="dxa" w:w="1928"/>
             <w:shd w:val="clear" w:color="auto" w:fill="F9FBF9"/>
             <w:tcMar>
-              <w:top w:w="20" w:type="dxa"/>
-              <w:bottom w:w="20" w:type="dxa"/>
-              <w:left w:w="50" w:type="dxa"/>
-              <w:right w:w="50" w:type="dxa"/>
+              <w:top w:w="16" w:type="dxa"/>
+              <w:bottom w:w="16" w:type="dxa"/>
+              <w:left w:w="40" w:type="dxa"/>
+              <w:right w:w="40" w:type="dxa"/>
             </w:tcMar>
             <w:tcBorders>
               <w:top w:val="single" w:sz="4" w:color="D8D8D8" w:space="0"/>
@@ -6850,10 +7102,10 @@
             <w:tcW w:type="dxa" w:w="1474"/>
             <w:shd w:val="clear" w:color="auto" w:fill="F9FBF9"/>
             <w:tcMar>
-              <w:top w:w="20" w:type="dxa"/>
-              <w:bottom w:w="20" w:type="dxa"/>
-              <w:left w:w="50" w:type="dxa"/>
-              <w:right w:w="50" w:type="dxa"/>
+              <w:top w:w="16" w:type="dxa"/>
+              <w:bottom w:w="16" w:type="dxa"/>
+              <w:left w:w="40" w:type="dxa"/>
+              <w:right w:w="40" w:type="dxa"/>
             </w:tcMar>
             <w:tcBorders>
               <w:top w:val="single" w:sz="4" w:color="D8D8D8" w:space="0"/>
@@ -6883,10 +7135,10 @@
             <w:tcW w:type="dxa" w:w="794"/>
             <w:shd w:val="clear" w:color="auto" w:fill="F9FBF9"/>
             <w:tcMar>
-              <w:top w:w="20" w:type="dxa"/>
-              <w:bottom w:w="20" w:type="dxa"/>
-              <w:left w:w="50" w:type="dxa"/>
-              <w:right w:w="50" w:type="dxa"/>
+              <w:top w:w="16" w:type="dxa"/>
+              <w:bottom w:w="16" w:type="dxa"/>
+              <w:left w:w="40" w:type="dxa"/>
+              <w:right w:w="40" w:type="dxa"/>
             </w:tcMar>
             <w:tcBorders>
               <w:top w:val="single" w:sz="4" w:color="D8D8D8" w:space="0"/>
@@ -6916,10 +7168,10 @@
             <w:tcW w:type="dxa" w:w="1020"/>
             <w:shd w:val="clear" w:color="auto" w:fill="F9FBF9"/>
             <w:tcMar>
-              <w:top w:w="20" w:type="dxa"/>
-              <w:bottom w:w="20" w:type="dxa"/>
-              <w:left w:w="50" w:type="dxa"/>
-              <w:right w:w="50" w:type="dxa"/>
+              <w:top w:w="16" w:type="dxa"/>
+              <w:bottom w:w="16" w:type="dxa"/>
+              <w:left w:w="40" w:type="dxa"/>
+              <w:right w:w="40" w:type="dxa"/>
             </w:tcMar>
             <w:tcBorders>
               <w:top w:val="single" w:sz="4" w:color="D8D8D8" w:space="0"/>
@@ -6949,10 +7201,10 @@
             <w:tcW w:type="dxa" w:w="2494"/>
             <w:shd w:val="clear" w:color="auto" w:fill="F9FBF9"/>
             <w:tcMar>
-              <w:top w:w="20" w:type="dxa"/>
-              <w:bottom w:w="20" w:type="dxa"/>
-              <w:left w:w="50" w:type="dxa"/>
-              <w:right w:w="50" w:type="dxa"/>
+              <w:top w:w="16" w:type="dxa"/>
+              <w:bottom w:w="16" w:type="dxa"/>
+              <w:left w:w="40" w:type="dxa"/>
+              <w:right w:w="40" w:type="dxa"/>
             </w:tcMar>
             <w:tcBorders>
               <w:top w:val="single" w:sz="4" w:color="D8D8D8" w:space="0"/>
@@ -6982,10 +7234,10 @@
             <w:tcW w:type="dxa" w:w="2381"/>
             <w:shd w:val="clear" w:color="auto" w:fill="F9FBF9"/>
             <w:tcMar>
-              <w:top w:w="20" w:type="dxa"/>
-              <w:bottom w:w="20" w:type="dxa"/>
-              <w:left w:w="50" w:type="dxa"/>
-              <w:right w:w="50" w:type="dxa"/>
+              <w:top w:w="16" w:type="dxa"/>
+              <w:bottom w:w="16" w:type="dxa"/>
+              <w:left w:w="40" w:type="dxa"/>
+              <w:right w:w="40" w:type="dxa"/>
             </w:tcMar>
             <w:tcBorders>
               <w:top w:val="single" w:sz="4" w:color="D8D8D8" w:space="0"/>
@@ -7017,10 +7269,10 @@
             <w:tcW w:type="dxa" w:w="454"/>
             <w:shd w:val="clear" w:color="auto" w:fill="FFFFFF"/>
             <w:tcMar>
-              <w:top w:w="20" w:type="dxa"/>
-              <w:bottom w:w="20" w:type="dxa"/>
-              <w:left w:w="50" w:type="dxa"/>
-              <w:right w:w="50" w:type="dxa"/>
+              <w:top w:w="16" w:type="dxa"/>
+              <w:bottom w:w="16" w:type="dxa"/>
+              <w:left w:w="40" w:type="dxa"/>
+              <w:right w:w="40" w:type="dxa"/>
             </w:tcMar>
             <w:tcBorders>
               <w:top w:val="single" w:sz="4" w:color="D8D8D8" w:space="0"/>
@@ -7050,10 +7302,10 @@
             <w:tcW w:type="dxa" w:w="1928"/>
             <w:shd w:val="clear" w:color="auto" w:fill="FFFFFF"/>
             <w:tcMar>
-              <w:top w:w="20" w:type="dxa"/>
-              <w:bottom w:w="20" w:type="dxa"/>
-              <w:left w:w="50" w:type="dxa"/>
-              <w:right w:w="50" w:type="dxa"/>
+              <w:top w:w="16" w:type="dxa"/>
+              <w:bottom w:w="16" w:type="dxa"/>
+              <w:left w:w="40" w:type="dxa"/>
+              <w:right w:w="40" w:type="dxa"/>
             </w:tcMar>
             <w:tcBorders>
               <w:top w:val="single" w:sz="4" w:color="D8D8D8" w:space="0"/>
@@ -7083,10 +7335,10 @@
             <w:tcW w:type="dxa" w:w="1474"/>
             <w:shd w:val="clear" w:color="auto" w:fill="FFFFFF"/>
             <w:tcMar>
-              <w:top w:w="20" w:type="dxa"/>
-              <w:bottom w:w="20" w:type="dxa"/>
-              <w:left w:w="50" w:type="dxa"/>
-              <w:right w:w="50" w:type="dxa"/>
+              <w:top w:w="16" w:type="dxa"/>
+              <w:bottom w:w="16" w:type="dxa"/>
+              <w:left w:w="40" w:type="dxa"/>
+              <w:right w:w="40" w:type="dxa"/>
             </w:tcMar>
             <w:tcBorders>
               <w:top w:val="single" w:sz="4" w:color="D8D8D8" w:space="0"/>
@@ -7116,10 +7368,10 @@
             <w:tcW w:type="dxa" w:w="794"/>
             <w:shd w:val="clear" w:color="auto" w:fill="FFFFFF"/>
             <w:tcMar>
-              <w:top w:w="20" w:type="dxa"/>
-              <w:bottom w:w="20" w:type="dxa"/>
-              <w:left w:w="50" w:type="dxa"/>
-              <w:right w:w="50" w:type="dxa"/>
+              <w:top w:w="16" w:type="dxa"/>
+              <w:bottom w:w="16" w:type="dxa"/>
+              <w:left w:w="40" w:type="dxa"/>
+              <w:right w:w="40" w:type="dxa"/>
             </w:tcMar>
             <w:tcBorders>
               <w:top w:val="single" w:sz="4" w:color="D8D8D8" w:space="0"/>
@@ -7149,10 +7401,10 @@
             <w:tcW w:type="dxa" w:w="1020"/>
             <w:shd w:val="clear" w:color="auto" w:fill="FFFFFF"/>
             <w:tcMar>
-              <w:top w:w="20" w:type="dxa"/>
-              <w:bottom w:w="20" w:type="dxa"/>
-              <w:left w:w="50" w:type="dxa"/>
-              <w:right w:w="50" w:type="dxa"/>
+              <w:top w:w="16" w:type="dxa"/>
+              <w:bottom w:w="16" w:type="dxa"/>
+              <w:left w:w="40" w:type="dxa"/>
+              <w:right w:w="40" w:type="dxa"/>
             </w:tcMar>
             <w:tcBorders>
               <w:top w:val="single" w:sz="4" w:color="D8D8D8" w:space="0"/>
@@ -7182,10 +7434,10 @@
             <w:tcW w:type="dxa" w:w="2494"/>
             <w:shd w:val="clear" w:color="auto" w:fill="FFFFFF"/>
             <w:tcMar>
-              <w:top w:w="20" w:type="dxa"/>
-              <w:bottom w:w="20" w:type="dxa"/>
-              <w:left w:w="50" w:type="dxa"/>
-              <w:right w:w="50" w:type="dxa"/>
+              <w:top w:w="16" w:type="dxa"/>
+              <w:bottom w:w="16" w:type="dxa"/>
+              <w:left w:w="40" w:type="dxa"/>
+              <w:right w:w="40" w:type="dxa"/>
             </w:tcMar>
             <w:tcBorders>
               <w:top w:val="single" w:sz="4" w:color="D8D8D8" w:space="0"/>
@@ -7215,10 +7467,10 @@
             <w:tcW w:type="dxa" w:w="2381"/>
             <w:shd w:val="clear" w:color="auto" w:fill="FFFFFF"/>
             <w:tcMar>
-              <w:top w:w="20" w:type="dxa"/>
-              <w:bottom w:w="20" w:type="dxa"/>
-              <w:left w:w="50" w:type="dxa"/>
-              <w:right w:w="50" w:type="dxa"/>
+              <w:top w:w="16" w:type="dxa"/>
+              <w:bottom w:w="16" w:type="dxa"/>
+              <w:left w:w="40" w:type="dxa"/>
+              <w:right w:w="40" w:type="dxa"/>
             </w:tcMar>
             <w:tcBorders>
               <w:top w:val="single" w:sz="4" w:color="D8D8D8" w:space="0"/>
@@ -7250,10 +7502,10 @@
             <w:tcW w:type="dxa" w:w="454"/>
             <w:shd w:val="clear" w:color="auto" w:fill="F9FBF9"/>
             <w:tcMar>
-              <w:top w:w="20" w:type="dxa"/>
-              <w:bottom w:w="20" w:type="dxa"/>
-              <w:left w:w="50" w:type="dxa"/>
-              <w:right w:w="50" w:type="dxa"/>
+              <w:top w:w="16" w:type="dxa"/>
+              <w:bottom w:w="16" w:type="dxa"/>
+              <w:left w:w="40" w:type="dxa"/>
+              <w:right w:w="40" w:type="dxa"/>
             </w:tcMar>
             <w:tcBorders>
               <w:top w:val="single" w:sz="4" w:color="D8D8D8" w:space="0"/>
@@ -7283,10 +7535,10 @@
             <w:tcW w:type="dxa" w:w="1928"/>
             <w:shd w:val="clear" w:color="auto" w:fill="F9FBF9"/>
             <w:tcMar>
-              <w:top w:w="20" w:type="dxa"/>
-              <w:bottom w:w="20" w:type="dxa"/>
-              <w:left w:w="50" w:type="dxa"/>
-              <w:right w:w="50" w:type="dxa"/>
+              <w:top w:w="16" w:type="dxa"/>
+              <w:bottom w:w="16" w:type="dxa"/>
+              <w:left w:w="40" w:type="dxa"/>
+              <w:right w:w="40" w:type="dxa"/>
             </w:tcMar>
             <w:tcBorders>
               <w:top w:val="single" w:sz="4" w:color="D8D8D8" w:space="0"/>
@@ -7316,10 +7568,10 @@
             <w:tcW w:type="dxa" w:w="1474"/>
             <w:shd w:val="clear" w:color="auto" w:fill="F9FBF9"/>
             <w:tcMar>
-              <w:top w:w="20" w:type="dxa"/>
-              <w:bottom w:w="20" w:type="dxa"/>
-              <w:left w:w="50" w:type="dxa"/>
-              <w:right w:w="50" w:type="dxa"/>
+              <w:top w:w="16" w:type="dxa"/>
+              <w:bottom w:w="16" w:type="dxa"/>
+              <w:left w:w="40" w:type="dxa"/>
+              <w:right w:w="40" w:type="dxa"/>
             </w:tcMar>
             <w:tcBorders>
               <w:top w:val="single" w:sz="4" w:color="D8D8D8" w:space="0"/>
@@ -7349,10 +7601,10 @@
             <w:tcW w:type="dxa" w:w="794"/>
             <w:shd w:val="clear" w:color="auto" w:fill="F9FBF9"/>
             <w:tcMar>
-              <w:top w:w="20" w:type="dxa"/>
-              <w:bottom w:w="20" w:type="dxa"/>
-              <w:left w:w="50" w:type="dxa"/>
-              <w:right w:w="50" w:type="dxa"/>
+              <w:top w:w="16" w:type="dxa"/>
+              <w:bottom w:w="16" w:type="dxa"/>
+              <w:left w:w="40" w:type="dxa"/>
+              <w:right w:w="40" w:type="dxa"/>
             </w:tcMar>
             <w:tcBorders>
               <w:top w:val="single" w:sz="4" w:color="D8D8D8" w:space="0"/>
@@ -7382,10 +7634,10 @@
             <w:tcW w:type="dxa" w:w="1020"/>
             <w:shd w:val="clear" w:color="auto" w:fill="F9FBF9"/>
             <w:tcMar>
-              <w:top w:w="20" w:type="dxa"/>
-              <w:bottom w:w="20" w:type="dxa"/>
-              <w:left w:w="50" w:type="dxa"/>
-              <w:right w:w="50" w:type="dxa"/>
+              <w:top w:w="16" w:type="dxa"/>
+              <w:bottom w:w="16" w:type="dxa"/>
+              <w:left w:w="40" w:type="dxa"/>
+              <w:right w:w="40" w:type="dxa"/>
             </w:tcMar>
             <w:tcBorders>
               <w:top w:val="single" w:sz="4" w:color="D8D8D8" w:space="0"/>
@@ -7415,10 +7667,10 @@
             <w:tcW w:type="dxa" w:w="2494"/>
             <w:shd w:val="clear" w:color="auto" w:fill="F9FBF9"/>
             <w:tcMar>
-              <w:top w:w="20" w:type="dxa"/>
-              <w:bottom w:w="20" w:type="dxa"/>
-              <w:left w:w="50" w:type="dxa"/>
-              <w:right w:w="50" w:type="dxa"/>
+              <w:top w:w="16" w:type="dxa"/>
+              <w:bottom w:w="16" w:type="dxa"/>
+              <w:left w:w="40" w:type="dxa"/>
+              <w:right w:w="40" w:type="dxa"/>
             </w:tcMar>
             <w:tcBorders>
               <w:top w:val="single" w:sz="4" w:color="D8D8D8" w:space="0"/>
@@ -7448,10 +7700,10 @@
             <w:tcW w:type="dxa" w:w="2381"/>
             <w:shd w:val="clear" w:color="auto" w:fill="F9FBF9"/>
             <w:tcMar>
-              <w:top w:w="20" w:type="dxa"/>
-              <w:bottom w:w="20" w:type="dxa"/>
-              <w:left w:w="50" w:type="dxa"/>
-              <w:right w:w="50" w:type="dxa"/>
+              <w:top w:w="16" w:type="dxa"/>
+              <w:bottom w:w="16" w:type="dxa"/>
+              <w:left w:w="40" w:type="dxa"/>
+              <w:right w:w="40" w:type="dxa"/>
             </w:tcMar>
             <w:tcBorders>
               <w:top w:val="single" w:sz="4" w:color="D8D8D8" w:space="0"/>
@@ -7483,10 +7735,10 @@
             <w:tcW w:type="dxa" w:w="454"/>
             <w:shd w:val="clear" w:color="auto" w:fill="FFFFFF"/>
             <w:tcMar>
-              <w:top w:w="20" w:type="dxa"/>
-              <w:bottom w:w="20" w:type="dxa"/>
-              <w:left w:w="50" w:type="dxa"/>
-              <w:right w:w="50" w:type="dxa"/>
+              <w:top w:w="16" w:type="dxa"/>
+              <w:bottom w:w="16" w:type="dxa"/>
+              <w:left w:w="40" w:type="dxa"/>
+              <w:right w:w="40" w:type="dxa"/>
             </w:tcMar>
             <w:tcBorders>
               <w:top w:val="single" w:sz="4" w:color="D8D8D8" w:space="0"/>
@@ -7516,10 +7768,10 @@
             <w:tcW w:type="dxa" w:w="1928"/>
             <w:shd w:val="clear" w:color="auto" w:fill="FFFFFF"/>
             <w:tcMar>
-              <w:top w:w="20" w:type="dxa"/>
-              <w:bottom w:w="20" w:type="dxa"/>
-              <w:left w:w="50" w:type="dxa"/>
-              <w:right w:w="50" w:type="dxa"/>
+              <w:top w:w="16" w:type="dxa"/>
+              <w:bottom w:w="16" w:type="dxa"/>
+              <w:left w:w="40" w:type="dxa"/>
+              <w:right w:w="40" w:type="dxa"/>
             </w:tcMar>
             <w:tcBorders>
               <w:top w:val="single" w:sz="4" w:color="D8D8D8" w:space="0"/>
@@ -7549,10 +7801,10 @@
             <w:tcW w:type="dxa" w:w="1474"/>
             <w:shd w:val="clear" w:color="auto" w:fill="FFFFFF"/>
             <w:tcMar>
-              <w:top w:w="20" w:type="dxa"/>
-              <w:bottom w:w="20" w:type="dxa"/>
-              <w:left w:w="50" w:type="dxa"/>
-              <w:right w:w="50" w:type="dxa"/>
+              <w:top w:w="16" w:type="dxa"/>
+              <w:bottom w:w="16" w:type="dxa"/>
+              <w:left w:w="40" w:type="dxa"/>
+              <w:right w:w="40" w:type="dxa"/>
             </w:tcMar>
             <w:tcBorders>
               <w:top w:val="single" w:sz="4" w:color="D8D8D8" w:space="0"/>
@@ -7582,10 +7834,10 @@
             <w:tcW w:type="dxa" w:w="794"/>
             <w:shd w:val="clear" w:color="auto" w:fill="FFFFFF"/>
             <w:tcMar>
-              <w:top w:w="20" w:type="dxa"/>
-              <w:bottom w:w="20" w:type="dxa"/>
-              <w:left w:w="50" w:type="dxa"/>
-              <w:right w:w="50" w:type="dxa"/>
+              <w:top w:w="16" w:type="dxa"/>
+              <w:bottom w:w="16" w:type="dxa"/>
+              <w:left w:w="40" w:type="dxa"/>
+              <w:right w:w="40" w:type="dxa"/>
             </w:tcMar>
             <w:tcBorders>
               <w:top w:val="single" w:sz="4" w:color="D8D8D8" w:space="0"/>
@@ -7615,10 +7867,10 @@
             <w:tcW w:type="dxa" w:w="1020"/>
             <w:shd w:val="clear" w:color="auto" w:fill="FFFFFF"/>
             <w:tcMar>
-              <w:top w:w="20" w:type="dxa"/>
-              <w:bottom w:w="20" w:type="dxa"/>
-              <w:left w:w="50" w:type="dxa"/>
-              <w:right w:w="50" w:type="dxa"/>
+              <w:top w:w="16" w:type="dxa"/>
+              <w:bottom w:w="16" w:type="dxa"/>
+              <w:left w:w="40" w:type="dxa"/>
+              <w:right w:w="40" w:type="dxa"/>
             </w:tcMar>
             <w:tcBorders>
               <w:top w:val="single" w:sz="4" w:color="D8D8D8" w:space="0"/>
@@ -7648,10 +7900,10 @@
             <w:tcW w:type="dxa" w:w="2494"/>
             <w:shd w:val="clear" w:color="auto" w:fill="FFFFFF"/>
             <w:tcMar>
-              <w:top w:w="20" w:type="dxa"/>
-              <w:bottom w:w="20" w:type="dxa"/>
-              <w:left w:w="50" w:type="dxa"/>
-              <w:right w:w="50" w:type="dxa"/>
+              <w:top w:w="16" w:type="dxa"/>
+              <w:bottom w:w="16" w:type="dxa"/>
+              <w:left w:w="40" w:type="dxa"/>
+              <w:right w:w="40" w:type="dxa"/>
             </w:tcMar>
             <w:tcBorders>
               <w:top w:val="single" w:sz="4" w:color="D8D8D8" w:space="0"/>
@@ -7681,10 +7933,10 @@
             <w:tcW w:type="dxa" w:w="2381"/>
             <w:shd w:val="clear" w:color="auto" w:fill="FFFFFF"/>
             <w:tcMar>
-              <w:top w:w="20" w:type="dxa"/>
-              <w:bottom w:w="20" w:type="dxa"/>
-              <w:left w:w="50" w:type="dxa"/>
-              <w:right w:w="50" w:type="dxa"/>
+              <w:top w:w="16" w:type="dxa"/>
+              <w:bottom w:w="16" w:type="dxa"/>
+              <w:left w:w="40" w:type="dxa"/>
+              <w:right w:w="40" w:type="dxa"/>
             </w:tcMar>
             <w:tcBorders>
               <w:top w:val="single" w:sz="4" w:color="D8D8D8" w:space="0"/>
@@ -7716,10 +7968,10 @@
             <w:tcW w:type="dxa" w:w="454"/>
             <w:shd w:val="clear" w:color="auto" w:fill="F9FBF9"/>
             <w:tcMar>
-              <w:top w:w="20" w:type="dxa"/>
-              <w:bottom w:w="20" w:type="dxa"/>
-              <w:left w:w="50" w:type="dxa"/>
-              <w:right w:w="50" w:type="dxa"/>
+              <w:top w:w="16" w:type="dxa"/>
+              <w:bottom w:w="16" w:type="dxa"/>
+              <w:left w:w="40" w:type="dxa"/>
+              <w:right w:w="40" w:type="dxa"/>
             </w:tcMar>
             <w:tcBorders>
               <w:top w:val="single" w:sz="4" w:color="D8D8D8" w:space="0"/>
@@ -7749,10 +8001,10 @@
             <w:tcW w:type="dxa" w:w="1928"/>
             <w:shd w:val="clear" w:color="auto" w:fill="F9FBF9"/>
             <w:tcMar>
-              <w:top w:w="20" w:type="dxa"/>
-              <w:bottom w:w="20" w:type="dxa"/>
-              <w:left w:w="50" w:type="dxa"/>
-              <w:right w:w="50" w:type="dxa"/>
+              <w:top w:w="16" w:type="dxa"/>
+              <w:bottom w:w="16" w:type="dxa"/>
+              <w:left w:w="40" w:type="dxa"/>
+              <w:right w:w="40" w:type="dxa"/>
             </w:tcMar>
             <w:tcBorders>
               <w:top w:val="single" w:sz="4" w:color="D8D8D8" w:space="0"/>
@@ -7782,10 +8034,10 @@
             <w:tcW w:type="dxa" w:w="1474"/>
             <w:shd w:val="clear" w:color="auto" w:fill="F9FBF9"/>
             <w:tcMar>
-              <w:top w:w="20" w:type="dxa"/>
-              <w:bottom w:w="20" w:type="dxa"/>
-              <w:left w:w="50" w:type="dxa"/>
-              <w:right w:w="50" w:type="dxa"/>
+              <w:top w:w="16" w:type="dxa"/>
+              <w:bottom w:w="16" w:type="dxa"/>
+              <w:left w:w="40" w:type="dxa"/>
+              <w:right w:w="40" w:type="dxa"/>
             </w:tcMar>
             <w:tcBorders>
               <w:top w:val="single" w:sz="4" w:color="D8D8D8" w:space="0"/>
@@ -7815,10 +8067,10 @@
             <w:tcW w:type="dxa" w:w="794"/>
             <w:shd w:val="clear" w:color="auto" w:fill="F9FBF9"/>
             <w:tcMar>
-              <w:top w:w="20" w:type="dxa"/>
-              <w:bottom w:w="20" w:type="dxa"/>
-              <w:left w:w="50" w:type="dxa"/>
-              <w:right w:w="50" w:type="dxa"/>
+              <w:top w:w="16" w:type="dxa"/>
+              <w:bottom w:w="16" w:type="dxa"/>
+              <w:left w:w="40" w:type="dxa"/>
+              <w:right w:w="40" w:type="dxa"/>
             </w:tcMar>
             <w:tcBorders>
               <w:top w:val="single" w:sz="4" w:color="D8D8D8" w:space="0"/>
@@ -7848,10 +8100,10 @@
             <w:tcW w:type="dxa" w:w="1020"/>
             <w:shd w:val="clear" w:color="auto" w:fill="F9FBF9"/>
             <w:tcMar>
-              <w:top w:w="20" w:type="dxa"/>
-              <w:bottom w:w="20" w:type="dxa"/>
-              <w:left w:w="50" w:type="dxa"/>
-              <w:right w:w="50" w:type="dxa"/>
+              <w:top w:w="16" w:type="dxa"/>
+              <w:bottom w:w="16" w:type="dxa"/>
+              <w:left w:w="40" w:type="dxa"/>
+              <w:right w:w="40" w:type="dxa"/>
             </w:tcMar>
             <w:tcBorders>
               <w:top w:val="single" w:sz="4" w:color="D8D8D8" w:space="0"/>
@@ -7881,10 +8133,10 @@
             <w:tcW w:type="dxa" w:w="2494"/>
             <w:shd w:val="clear" w:color="auto" w:fill="F9FBF9"/>
             <w:tcMar>
-              <w:top w:w="20" w:type="dxa"/>
-              <w:bottom w:w="20" w:type="dxa"/>
-              <w:left w:w="50" w:type="dxa"/>
-              <w:right w:w="50" w:type="dxa"/>
+              <w:top w:w="16" w:type="dxa"/>
+              <w:bottom w:w="16" w:type="dxa"/>
+              <w:left w:w="40" w:type="dxa"/>
+              <w:right w:w="40" w:type="dxa"/>
             </w:tcMar>
             <w:tcBorders>
               <w:top w:val="single" w:sz="4" w:color="D8D8D8" w:space="0"/>
@@ -7914,10 +8166,10 @@
             <w:tcW w:type="dxa" w:w="2381"/>
             <w:shd w:val="clear" w:color="auto" w:fill="F9FBF9"/>
             <w:tcMar>
-              <w:top w:w="20" w:type="dxa"/>
-              <w:bottom w:w="20" w:type="dxa"/>
-              <w:left w:w="50" w:type="dxa"/>
-              <w:right w:w="50" w:type="dxa"/>
+              <w:top w:w="16" w:type="dxa"/>
+              <w:bottom w:w="16" w:type="dxa"/>
+              <w:left w:w="40" w:type="dxa"/>
+              <w:right w:w="40" w:type="dxa"/>
             </w:tcMar>
             <w:tcBorders>
               <w:top w:val="single" w:sz="4" w:color="D8D8D8" w:space="0"/>
@@ -7949,10 +8201,10 @@
             <w:tcW w:type="dxa" w:w="454"/>
             <w:shd w:val="clear" w:color="auto" w:fill="FFFFFF"/>
             <w:tcMar>
-              <w:top w:w="20" w:type="dxa"/>
-              <w:bottom w:w="20" w:type="dxa"/>
-              <w:left w:w="50" w:type="dxa"/>
-              <w:right w:w="50" w:type="dxa"/>
+              <w:top w:w="16" w:type="dxa"/>
+              <w:bottom w:w="16" w:type="dxa"/>
+              <w:left w:w="40" w:type="dxa"/>
+              <w:right w:w="40" w:type="dxa"/>
             </w:tcMar>
             <w:tcBorders>
               <w:top w:val="single" w:sz="4" w:color="D8D8D8" w:space="0"/>
@@ -7982,10 +8234,10 @@
             <w:tcW w:type="dxa" w:w="1928"/>
             <w:shd w:val="clear" w:color="auto" w:fill="FFFFFF"/>
             <w:tcMar>
-              <w:top w:w="20" w:type="dxa"/>
-              <w:bottom w:w="20" w:type="dxa"/>
-              <w:left w:w="50" w:type="dxa"/>
-              <w:right w:w="50" w:type="dxa"/>
+              <w:top w:w="16" w:type="dxa"/>
+              <w:bottom w:w="16" w:type="dxa"/>
+              <w:left w:w="40" w:type="dxa"/>
+              <w:right w:w="40" w:type="dxa"/>
             </w:tcMar>
             <w:tcBorders>
               <w:top w:val="single" w:sz="4" w:color="D8D8D8" w:space="0"/>
@@ -8015,10 +8267,10 @@
             <w:tcW w:type="dxa" w:w="1474"/>
             <w:shd w:val="clear" w:color="auto" w:fill="FFFFFF"/>
             <w:tcMar>
-              <w:top w:w="20" w:type="dxa"/>
-              <w:bottom w:w="20" w:type="dxa"/>
-              <w:left w:w="50" w:type="dxa"/>
-              <w:right w:w="50" w:type="dxa"/>
+              <w:top w:w="16" w:type="dxa"/>
+              <w:bottom w:w="16" w:type="dxa"/>
+              <w:left w:w="40" w:type="dxa"/>
+              <w:right w:w="40" w:type="dxa"/>
             </w:tcMar>
             <w:tcBorders>
               <w:top w:val="single" w:sz="4" w:color="D8D8D8" w:space="0"/>
@@ -8048,10 +8300,10 @@
             <w:tcW w:type="dxa" w:w="794"/>
             <w:shd w:val="clear" w:color="auto" w:fill="FFFFFF"/>
             <w:tcMar>
-              <w:top w:w="20" w:type="dxa"/>
-              <w:bottom w:w="20" w:type="dxa"/>
-              <w:left w:w="50" w:type="dxa"/>
-              <w:right w:w="50" w:type="dxa"/>
+              <w:top w:w="16" w:type="dxa"/>
+              <w:bottom w:w="16" w:type="dxa"/>
+              <w:left w:w="40" w:type="dxa"/>
+              <w:right w:w="40" w:type="dxa"/>
             </w:tcMar>
             <w:tcBorders>
               <w:top w:val="single" w:sz="4" w:color="D8D8D8" w:space="0"/>
@@ -8081,10 +8333,10 @@
             <w:tcW w:type="dxa" w:w="1020"/>
             <w:shd w:val="clear" w:color="auto" w:fill="FFFFFF"/>
             <w:tcMar>
-              <w:top w:w="20" w:type="dxa"/>
-              <w:bottom w:w="20" w:type="dxa"/>
-              <w:left w:w="50" w:type="dxa"/>
-              <w:right w:w="50" w:type="dxa"/>
+              <w:top w:w="16" w:type="dxa"/>
+              <w:bottom w:w="16" w:type="dxa"/>
+              <w:left w:w="40" w:type="dxa"/>
+              <w:right w:w="40" w:type="dxa"/>
             </w:tcMar>
             <w:tcBorders>
               <w:top w:val="single" w:sz="4" w:color="D8D8D8" w:space="0"/>
@@ -8114,10 +8366,10 @@
             <w:tcW w:type="dxa" w:w="2494"/>
             <w:shd w:val="clear" w:color="auto" w:fill="FFFFFF"/>
             <w:tcMar>
-              <w:top w:w="20" w:type="dxa"/>
-              <w:bottom w:w="20" w:type="dxa"/>
-              <w:left w:w="50" w:type="dxa"/>
-              <w:right w:w="50" w:type="dxa"/>
+              <w:top w:w="16" w:type="dxa"/>
+              <w:bottom w:w="16" w:type="dxa"/>
+              <w:left w:w="40" w:type="dxa"/>
+              <w:right w:w="40" w:type="dxa"/>
             </w:tcMar>
             <w:tcBorders>
               <w:top w:val="single" w:sz="4" w:color="D8D8D8" w:space="0"/>
@@ -8147,10 +8399,10 @@
             <w:tcW w:type="dxa" w:w="2381"/>
             <w:shd w:val="clear" w:color="auto" w:fill="FFFFFF"/>
             <w:tcMar>
-              <w:top w:w="20" w:type="dxa"/>
-              <w:bottom w:w="20" w:type="dxa"/>
-              <w:left w:w="50" w:type="dxa"/>
-              <w:right w:w="50" w:type="dxa"/>
+              <w:top w:w="16" w:type="dxa"/>
+              <w:bottom w:w="16" w:type="dxa"/>
+              <w:left w:w="40" w:type="dxa"/>
+              <w:right w:w="40" w:type="dxa"/>
             </w:tcMar>
             <w:tcBorders>
               <w:top w:val="single" w:sz="4" w:color="D8D8D8" w:space="0"/>
@@ -8182,10 +8434,10 @@
             <w:tcW w:type="dxa" w:w="454"/>
             <w:shd w:val="clear" w:color="auto" w:fill="F9FBF9"/>
             <w:tcMar>
-              <w:top w:w="20" w:type="dxa"/>
-              <w:bottom w:w="20" w:type="dxa"/>
-              <w:left w:w="50" w:type="dxa"/>
-              <w:right w:w="50" w:type="dxa"/>
+              <w:top w:w="16" w:type="dxa"/>
+              <w:bottom w:w="16" w:type="dxa"/>
+              <w:left w:w="40" w:type="dxa"/>
+              <w:right w:w="40" w:type="dxa"/>
             </w:tcMar>
             <w:tcBorders>
               <w:top w:val="single" w:sz="4" w:color="D8D8D8" w:space="0"/>
@@ -8215,10 +8467,10 @@
             <w:tcW w:type="dxa" w:w="1928"/>
             <w:shd w:val="clear" w:color="auto" w:fill="F9FBF9"/>
             <w:tcMar>
-              <w:top w:w="20" w:type="dxa"/>
-              <w:bottom w:w="20" w:type="dxa"/>
-              <w:left w:w="50" w:type="dxa"/>
-              <w:right w:w="50" w:type="dxa"/>
+              <w:top w:w="16" w:type="dxa"/>
+              <w:bottom w:w="16" w:type="dxa"/>
+              <w:left w:w="40" w:type="dxa"/>
+              <w:right w:w="40" w:type="dxa"/>
             </w:tcMar>
             <w:tcBorders>
               <w:top w:val="single" w:sz="4" w:color="D8D8D8" w:space="0"/>
@@ -8248,10 +8500,10 @@
             <w:tcW w:type="dxa" w:w="1474"/>
             <w:shd w:val="clear" w:color="auto" w:fill="F9FBF9"/>
             <w:tcMar>
-              <w:top w:w="20" w:type="dxa"/>
-              <w:bottom w:w="20" w:type="dxa"/>
-              <w:left w:w="50" w:type="dxa"/>
-              <w:right w:w="50" w:type="dxa"/>
+              <w:top w:w="16" w:type="dxa"/>
+              <w:bottom w:w="16" w:type="dxa"/>
+              <w:left w:w="40" w:type="dxa"/>
+              <w:right w:w="40" w:type="dxa"/>
             </w:tcMar>
             <w:tcBorders>
               <w:top w:val="single" w:sz="4" w:color="D8D8D8" w:space="0"/>
@@ -8281,10 +8533,10 @@
             <w:tcW w:type="dxa" w:w="794"/>
             <w:shd w:val="clear" w:color="auto" w:fill="F9FBF9"/>
             <w:tcMar>
-              <w:top w:w="20" w:type="dxa"/>
-              <w:bottom w:w="20" w:type="dxa"/>
-              <w:left w:w="50" w:type="dxa"/>
-              <w:right w:w="50" w:type="dxa"/>
+              <w:top w:w="16" w:type="dxa"/>
+              <w:bottom w:w="16" w:type="dxa"/>
+              <w:left w:w="40" w:type="dxa"/>
+              <w:right w:w="40" w:type="dxa"/>
             </w:tcMar>
             <w:tcBorders>
               <w:top w:val="single" w:sz="4" w:color="D8D8D8" w:space="0"/>
@@ -8314,10 +8566,10 @@
             <w:tcW w:type="dxa" w:w="1020"/>
             <w:shd w:val="clear" w:color="auto" w:fill="F9FBF9"/>
             <w:tcMar>
-              <w:top w:w="20" w:type="dxa"/>
-              <w:bottom w:w="20" w:type="dxa"/>
-              <w:left w:w="50" w:type="dxa"/>
-              <w:right w:w="50" w:type="dxa"/>
+              <w:top w:w="16" w:type="dxa"/>
+              <w:bottom w:w="16" w:type="dxa"/>
+              <w:left w:w="40" w:type="dxa"/>
+              <w:right w:w="40" w:type="dxa"/>
             </w:tcMar>
             <w:tcBorders>
               <w:top w:val="single" w:sz="4" w:color="D8D8D8" w:space="0"/>
@@ -8347,10 +8599,10 @@
             <w:tcW w:type="dxa" w:w="2494"/>
             <w:shd w:val="clear" w:color="auto" w:fill="F9FBF9"/>
             <w:tcMar>
-              <w:top w:w="20" w:type="dxa"/>
-              <w:bottom w:w="20" w:type="dxa"/>
-              <w:left w:w="50" w:type="dxa"/>
-              <w:right w:w="50" w:type="dxa"/>
+              <w:top w:w="16" w:type="dxa"/>
+              <w:bottom w:w="16" w:type="dxa"/>
+              <w:left w:w="40" w:type="dxa"/>
+              <w:right w:w="40" w:type="dxa"/>
             </w:tcMar>
             <w:tcBorders>
               <w:top w:val="single" w:sz="4" w:color="D8D8D8" w:space="0"/>
@@ -8380,10 +8632,10 @@
             <w:tcW w:type="dxa" w:w="2381"/>
             <w:shd w:val="clear" w:color="auto" w:fill="F9FBF9"/>
             <w:tcMar>
-              <w:top w:w="20" w:type="dxa"/>
-              <w:bottom w:w="20" w:type="dxa"/>
-              <w:left w:w="50" w:type="dxa"/>
-              <w:right w:w="50" w:type="dxa"/>
+              <w:top w:w="16" w:type="dxa"/>
+              <w:bottom w:w="16" w:type="dxa"/>
+              <w:left w:w="40" w:type="dxa"/>
+              <w:right w:w="40" w:type="dxa"/>
             </w:tcMar>
             <w:tcBorders>
               <w:top w:val="single" w:sz="4" w:color="D8D8D8" w:space="0"/>
@@ -8415,10 +8667,10 @@
             <w:tcW w:type="dxa" w:w="454"/>
             <w:shd w:val="clear" w:color="auto" w:fill="FFFFFF"/>
             <w:tcMar>
-              <w:top w:w="20" w:type="dxa"/>
-              <w:bottom w:w="20" w:type="dxa"/>
-              <w:left w:w="50" w:type="dxa"/>
-              <w:right w:w="50" w:type="dxa"/>
+              <w:top w:w="16" w:type="dxa"/>
+              <w:bottom w:w="16" w:type="dxa"/>
+              <w:left w:w="40" w:type="dxa"/>
+              <w:right w:w="40" w:type="dxa"/>
             </w:tcMar>
             <w:tcBorders>
               <w:top w:val="single" w:sz="4" w:color="D8D8D8" w:space="0"/>
@@ -8448,10 +8700,10 @@
             <w:tcW w:type="dxa" w:w="1928"/>
             <w:shd w:val="clear" w:color="auto" w:fill="FFFFFF"/>
             <w:tcMar>
-              <w:top w:w="20" w:type="dxa"/>
-              <w:bottom w:w="20" w:type="dxa"/>
-              <w:left w:w="50" w:type="dxa"/>
-              <w:right w:w="50" w:type="dxa"/>
+              <w:top w:w="16" w:type="dxa"/>
+              <w:bottom w:w="16" w:type="dxa"/>
+              <w:left w:w="40" w:type="dxa"/>
+              <w:right w:w="40" w:type="dxa"/>
             </w:tcMar>
             <w:tcBorders>
               <w:top w:val="single" w:sz="4" w:color="D8D8D8" w:space="0"/>
@@ -8481,10 +8733,10 @@
             <w:tcW w:type="dxa" w:w="1474"/>
             <w:shd w:val="clear" w:color="auto" w:fill="FFFFFF"/>
             <w:tcMar>
-              <w:top w:w="20" w:type="dxa"/>
-              <w:bottom w:w="20" w:type="dxa"/>
-              <w:left w:w="50" w:type="dxa"/>
-              <w:right w:w="50" w:type="dxa"/>
+              <w:top w:w="16" w:type="dxa"/>
+              <w:bottom w:w="16" w:type="dxa"/>
+              <w:left w:w="40" w:type="dxa"/>
+              <w:right w:w="40" w:type="dxa"/>
             </w:tcMar>
             <w:tcBorders>
               <w:top w:val="single" w:sz="4" w:color="D8D8D8" w:space="0"/>
@@ -8514,10 +8766,10 @@
             <w:tcW w:type="dxa" w:w="794"/>
             <w:shd w:val="clear" w:color="auto" w:fill="FFFFFF"/>
             <w:tcMar>
-              <w:top w:w="20" w:type="dxa"/>
-              <w:bottom w:w="20" w:type="dxa"/>
-              <w:left w:w="50" w:type="dxa"/>
-              <w:right w:w="50" w:type="dxa"/>
+              <w:top w:w="16" w:type="dxa"/>
+              <w:bottom w:w="16" w:type="dxa"/>
+              <w:left w:w="40" w:type="dxa"/>
+              <w:right w:w="40" w:type="dxa"/>
             </w:tcMar>
             <w:tcBorders>
               <w:top w:val="single" w:sz="4" w:color="D8D8D8" w:space="0"/>
@@ -8547,10 +8799,10 @@
             <w:tcW w:type="dxa" w:w="1020"/>
             <w:shd w:val="clear" w:color="auto" w:fill="FFFFFF"/>
             <w:tcMar>
-              <w:top w:w="20" w:type="dxa"/>
-              <w:bottom w:w="20" w:type="dxa"/>
-              <w:left w:w="50" w:type="dxa"/>
-              <w:right w:w="50" w:type="dxa"/>
+              <w:top w:w="16" w:type="dxa"/>
+              <w:bottom w:w="16" w:type="dxa"/>
+              <w:left w:w="40" w:type="dxa"/>
+              <w:right w:w="40" w:type="dxa"/>
             </w:tcMar>
             <w:tcBorders>
               <w:top w:val="single" w:sz="4" w:color="D8D8D8" w:space="0"/>
@@ -8580,10 +8832,10 @@
             <w:tcW w:type="dxa" w:w="2494"/>
             <w:shd w:val="clear" w:color="auto" w:fill="FFFFFF"/>
             <w:tcMar>
-              <w:top w:w="20" w:type="dxa"/>
-              <w:bottom w:w="20" w:type="dxa"/>
-              <w:left w:w="50" w:type="dxa"/>
-              <w:right w:w="50" w:type="dxa"/>
+              <w:top w:w="16" w:type="dxa"/>
+              <w:bottom w:w="16" w:type="dxa"/>
+              <w:left w:w="40" w:type="dxa"/>
+              <w:right w:w="40" w:type="dxa"/>
             </w:tcMar>
             <w:tcBorders>
               <w:top w:val="single" w:sz="4" w:color="D8D8D8" w:space="0"/>
@@ -8613,10 +8865,10 @@
             <w:tcW w:type="dxa" w:w="2381"/>
             <w:shd w:val="clear" w:color="auto" w:fill="FFFFFF"/>
             <w:tcMar>
-              <w:top w:w="20" w:type="dxa"/>
-              <w:bottom w:w="20" w:type="dxa"/>
-              <w:left w:w="50" w:type="dxa"/>
-              <w:right w:w="50" w:type="dxa"/>
+              <w:top w:w="16" w:type="dxa"/>
+              <w:bottom w:w="16" w:type="dxa"/>
+              <w:left w:w="40" w:type="dxa"/>
+              <w:right w:w="40" w:type="dxa"/>
             </w:tcMar>
             <w:tcBorders>
               <w:top w:val="single" w:sz="4" w:color="D8D8D8" w:space="0"/>
@@ -8645,7 +8897,7 @@
     </w:tbl>
     <w:p>
       <w:pPr>
-        <w:spacing w:before="80" w:after="30"/>
+        <w:spacing w:before="70" w:after="20"/>
         <w:pBdr>
           <w:bottom w:val="single" w:sz="4" w:space="1" w:color="2E7D32"/>
         </w:pBdr>
@@ -8655,14 +8907,14 @@
           <w:b/>
           <w:i w:val="0"/>
           <w:color w:val="1B5E20"/>
-          <w:sz w:val="19"/>
+          <w:sz w:val="18"/>
         </w:rPr>
         <w:t>1.8 Bagan Alur Kerangka Kerja Riset Bab 1</w:t>
       </w:r>
     </w:p>
     <w:p>
       <w:pPr>
-        <w:spacing w:before="50" w:after="20"/>
+        <w:spacing w:before="40" w:after="20"/>
       </w:pPr>
       <w:r>
         <w:rPr>
@@ -8694,10 +8946,10 @@
             <w:tcW w:type="dxa" w:w="1928"/>
             <w:shd w:val="clear" w:color="auto" w:fill="2E7D32"/>
             <w:tcMar>
-              <w:top w:w="30" w:type="dxa"/>
-              <w:bottom w:w="30" w:type="dxa"/>
-              <w:left w:w="50" w:type="dxa"/>
-              <w:right w:w="50" w:type="dxa"/>
+              <w:top w:w="18" w:type="dxa"/>
+              <w:bottom w:w="18" w:type="dxa"/>
+              <w:left w:w="40" w:type="dxa"/>
+              <w:right w:w="40" w:type="dxa"/>
             </w:tcMar>
             <w:tcBorders>
               <w:top w:val="single" w:sz="4" w:color="D8D8D8" w:space="0"/>
@@ -8727,10 +8979,10 @@
             <w:tcW w:type="dxa" w:w="2494"/>
             <w:shd w:val="clear" w:color="auto" w:fill="2E7D32"/>
             <w:tcMar>
-              <w:top w:w="30" w:type="dxa"/>
-              <w:bottom w:w="30" w:type="dxa"/>
-              <w:left w:w="50" w:type="dxa"/>
-              <w:right w:w="50" w:type="dxa"/>
+              <w:top w:w="18" w:type="dxa"/>
+              <w:bottom w:w="18" w:type="dxa"/>
+              <w:left w:w="40" w:type="dxa"/>
+              <w:right w:w="40" w:type="dxa"/>
             </w:tcMar>
             <w:tcBorders>
               <w:top w:val="single" w:sz="4" w:color="D8D8D8" w:space="0"/>
@@ -8760,10 +9012,10 @@
             <w:tcW w:type="dxa" w:w="3061"/>
             <w:shd w:val="clear" w:color="auto" w:fill="2E7D32"/>
             <w:tcMar>
-              <w:top w:w="30" w:type="dxa"/>
-              <w:bottom w:w="30" w:type="dxa"/>
-              <w:left w:w="50" w:type="dxa"/>
-              <w:right w:w="50" w:type="dxa"/>
+              <w:top w:w="18" w:type="dxa"/>
+              <w:bottom w:w="18" w:type="dxa"/>
+              <w:left w:w="40" w:type="dxa"/>
+              <w:right w:w="40" w:type="dxa"/>
             </w:tcMar>
             <w:tcBorders>
               <w:top w:val="single" w:sz="4" w:color="D8D8D8" w:space="0"/>
@@ -8793,10 +9045,10 @@
             <w:tcW w:type="dxa" w:w="3061"/>
             <w:shd w:val="clear" w:color="auto" w:fill="2E7D32"/>
             <w:tcMar>
-              <w:top w:w="30" w:type="dxa"/>
-              <w:bottom w:w="30" w:type="dxa"/>
-              <w:left w:w="50" w:type="dxa"/>
-              <w:right w:w="50" w:type="dxa"/>
+              <w:top w:w="18" w:type="dxa"/>
+              <w:bottom w:w="18" w:type="dxa"/>
+              <w:left w:w="40" w:type="dxa"/>
+              <w:right w:w="40" w:type="dxa"/>
             </w:tcMar>
             <w:tcBorders>
               <w:top w:val="single" w:sz="4" w:color="D8D8D8" w:space="0"/>
@@ -8828,10 +9080,10 @@
             <w:tcW w:type="dxa" w:w="1928"/>
             <w:shd w:val="clear" w:color="auto" w:fill="FFFFFF"/>
             <w:tcMar>
-              <w:top w:w="20" w:type="dxa"/>
-              <w:bottom w:w="20" w:type="dxa"/>
-              <w:left w:w="50" w:type="dxa"/>
-              <w:right w:w="50" w:type="dxa"/>
+              <w:top w:w="16" w:type="dxa"/>
+              <w:bottom w:w="16" w:type="dxa"/>
+              <w:left w:w="40" w:type="dxa"/>
+              <w:right w:w="40" w:type="dxa"/>
             </w:tcMar>
             <w:tcBorders>
               <w:top w:val="single" w:sz="4" w:color="D8D8D8" w:space="0"/>
@@ -8861,10 +9113,10 @@
             <w:tcW w:type="dxa" w:w="2494"/>
             <w:shd w:val="clear" w:color="auto" w:fill="FFFFFF"/>
             <w:tcMar>
-              <w:top w:w="20" w:type="dxa"/>
-              <w:bottom w:w="20" w:type="dxa"/>
-              <w:left w:w="50" w:type="dxa"/>
-              <w:right w:w="50" w:type="dxa"/>
+              <w:top w:w="16" w:type="dxa"/>
+              <w:bottom w:w="16" w:type="dxa"/>
+              <w:left w:w="40" w:type="dxa"/>
+              <w:right w:w="40" w:type="dxa"/>
             </w:tcMar>
             <w:tcBorders>
               <w:top w:val="single" w:sz="4" w:color="D8D8D8" w:space="0"/>
@@ -8894,10 +9146,10 @@
             <w:tcW w:type="dxa" w:w="3061"/>
             <w:shd w:val="clear" w:color="auto" w:fill="FFFFFF"/>
             <w:tcMar>
-              <w:top w:w="20" w:type="dxa"/>
-              <w:bottom w:w="20" w:type="dxa"/>
-              <w:left w:w="50" w:type="dxa"/>
-              <w:right w:w="50" w:type="dxa"/>
+              <w:top w:w="16" w:type="dxa"/>
+              <w:bottom w:w="16" w:type="dxa"/>
+              <w:left w:w="40" w:type="dxa"/>
+              <w:right w:w="40" w:type="dxa"/>
             </w:tcMar>
             <w:tcBorders>
               <w:top w:val="single" w:sz="4" w:color="D8D8D8" w:space="0"/>
@@ -8927,10 +9179,10 @@
             <w:tcW w:type="dxa" w:w="3061"/>
             <w:shd w:val="clear" w:color="auto" w:fill="FFFFFF"/>
             <w:tcMar>
-              <w:top w:w="20" w:type="dxa"/>
-              <w:bottom w:w="20" w:type="dxa"/>
-              <w:left w:w="50" w:type="dxa"/>
-              <w:right w:w="50" w:type="dxa"/>
+              <w:top w:w="16" w:type="dxa"/>
+              <w:bottom w:w="16" w:type="dxa"/>
+              <w:left w:w="40" w:type="dxa"/>
+              <w:right w:w="40" w:type="dxa"/>
             </w:tcMar>
             <w:tcBorders>
               <w:top w:val="single" w:sz="4" w:color="D8D8D8" w:space="0"/>
@@ -8962,10 +9214,10 @@
             <w:tcW w:type="dxa" w:w="1928"/>
             <w:shd w:val="clear" w:color="auto" w:fill="F9FBF9"/>
             <w:tcMar>
-              <w:top w:w="20" w:type="dxa"/>
-              <w:bottom w:w="20" w:type="dxa"/>
-              <w:left w:w="50" w:type="dxa"/>
-              <w:right w:w="50" w:type="dxa"/>
+              <w:top w:w="16" w:type="dxa"/>
+              <w:bottom w:w="16" w:type="dxa"/>
+              <w:left w:w="40" w:type="dxa"/>
+              <w:right w:w="40" w:type="dxa"/>
             </w:tcMar>
             <w:tcBorders>
               <w:top w:val="single" w:sz="4" w:color="D8D8D8" w:space="0"/>
@@ -8995,10 +9247,10 @@
             <w:tcW w:type="dxa" w:w="2494"/>
             <w:shd w:val="clear" w:color="auto" w:fill="F9FBF9"/>
             <w:tcMar>
-              <w:top w:w="20" w:type="dxa"/>
-              <w:bottom w:w="20" w:type="dxa"/>
-              <w:left w:w="50" w:type="dxa"/>
-              <w:right w:w="50" w:type="dxa"/>
+              <w:top w:w="16" w:type="dxa"/>
+              <w:bottom w:w="16" w:type="dxa"/>
+              <w:left w:w="40" w:type="dxa"/>
+              <w:right w:w="40" w:type="dxa"/>
             </w:tcMar>
             <w:tcBorders>
               <w:top w:val="single" w:sz="4" w:color="D8D8D8" w:space="0"/>
@@ -9028,10 +9280,10 @@
             <w:tcW w:type="dxa" w:w="3061"/>
             <w:shd w:val="clear" w:color="auto" w:fill="F9FBF9"/>
             <w:tcMar>
-              <w:top w:w="20" w:type="dxa"/>
-              <w:bottom w:w="20" w:type="dxa"/>
-              <w:left w:w="50" w:type="dxa"/>
-              <w:right w:w="50" w:type="dxa"/>
+              <w:top w:w="16" w:type="dxa"/>
+              <w:bottom w:w="16" w:type="dxa"/>
+              <w:left w:w="40" w:type="dxa"/>
+              <w:right w:w="40" w:type="dxa"/>
             </w:tcMar>
             <w:tcBorders>
               <w:top w:val="single" w:sz="4" w:color="D8D8D8" w:space="0"/>
@@ -9061,10 +9313,10 @@
             <w:tcW w:type="dxa" w:w="3061"/>
             <w:shd w:val="clear" w:color="auto" w:fill="F9FBF9"/>
             <w:tcMar>
-              <w:top w:w="20" w:type="dxa"/>
-              <w:bottom w:w="20" w:type="dxa"/>
-              <w:left w:w="50" w:type="dxa"/>
-              <w:right w:w="50" w:type="dxa"/>
+              <w:top w:w="16" w:type="dxa"/>
+              <w:bottom w:w="16" w:type="dxa"/>
+              <w:left w:w="40" w:type="dxa"/>
+              <w:right w:w="40" w:type="dxa"/>
             </w:tcMar>
             <w:tcBorders>
               <w:top w:val="single" w:sz="4" w:color="D8D8D8" w:space="0"/>
@@ -9096,10 +9348,10 @@
             <w:tcW w:type="dxa" w:w="1928"/>
             <w:shd w:val="clear" w:color="auto" w:fill="FFFFFF"/>
             <w:tcMar>
-              <w:top w:w="20" w:type="dxa"/>
-              <w:bottom w:w="20" w:type="dxa"/>
-              <w:left w:w="50" w:type="dxa"/>
-              <w:right w:w="50" w:type="dxa"/>
+              <w:top w:w="16" w:type="dxa"/>
+              <w:bottom w:w="16" w:type="dxa"/>
+              <w:left w:w="40" w:type="dxa"/>
+              <w:right w:w="40" w:type="dxa"/>
             </w:tcMar>
             <w:tcBorders>
               <w:top w:val="single" w:sz="4" w:color="D8D8D8" w:space="0"/>
@@ -9129,10 +9381,10 @@
             <w:tcW w:type="dxa" w:w="2494"/>
             <w:shd w:val="clear" w:color="auto" w:fill="FFFFFF"/>
             <w:tcMar>
-              <w:top w:w="20" w:type="dxa"/>
-              <w:bottom w:w="20" w:type="dxa"/>
-              <w:left w:w="50" w:type="dxa"/>
-              <w:right w:w="50" w:type="dxa"/>
+              <w:top w:w="16" w:type="dxa"/>
+              <w:bottom w:w="16" w:type="dxa"/>
+              <w:left w:w="40" w:type="dxa"/>
+              <w:right w:w="40" w:type="dxa"/>
             </w:tcMar>
             <w:tcBorders>
               <w:top w:val="single" w:sz="4" w:color="D8D8D8" w:space="0"/>
@@ -9162,10 +9414,10 @@
             <w:tcW w:type="dxa" w:w="3061"/>
             <w:shd w:val="clear" w:color="auto" w:fill="FFFFFF"/>
             <w:tcMar>
-              <w:top w:w="20" w:type="dxa"/>
-              <w:bottom w:w="20" w:type="dxa"/>
-              <w:left w:w="50" w:type="dxa"/>
-              <w:right w:w="50" w:type="dxa"/>
+              <w:top w:w="16" w:type="dxa"/>
+              <w:bottom w:w="16" w:type="dxa"/>
+              <w:left w:w="40" w:type="dxa"/>
+              <w:right w:w="40" w:type="dxa"/>
             </w:tcMar>
             <w:tcBorders>
               <w:top w:val="single" w:sz="4" w:color="D8D8D8" w:space="0"/>
@@ -9195,10 +9447,10 @@
             <w:tcW w:type="dxa" w:w="3061"/>
             <w:shd w:val="clear" w:color="auto" w:fill="FFFFFF"/>
             <w:tcMar>
-              <w:top w:w="20" w:type="dxa"/>
-              <w:bottom w:w="20" w:type="dxa"/>
-              <w:left w:w="50" w:type="dxa"/>
-              <w:right w:w="50" w:type="dxa"/>
+              <w:top w:w="16" w:type="dxa"/>
+              <w:bottom w:w="16" w:type="dxa"/>
+              <w:left w:w="40" w:type="dxa"/>
+              <w:right w:w="40" w:type="dxa"/>
             </w:tcMar>
             <w:tcBorders>
               <w:top w:val="single" w:sz="4" w:color="D8D8D8" w:space="0"/>
@@ -9230,10 +9482,10 @@
             <w:tcW w:type="dxa" w:w="1928"/>
             <w:shd w:val="clear" w:color="auto" w:fill="F9FBF9"/>
             <w:tcMar>
-              <w:top w:w="20" w:type="dxa"/>
-              <w:bottom w:w="20" w:type="dxa"/>
-              <w:left w:w="50" w:type="dxa"/>
-              <w:right w:w="50" w:type="dxa"/>
+              <w:top w:w="16" w:type="dxa"/>
+              <w:bottom w:w="16" w:type="dxa"/>
+              <w:left w:w="40" w:type="dxa"/>
+              <w:right w:w="40" w:type="dxa"/>
             </w:tcMar>
             <w:tcBorders>
               <w:top w:val="single" w:sz="4" w:color="D8D8D8" w:space="0"/>
@@ -9263,10 +9515,10 @@
             <w:tcW w:type="dxa" w:w="2494"/>
             <w:shd w:val="clear" w:color="auto" w:fill="F9FBF9"/>
             <w:tcMar>
-              <w:top w:w="20" w:type="dxa"/>
-              <w:bottom w:w="20" w:type="dxa"/>
-              <w:left w:w="50" w:type="dxa"/>
-              <w:right w:w="50" w:type="dxa"/>
+              <w:top w:w="16" w:type="dxa"/>
+              <w:bottom w:w="16" w:type="dxa"/>
+              <w:left w:w="40" w:type="dxa"/>
+              <w:right w:w="40" w:type="dxa"/>
             </w:tcMar>
             <w:tcBorders>
               <w:top w:val="single" w:sz="4" w:color="D8D8D8" w:space="0"/>
@@ -9296,10 +9548,10 @@
             <w:tcW w:type="dxa" w:w="3061"/>
             <w:shd w:val="clear" w:color="auto" w:fill="F9FBF9"/>
             <w:tcMar>
-              <w:top w:w="20" w:type="dxa"/>
-              <w:bottom w:w="20" w:type="dxa"/>
-              <w:left w:w="50" w:type="dxa"/>
-              <w:right w:w="50" w:type="dxa"/>
+              <w:top w:w="16" w:type="dxa"/>
+              <w:bottom w:w="16" w:type="dxa"/>
+              <w:left w:w="40" w:type="dxa"/>
+              <w:right w:w="40" w:type="dxa"/>
             </w:tcMar>
             <w:tcBorders>
               <w:top w:val="single" w:sz="4" w:color="D8D8D8" w:space="0"/>
@@ -9329,10 +9581,10 @@
             <w:tcW w:type="dxa" w:w="3061"/>
             <w:shd w:val="clear" w:color="auto" w:fill="F9FBF9"/>
             <w:tcMar>
-              <w:top w:w="20" w:type="dxa"/>
-              <w:bottom w:w="20" w:type="dxa"/>
-              <w:left w:w="50" w:type="dxa"/>
-              <w:right w:w="50" w:type="dxa"/>
+              <w:top w:w="16" w:type="dxa"/>
+              <w:bottom w:w="16" w:type="dxa"/>
+              <w:left w:w="40" w:type="dxa"/>
+              <w:right w:w="40" w:type="dxa"/>
             </w:tcMar>
             <w:tcBorders>
               <w:top w:val="single" w:sz="4" w:color="D8D8D8" w:space="0"/>

</xml_diff>

<commit_message>
feat: revisi publik Bab 1 & Bab 2 compact (konfigurasi crosstab, sumber institusi, notasi mudah dibaca, 3 halaman)
- Tambah Tabel Konfigurasi Variabel Uji Crosstab konsolidasi (Tabel 1.3 & Tabel 2.4) sebelum tabel sintesis inferensial
- Ganti seluruh sumber data file CSV menjadi nama institusi resmi (BPS, ESDM/Minerbaone, KLHK, GEM, GFW, NASA TROPOMI, GBIF, IUCN); hapus kolom Dataset File di Matriks Indikator Bab 1
- Rombak notasi formulasi ke gaya "mudah dibaca publik" ala ref Celios-Metodologi-Statistik-2 (variabel deskriptif, tanpa Sigma/subscript)
- Longgarkan page budget menjadi maksimal 3-4 lembar; kedua bab terverifikasi Word COM tepat 3 halaman
- Update RULES_DOKUMENTASI_COMPACT.md dan PROMPT_COMPACT.md (7 Aturan Emas) untuk Bab 3 dst.

Co-Authored-By: Claude Fable 5 <noreply@anthropic.com>
</commit_message>
<xml_diff>
--- a/tools/report_metodologi/bab_1/Metodologi_Bab1_Ekspansi_Industri_Compact.docx
+++ b/tools/report_metodologi/bab_1/Metodologi_Bab1_Ekspansi_Industri_Compact.docx
@@ -1235,13 +1235,13 @@
           <w:color w:val="104010"/>
           <w:sz w:val="14"/>
         </w:rPr>
-        <w:t>Sektor_Ekstraktif = PDRB(Kat.B: Pertambangan) + PDRB(Kat.C: Ind. Pengolahan) + PDRB(Kat.D: Listrik)</w:t>
+        <w:t>Sektor Ekstraktif = PDRB Pertambangan (Kat. B) + PDRB Industri Pengolahan/Smelter (Kat. C) + PDRB Listrik/PLTU (Kat. D)</w:t>
         <w:br/>
-        <w:t>Total_PDRB = Sektor_Ekstraktif + Sektor_Akar_Rumput(Kat.A) + Sektor_Jasa(Kat.E s.d. U)</w:t>
+        <w:t>Total PDRB = Sektor Ekstraktif + Sektor Akar Rumput (Kat. A) + Sektor Jasa &amp; Lainnya (Kat. E s.d. U)</w:t>
         <w:br/>
-        <w:t>Pangsa_Ekstraktif (%) = ( Sektor_Ekstraktif / Total_PDRB ) * 100</w:t>
+        <w:t>Pangsa Ekstraktif (%) = ( Sektor Ekstraktif ÷ Total PDRB ) × 100%</w:t>
         <w:br/>
-        <w:t>Laju_Pertumbuhan (%) = [ ( Nilai_Tahun_t - Nilai_Tahun_{t-1} ) / Nilai_Tahun_{t-1} ] * 100</w:t>
+        <w:t>Laju Pertumbuhan (%) = ( ( Nilai Tahun Ini - Nilai Tahun Sebelumnya ) ÷ Nilai Tahun Sebelumnya ) × 100%</w:t>
         <w:br/>
       </w:r>
       <w:r>
@@ -1262,11 +1262,11 @@
           <w:color w:val="222222"/>
           <w:sz w:val="14"/>
         </w:rPr>
-        <w:t>Sektor_Ekstraktif_2024 (Sulteng) = Rp28.450 M + Rp173.864 M + Rp8.200 M = Rp210.513,75 Miliar (Rp210,51 Triliun)</w:t>
+        <w:t>Sektor Ekstraktif Sulteng 2024 = Rp28.450 M (Tambang) + Rp173.864 M (Smelter) + Rp8.200 M (Listrik) = Rp210.513,75 Miliar (Rp210,51 Triliun)</w:t>
         <w:br/>
-        <w:t>Pangsa_Ekstraktif_2024 = ( 210.513,75 Miliar / 376.950,31 Miliar ) * 100% = 55,85%</w:t>
+        <w:t>Pangsa Ekstraktif 2024 = ( Rp210.513,75 Miliar ÷ Rp376.950,31 Miliar ) × 100% = 55,85%</w:t>
         <w:br/>
-        <w:t>Laju_Pertumbuhan = [ (Rp210,51 T - Rp28,45 T) / Rp28,45 T ] * 100% = +639,93% (Meroket 7,40 Kali Lipat)</w:t>
+        <w:t>Laju Pertumbuhan = ( ( Rp210,51 T - Rp28,45 T ) ÷ Rp28,45 T ) × 100% = +639,93% (Meroket 7,40 Kali Lipat)</w:t>
       </w:r>
       <w:r>
         <w:rPr>
@@ -3018,11 +3018,11 @@
           <w:color w:val="104010"/>
           <w:sz w:val="14"/>
         </w:rPr>
-        <w:t>Sektor_Ekstraktif_Kab = PDRB_Kab(Kat.B) + PDRB_Kab(Kat.C) + PDRB_Kab(Kat.D)</w:t>
+        <w:t>Sektor Ekstraktif Kabupaten = PDRB Pertambangan + PDRB Industri Pengolahan + PDRB Listrik (level kabupaten)</w:t>
         <w:br/>
-        <w:t>Porsi_Sektor_Kab (%) = ( Nilai_Sektor_Kab / Total_PDRB_Kab ) * 100</w:t>
+        <w:t>Porsi Sektor (%) = ( Nilai Sektor Kabupaten ÷ Total PDRB Kabupaten ) × 100%</w:t>
         <w:br/>
-        <w:t>Rasio_Kesenjangan = Sektor_Ekstraktif_Morowali / Sektor_Akar_Rumput_Morowali</w:t>
+        <w:t>Rasio Kesenjangan = Sektor Ekstraktif Morowali ÷ Sektor Pertanian Rakyat Morowali</w:t>
         <w:br/>
       </w:r>
       <w:r>
@@ -3043,13 +3043,13 @@
           <w:color w:val="222222"/>
           <w:sz w:val="14"/>
         </w:rPr>
-        <w:t>Sektor_Ekstraktif_Morowali = Rp29,20 T (Tambang) + Rp127,96 T (Smelter) = Rp157,17 Triliun (Porsi: 45,20%)</w:t>
+        <w:t>Sektor Ekstraktif Morowali = Rp29,20 T (Tambang) + Rp127,96 T (Smelter) = Rp157,17 Triliun (Porsi: 45,20%)</w:t>
         <w:br/>
-        <w:t>Sektor_Akar_Rumput_Morowali = Rp2,70 Triliun (Porsi: 0,78%)</w:t>
+        <w:t>Sektor Pertanian Rakyat Morowali = Rp2,70 Triliun (Porsi: 0,78%)</w:t>
         <w:br/>
-        <w:t>Rasio_Kesenjangan_Morowali = Rp157,17 Triliun / Rp2,70 Triliun = 58,21 Kali Lipat</w:t>
+        <w:t>Rasio Kesenjangan Morowali = Rp157,17 Triliun ÷ Rp2,70 Triliun = 58,21 Kali Lipat</w:t>
         <w:br/>
-        <w:t>Komparasi_Wilayah: Sektor ekstraktif Morowali (Rp157,17 T) &gt; Gabungan 8 Kab. Non-Sentra Sulteng (Rp115,22 T)</w:t>
+        <w:t>Komparasi Wilayah: Sektor ekstraktif Morowali (Rp157,17 T) &gt; Gabungan 8 Kabupaten Non-Sentra Sulteng (Rp115,22 T)</w:t>
       </w:r>
       <w:r>
         <w:rPr>
@@ -3186,9 +3186,9 @@
           <w:color w:val="104010"/>
           <w:sz w:val="14"/>
         </w:rPr>
-        <w:t>Porsi_Konsentrasi (%) = ( Kapasitas_Sentra / Total_Kapasitas_Sulawesi ) * 100</w:t>
+        <w:t>Porsi Konsentrasi (%) = ( Kapasitas PLTU Wilayah Sentra ÷ Total Kapasitas se-Sulawesi ) × 100%</w:t>
         <w:br/>
-        <w:t>χ² = Σ [ ( O_ij - E_ij )² / E_ij ]  |  Odds_Ratio (OR) = ( a * d ) / ( b * c )</w:t>
+        <w:t>Chi-Square (χ²) = Jumlah dari [ ( Frekuensi Observasi - Frekuensi Harapan )² ÷ Frekuensi Harapan ]  |  Odds Ratio (OR) = ( a × d ) ÷ ( b × c )</w:t>
         <w:br/>
       </w:r>
       <w:r>
@@ -3209,7 +3209,7 @@
           <w:color w:val="222222"/>
           <w:sz w:val="14"/>
         </w:rPr>
-        <w:t>Konsentrasi_Morowali_Konawe = ( 8.750 MW / 9.825 MW ) * 100% = 89,06% Daya Terkunci</w:t>
+        <w:t>Konsentrasi Morowali + Konawe = ( 8.750 MW ÷ 9.825 MW ) × 100% = 89,06% Daya Terkunci</w:t>
       </w:r>
       <w:r>
         <w:rPr>
@@ -3219,7 +3219,7 @@
           <w:sz w:val="14"/>
         </w:rPr>
         <w:br/>
-        <w:t>Ket: Hasil pengujian statistik tabulasi silang (Chi-Square &amp; Odds Ratio) dirinci secara komprehensif pada Tabel 1.3.</w:t>
+        <w:t>Ket: Hasil pengujian statistik tabulasi silang (Chi-Square &amp; Odds Ratio) dirinci secara komprehensif pada Tabel 1.4, dengan konfigurasi variabel uji pada Tabel 1.3.</w:t>
       </w:r>
     </w:p>
     <w:p>
@@ -3335,11 +3335,11 @@
           <w:color w:val="104010"/>
           <w:sz w:val="14"/>
         </w:rPr>
-        <w:t>Pertumbuhan_Izin (%) = [ ( IUP_t - IUP_{t-1} ) / IUP_{t-1} ] * 100</w:t>
+        <w:t>Pertumbuhan Izin (%) = ( ( Izin Tahun Ini - Izin Tahun Sebelumnya ) ÷ Izin Tahun Sebelumnya ) × 100%</w:t>
         <w:br/>
-        <w:t>Laju_Alih_Ruang_Harian = Luas_Konsesi_Total / 3.650 Hari</w:t>
+        <w:t>Laju Alih Ruang Harian = Total Luas Konsesi 10 Tahun ÷ 3.650 Hari</w:t>
         <w:br/>
-        <w:t>χ² = Σ [ ( O - E )² / E ]  |  Odds_Ratio (OR) = ( a * d ) / ( b * c )</w:t>
+        <w:t>Chi-Square (χ²) = Jumlah dari [ ( Frekuensi Observasi - Frekuensi Harapan )² ÷ Frekuensi Harapan ]  |  Odds Ratio (OR) = ( a × d ) ÷ ( b × c )</w:t>
         <w:br/>
       </w:r>
       <w:r>
@@ -3360,9 +3360,9 @@
           <w:color w:val="222222"/>
           <w:sz w:val="14"/>
         </w:rPr>
-        <w:t>Lonjakan_IUP_2022_2024 = [ (194 izin - 56 izin) / 56 izin ] * 100% = +246,43%</w:t>
+        <w:t>Lonjakan IUP 2022–2024 = ( ( 194 izin - 56 izin ) ÷ 56 izin ) × 100% = +246,43%</w:t>
         <w:br/>
-        <w:t>Laju_Alih_Ruang = 819.452,54 Ha / 3.650 Hari = 224,51 Hektar/Hari (Setara 314 Lapangan Bola/Hari)</w:t>
+        <w:t>Laju Alih Ruang = 819.452,54 Ha ÷ 3.650 Hari = 224,51 Hektar/Hari (Setara 314 Lapangan Bola/Hari)</w:t>
       </w:r>
       <w:r>
         <w:rPr>
@@ -3372,7 +3372,7 @@
           <w:sz w:val="14"/>
         </w:rPr>
         <w:br/>
-        <w:t>Ket: Hasil pengujian statistik tabulasi silang (Chi-Square &amp; Odds Ratio) dirinci secara komprehensif pada Tabel 1.3.</w:t>
+        <w:t>Ket: Hasil pengujian statistik tabulasi silang (Chi-Square &amp; Odds Ratio) dirinci secara komprehensif pada Tabel 1.4, dengan konfigurasi variabel uji pada Tabel 1.3.</w:t>
       </w:r>
     </w:p>
     <w:p>
@@ -3488,11 +3488,11 @@
           <w:color w:val="104010"/>
           <w:sz w:val="14"/>
         </w:rPr>
-        <w:t>Konsentrasi_PMDN (%) = ( PMDN_Sentra / Total_PMDN ) * 100</w:t>
+        <w:t>Konsentrasi PMDN (%) = ( PMDN 3 Provinsi Sentra ÷ Total PMDN Sulawesi ) × 100%</w:t>
         <w:br/>
-        <w:t>Rasio_Kerusakan = Deforestasi_Komoditas / Deforestasi_Pertanian_Rakyat</w:t>
+        <w:t>Rasio Kerusakan = Deforestasi Komoditas (Tambang/Sawit) ÷ Deforestasi Pertanian Rakyat</w:t>
         <w:br/>
-        <w:t>χ² = Σ [ ( O - E )² / E ]  |  Odds_Ratio (OR) = ( a * d ) / ( b * c )</w:t>
+        <w:t>Chi-Square (χ²) = Jumlah dari [ ( Frekuensi Observasi - Frekuensi Harapan )² ÷ Frekuensi Harapan ]  |  Odds Ratio (OR) = ( a × d ) ÷ ( b × c )</w:t>
         <w:br/>
       </w:r>
       <w:r>
@@ -3513,9 +3513,9 @@
           <w:color w:val="222222"/>
           <w:sz w:val="14"/>
         </w:rPr>
-        <w:t>Konsentrasi_PMDN = ( Rp194,89 Triliun / Rp218,98 Triliun ) * 100% = 89,00% Tertumpuk di Sulteng, Sultra, Sulsel</w:t>
+        <w:t>Konsentrasi PMDN = ( Rp194,89 Triliun ÷ Rp218,98 Triliun ) × 100% = 89,00% Tertumpuk di Sulteng, Sultra, Sulsel</w:t>
         <w:br/>
-        <w:t>Rasio_Kerusakan = 1.001.654 Ha (Tambang/Sawit) / 55.905 Ha (Pertanian Rakyat) = 17,92 Kali Lipat Lebih Masif</w:t>
+        <w:t>Rasio Kerusakan = 1.001.654 Ha (Tambang/Sawit) ÷ 55.905 Ha (Pertanian Rakyat) = 17,92 Kali Lipat Lebih Masif</w:t>
       </w:r>
       <w:r>
         <w:rPr>
@@ -3525,7 +3525,7 @@
           <w:sz w:val="14"/>
         </w:rPr>
         <w:br/>
-        <w:t>Ket: Hasil pengujian statistik tabulasi silang (Chi-Square &amp; Odds Ratio) dirinci secara komprehensif pada Tabel 1.3.</w:t>
+        <w:t>Ket: Hasil pengujian statistik tabulasi silang (Chi-Square &amp; Odds Ratio) dirinci secara komprehensif pada Tabel 1.4, dengan konfigurasi variabel uji pada Tabel 1.3.</w:t>
       </w:r>
     </w:p>
     <w:p>
@@ -3539,7 +3539,974 @@
           <w:color w:val="2E7D32"/>
           <w:sz w:val="15"/>
         </w:rPr>
-        <w:t>Tabel 1.3: Ringkasan Hasil Uji Independensi Chi-Square (χ²) dan Odds Ratio (OR) Data Panel Bab 1 (N=60)</w:t>
+        <w:t>Tabel 1.3: Konfigurasi Variabel Uji Tabulasi Silang (Crosstab) Bab 1 — Skenario Sub-bab 1.2, 1.3, dan 1.4</w:t>
+      </w:r>
+    </w:p>
+    <w:tbl>
+      <w:tblPr>
+        <w:tblStyle w:val="TableGrid"/>
+        <w:tblW w:type="auto" w:w="0"/>
+        <w:jc w:val="center"/>
+        <w:tblLayout w:type="fixed"/>
+        <w:tblLook w:firstColumn="1" w:firstRow="1" w:lastColumn="0" w:lastRow="0" w:noHBand="0" w:noVBand="1" w:val="04A0"/>
+      </w:tblPr>
+      <w:tblGrid>
+        <w:gridCol w:w="2720"/>
+        <w:gridCol w:w="2720"/>
+        <w:gridCol w:w="2720"/>
+        <w:gridCol w:w="2720"/>
+      </w:tblGrid>
+      <w:tr>
+        <w:tc>
+          <w:tcPr>
+            <w:tcW w:type="dxa" w:w="1814"/>
+            <w:shd w:val="clear" w:color="auto" w:fill="2E7D32"/>
+            <w:tcMar>
+              <w:top w:w="18" w:type="dxa"/>
+              <w:bottom w:w="18" w:type="dxa"/>
+              <w:left w:w="40" w:type="dxa"/>
+              <w:right w:w="40" w:type="dxa"/>
+            </w:tcMar>
+            <w:tcBorders>
+              <w:top w:val="single" w:sz="4" w:color="D8D8D8" w:space="0"/>
+              <w:left w:val="single" w:sz="4" w:color="D8D8D8" w:space="0"/>
+              <w:bottom w:val="single" w:sz="8" w:color="1B5E20" w:space="0"/>
+              <w:right w:val="single" w:sz="4" w:color="D8D8D8" w:space="0"/>
+            </w:tcBorders>
+          </w:tcPr>
+          <w:p>
+            <w:pPr>
+              <w:spacing w:before="0" w:after="0" w:line="240" w:lineRule="auto"/>
+              <w:jc w:val="left"/>
+            </w:pPr>
+            <w:r>
+              <w:rPr>
+                <w:b/>
+                <w:i w:val="0"/>
+                <w:color w:val="FFFFFF"/>
+                <w:sz w:val="15"/>
+              </w:rPr>
+              <w:t>Komponen Uji</w:t>
+            </w:r>
+          </w:p>
+        </w:tc>
+        <w:tc>
+          <w:tcPr>
+            <w:tcW w:type="dxa" w:w="2891"/>
+            <w:shd w:val="clear" w:color="auto" w:fill="2E7D32"/>
+            <w:tcMar>
+              <w:top w:w="18" w:type="dxa"/>
+              <w:bottom w:w="18" w:type="dxa"/>
+              <w:left w:w="40" w:type="dxa"/>
+              <w:right w:w="40" w:type="dxa"/>
+            </w:tcMar>
+            <w:tcBorders>
+              <w:top w:val="single" w:sz="4" w:color="D8D8D8" w:space="0"/>
+              <w:left w:val="single" w:sz="4" w:color="D8D8D8" w:space="0"/>
+              <w:bottom w:val="single" w:sz="8" w:color="1B5E20" w:space="0"/>
+              <w:right w:val="single" w:sz="4" w:color="D8D8D8" w:space="0"/>
+            </w:tcBorders>
+          </w:tcPr>
+          <w:p>
+            <w:pPr>
+              <w:spacing w:before="0" w:after="0" w:line="240" w:lineRule="auto"/>
+              <w:jc w:val="left"/>
+            </w:pPr>
+            <w:r>
+              <w:rPr>
+                <w:b/>
+                <w:i w:val="0"/>
+                <w:color w:val="FFFFFF"/>
+                <w:sz w:val="15"/>
+              </w:rPr>
+              <w:t>1.2 PLTU Captive vs Deforestasi</w:t>
+            </w:r>
+          </w:p>
+        </w:tc>
+        <w:tc>
+          <w:tcPr>
+            <w:tcW w:type="dxa" w:w="2948"/>
+            <w:shd w:val="clear" w:color="auto" w:fill="2E7D32"/>
+            <w:tcMar>
+              <w:top w:w="18" w:type="dxa"/>
+              <w:bottom w:w="18" w:type="dxa"/>
+              <w:left w:w="40" w:type="dxa"/>
+              <w:right w:w="40" w:type="dxa"/>
+            </w:tcMar>
+            <w:tcBorders>
+              <w:top w:val="single" w:sz="4" w:color="D8D8D8" w:space="0"/>
+              <w:left w:val="single" w:sz="4" w:color="D8D8D8" w:space="0"/>
+              <w:bottom w:val="single" w:sz="8" w:color="1B5E20" w:space="0"/>
+              <w:right w:val="single" w:sz="4" w:color="D8D8D8" w:space="0"/>
+            </w:tcBorders>
+          </w:tcPr>
+          <w:p>
+            <w:pPr>
+              <w:spacing w:before="0" w:after="0" w:line="240" w:lineRule="auto"/>
+              <w:jc w:val="left"/>
+            </w:pPr>
+            <w:r>
+              <w:rPr>
+                <w:b/>
+                <w:i w:val="0"/>
+                <w:color w:val="FFFFFF"/>
+                <w:sz w:val="15"/>
+              </w:rPr>
+              <w:t>1.3 Izin Tambang vs Deforestasi</w:t>
+            </w:r>
+          </w:p>
+        </w:tc>
+        <w:tc>
+          <w:tcPr>
+            <w:tcW w:type="dxa" w:w="2891"/>
+            <w:shd w:val="clear" w:color="auto" w:fill="2E7D32"/>
+            <w:tcMar>
+              <w:top w:w="18" w:type="dxa"/>
+              <w:bottom w:w="18" w:type="dxa"/>
+              <w:left w:w="40" w:type="dxa"/>
+              <w:right w:w="40" w:type="dxa"/>
+            </w:tcMar>
+            <w:tcBorders>
+              <w:top w:val="single" w:sz="4" w:color="D8D8D8" w:space="0"/>
+              <w:left w:val="single" w:sz="4" w:color="D8D8D8" w:space="0"/>
+              <w:bottom w:val="single" w:sz="8" w:color="1B5E20" w:space="0"/>
+              <w:right w:val="single" w:sz="4" w:color="D8D8D8" w:space="0"/>
+            </w:tcBorders>
+          </w:tcPr>
+          <w:p>
+            <w:pPr>
+              <w:spacing w:before="0" w:after="0" w:line="240" w:lineRule="auto"/>
+              <w:jc w:val="left"/>
+            </w:pPr>
+            <w:r>
+              <w:rPr>
+                <w:b/>
+                <w:i w:val="0"/>
+                <w:color w:val="FFFFFF"/>
+                <w:sz w:val="15"/>
+              </w:rPr>
+              <w:t>1.4 Investasi PMDN vs Deforestasi</w:t>
+            </w:r>
+          </w:p>
+        </w:tc>
+      </w:tr>
+      <w:tr>
+        <w:tc>
+          <w:tcPr>
+            <w:tcW w:type="dxa" w:w="1814"/>
+            <w:shd w:val="clear" w:color="auto" w:fill="FFFFFF"/>
+            <w:tcMar>
+              <w:top w:w="16" w:type="dxa"/>
+              <w:bottom w:w="16" w:type="dxa"/>
+              <w:left w:w="40" w:type="dxa"/>
+              <w:right w:w="40" w:type="dxa"/>
+            </w:tcMar>
+            <w:tcBorders>
+              <w:top w:val="single" w:sz="4" w:color="D8D8D8" w:space="0"/>
+              <w:left w:val="single" w:sz="4" w:color="D8D8D8" w:space="0"/>
+              <w:bottom w:val="single" w:sz="4" w:color="D8D8D8" w:space="0"/>
+              <w:right w:val="single" w:sz="4" w:color="D8D8D8" w:space="0"/>
+            </w:tcBorders>
+          </w:tcPr>
+          <w:p>
+            <w:pPr>
+              <w:spacing w:before="0" w:after="0" w:line="240" w:lineRule="auto"/>
+              <w:jc w:val="left"/>
+            </w:pPr>
+            <w:r>
+              <w:rPr>
+                <w:b/>
+                <w:i w:val="0"/>
+                <w:color w:val="222222"/>
+                <w:sz w:val="14"/>
+              </w:rPr>
+              <w:t>Variabel Independen (X)</w:t>
+            </w:r>
+          </w:p>
+        </w:tc>
+        <w:tc>
+          <w:tcPr>
+            <w:tcW w:type="dxa" w:w="2891"/>
+            <w:shd w:val="clear" w:color="auto" w:fill="FFFFFF"/>
+            <w:tcMar>
+              <w:top w:w="16" w:type="dxa"/>
+              <w:bottom w:w="16" w:type="dxa"/>
+              <w:left w:w="40" w:type="dxa"/>
+              <w:right w:w="40" w:type="dxa"/>
+            </w:tcMar>
+            <w:tcBorders>
+              <w:top w:val="single" w:sz="4" w:color="D8D8D8" w:space="0"/>
+              <w:left w:val="single" w:sz="4" w:color="D8D8D8" w:space="0"/>
+              <w:bottom w:val="single" w:sz="4" w:color="D8D8D8" w:space="0"/>
+              <w:right w:val="single" w:sz="4" w:color="D8D8D8" w:space="0"/>
+            </w:tcBorders>
+          </w:tcPr>
+          <w:p>
+            <w:pPr>
+              <w:spacing w:before="0" w:after="0" w:line="240" w:lineRule="auto"/>
+              <w:jc w:val="left"/>
+            </w:pPr>
+            <w:r>
+              <w:rPr>
+                <w:b w:val="0"/>
+                <w:i w:val="0"/>
+                <w:color w:val="222222"/>
+                <w:sz w:val="14"/>
+              </w:rPr>
+              <w:t>Kapasitas PLTU Captive (MW)</w:t>
+            </w:r>
+          </w:p>
+        </w:tc>
+        <w:tc>
+          <w:tcPr>
+            <w:tcW w:type="dxa" w:w="2948"/>
+            <w:shd w:val="clear" w:color="auto" w:fill="FFFFFF"/>
+            <w:tcMar>
+              <w:top w:w="16" w:type="dxa"/>
+              <w:bottom w:w="16" w:type="dxa"/>
+              <w:left w:w="40" w:type="dxa"/>
+              <w:right w:w="40" w:type="dxa"/>
+            </w:tcMar>
+            <w:tcBorders>
+              <w:top w:val="single" w:sz="4" w:color="D8D8D8" w:space="0"/>
+              <w:left w:val="single" w:sz="4" w:color="D8D8D8" w:space="0"/>
+              <w:bottom w:val="single" w:sz="4" w:color="D8D8D8" w:space="0"/>
+              <w:right w:val="single" w:sz="4" w:color="D8D8D8" w:space="0"/>
+            </w:tcBorders>
+          </w:tcPr>
+          <w:p>
+            <w:pPr>
+              <w:spacing w:before="0" w:after="0" w:line="240" w:lineRule="auto"/>
+              <w:jc w:val="left"/>
+            </w:pPr>
+            <w:r>
+              <w:rPr>
+                <w:b w:val="0"/>
+                <w:i w:val="0"/>
+                <w:color w:val="222222"/>
+                <w:sz w:val="14"/>
+              </w:rPr>
+              <w:t>Frekuensi IUP Baru (Unit) / Luas Konsesi Baru (Ha)</w:t>
+            </w:r>
+          </w:p>
+        </w:tc>
+        <w:tc>
+          <w:tcPr>
+            <w:tcW w:type="dxa" w:w="2891"/>
+            <w:shd w:val="clear" w:color="auto" w:fill="FFFFFF"/>
+            <w:tcMar>
+              <w:top w:w="16" w:type="dxa"/>
+              <w:bottom w:w="16" w:type="dxa"/>
+              <w:left w:w="40" w:type="dxa"/>
+              <w:right w:w="40" w:type="dxa"/>
+            </w:tcMar>
+            <w:tcBorders>
+              <w:top w:val="single" w:sz="4" w:color="D8D8D8" w:space="0"/>
+              <w:left w:val="single" w:sz="4" w:color="D8D8D8" w:space="0"/>
+              <w:bottom w:val="single" w:sz="4" w:color="D8D8D8" w:space="0"/>
+              <w:right w:val="single" w:sz="4" w:color="D8D8D8" w:space="0"/>
+            </w:tcBorders>
+          </w:tcPr>
+          <w:p>
+            <w:pPr>
+              <w:spacing w:before="0" w:after="0" w:line="240" w:lineRule="auto"/>
+              <w:jc w:val="left"/>
+            </w:pPr>
+            <w:r>
+              <w:rPr>
+                <w:b w:val="0"/>
+                <w:i w:val="0"/>
+                <w:color w:val="222222"/>
+                <w:sz w:val="14"/>
+              </w:rPr>
+              <w:t>Realisasi Investasi PMDN (Juta Rp)</w:t>
+            </w:r>
+          </w:p>
+        </w:tc>
+      </w:tr>
+      <w:tr>
+        <w:tc>
+          <w:tcPr>
+            <w:tcW w:type="dxa" w:w="1814"/>
+            <w:shd w:val="clear" w:color="auto" w:fill="F9FBF9"/>
+            <w:tcMar>
+              <w:top w:w="16" w:type="dxa"/>
+              <w:bottom w:w="16" w:type="dxa"/>
+              <w:left w:w="40" w:type="dxa"/>
+              <w:right w:w="40" w:type="dxa"/>
+            </w:tcMar>
+            <w:tcBorders>
+              <w:top w:val="single" w:sz="4" w:color="D8D8D8" w:space="0"/>
+              <w:left w:val="single" w:sz="4" w:color="D8D8D8" w:space="0"/>
+              <w:bottom w:val="single" w:sz="4" w:color="D8D8D8" w:space="0"/>
+              <w:right w:val="single" w:sz="4" w:color="D8D8D8" w:space="0"/>
+            </w:tcBorders>
+          </w:tcPr>
+          <w:p>
+            <w:pPr>
+              <w:spacing w:before="0" w:after="0" w:line="240" w:lineRule="auto"/>
+              <w:jc w:val="left"/>
+            </w:pPr>
+            <w:r>
+              <w:rPr>
+                <w:b/>
+                <w:i w:val="0"/>
+                <w:color w:val="222222"/>
+                <w:sz w:val="14"/>
+              </w:rPr>
+              <w:t>Variabel Dependen (Y)</w:t>
+            </w:r>
+          </w:p>
+        </w:tc>
+        <w:tc>
+          <w:tcPr>
+            <w:tcW w:type="dxa" w:w="2891"/>
+            <w:shd w:val="clear" w:color="auto" w:fill="F9FBF9"/>
+            <w:tcMar>
+              <w:top w:w="16" w:type="dxa"/>
+              <w:bottom w:w="16" w:type="dxa"/>
+              <w:left w:w="40" w:type="dxa"/>
+              <w:right w:w="40" w:type="dxa"/>
+            </w:tcMar>
+            <w:tcBorders>
+              <w:top w:val="single" w:sz="4" w:color="D8D8D8" w:space="0"/>
+              <w:left w:val="single" w:sz="4" w:color="D8D8D8" w:space="0"/>
+              <w:bottom w:val="single" w:sz="4" w:color="D8D8D8" w:space="0"/>
+              <w:right w:val="single" w:sz="4" w:color="D8D8D8" w:space="0"/>
+            </w:tcBorders>
+          </w:tcPr>
+          <w:p>
+            <w:pPr>
+              <w:spacing w:before="0" w:after="0" w:line="240" w:lineRule="auto"/>
+              <w:jc w:val="left"/>
+            </w:pPr>
+            <w:r>
+              <w:rPr>
+                <w:b w:val="0"/>
+                <w:i w:val="0"/>
+                <w:color w:val="222222"/>
+                <w:sz w:val="14"/>
+              </w:rPr>
+              <w:t>Deforestasi Komoditas (Ha)</w:t>
+            </w:r>
+          </w:p>
+        </w:tc>
+        <w:tc>
+          <w:tcPr>
+            <w:tcW w:type="dxa" w:w="2948"/>
+            <w:shd w:val="clear" w:color="auto" w:fill="F9FBF9"/>
+            <w:tcMar>
+              <w:top w:w="16" w:type="dxa"/>
+              <w:bottom w:w="16" w:type="dxa"/>
+              <w:left w:w="40" w:type="dxa"/>
+              <w:right w:w="40" w:type="dxa"/>
+            </w:tcMar>
+            <w:tcBorders>
+              <w:top w:val="single" w:sz="4" w:color="D8D8D8" w:space="0"/>
+              <w:left w:val="single" w:sz="4" w:color="D8D8D8" w:space="0"/>
+              <w:bottom w:val="single" w:sz="4" w:color="D8D8D8" w:space="0"/>
+              <w:right w:val="single" w:sz="4" w:color="D8D8D8" w:space="0"/>
+            </w:tcBorders>
+          </w:tcPr>
+          <w:p>
+            <w:pPr>
+              <w:spacing w:before="0" w:after="0" w:line="240" w:lineRule="auto"/>
+              <w:jc w:val="left"/>
+            </w:pPr>
+            <w:r>
+              <w:rPr>
+                <w:b/>
+                <w:i w:val="0"/>
+                <w:color w:val="222222"/>
+                <w:sz w:val="14"/>
+              </w:rPr>
+              <w:t>Deforestasi Komoditas (Ha) / Total Deforestasi Alam (Ha)</w:t>
+            </w:r>
+          </w:p>
+        </w:tc>
+        <w:tc>
+          <w:tcPr>
+            <w:tcW w:type="dxa" w:w="2891"/>
+            <w:shd w:val="clear" w:color="auto" w:fill="F9FBF9"/>
+            <w:tcMar>
+              <w:top w:w="16" w:type="dxa"/>
+              <w:bottom w:w="16" w:type="dxa"/>
+              <w:left w:w="40" w:type="dxa"/>
+              <w:right w:w="40" w:type="dxa"/>
+            </w:tcMar>
+            <w:tcBorders>
+              <w:top w:val="single" w:sz="4" w:color="D8D8D8" w:space="0"/>
+              <w:left w:val="single" w:sz="4" w:color="D8D8D8" w:space="0"/>
+              <w:bottom w:val="single" w:sz="4" w:color="D8D8D8" w:space="0"/>
+              <w:right w:val="single" w:sz="4" w:color="D8D8D8" w:space="0"/>
+            </w:tcBorders>
+          </w:tcPr>
+          <w:p>
+            <w:pPr>
+              <w:spacing w:before="0" w:after="0" w:line="240" w:lineRule="auto"/>
+              <w:jc w:val="left"/>
+            </w:pPr>
+            <w:r>
+              <w:rPr>
+                <w:b/>
+                <w:i w:val="0"/>
+                <w:color w:val="222222"/>
+                <w:sz w:val="14"/>
+              </w:rPr>
+              <w:t>Total Deforestasi Alam (Ha) / Deforestasi Komoditas (Ha)</w:t>
+            </w:r>
+          </w:p>
+        </w:tc>
+      </w:tr>
+      <w:tr>
+        <w:tc>
+          <w:tcPr>
+            <w:tcW w:type="dxa" w:w="1814"/>
+            <w:shd w:val="clear" w:color="auto" w:fill="FFFFFF"/>
+            <w:tcMar>
+              <w:top w:w="16" w:type="dxa"/>
+              <w:bottom w:w="16" w:type="dxa"/>
+              <w:left w:w="40" w:type="dxa"/>
+              <w:right w:w="40" w:type="dxa"/>
+            </w:tcMar>
+            <w:tcBorders>
+              <w:top w:val="single" w:sz="4" w:color="D8D8D8" w:space="0"/>
+              <w:left w:val="single" w:sz="4" w:color="D8D8D8" w:space="0"/>
+              <w:bottom w:val="single" w:sz="4" w:color="D8D8D8" w:space="0"/>
+              <w:right w:val="single" w:sz="4" w:color="D8D8D8" w:space="0"/>
+            </w:tcBorders>
+          </w:tcPr>
+          <w:p>
+            <w:pPr>
+              <w:spacing w:before="0" w:after="0" w:line="240" w:lineRule="auto"/>
+              <w:jc w:val="left"/>
+            </w:pPr>
+            <w:r>
+              <w:rPr>
+                <w:b/>
+                <w:i w:val="0"/>
+                <w:color w:val="222222"/>
+                <w:sz w:val="14"/>
+              </w:rPr>
+              <w:t>Hipotesis Alternatif (H1)</w:t>
+            </w:r>
+          </w:p>
+        </w:tc>
+        <w:tc>
+          <w:tcPr>
+            <w:tcW w:type="dxa" w:w="2891"/>
+            <w:shd w:val="clear" w:color="auto" w:fill="FFFFFF"/>
+            <w:tcMar>
+              <w:top w:w="16" w:type="dxa"/>
+              <w:bottom w:w="16" w:type="dxa"/>
+              <w:left w:w="40" w:type="dxa"/>
+              <w:right w:w="40" w:type="dxa"/>
+            </w:tcMar>
+            <w:tcBorders>
+              <w:top w:val="single" w:sz="4" w:color="D8D8D8" w:space="0"/>
+              <w:left w:val="single" w:sz="4" w:color="D8D8D8" w:space="0"/>
+              <w:bottom w:val="single" w:sz="4" w:color="D8D8D8" w:space="0"/>
+              <w:right w:val="single" w:sz="4" w:color="D8D8D8" w:space="0"/>
+            </w:tcBorders>
+          </w:tcPr>
+          <w:p>
+            <w:pPr>
+              <w:spacing w:before="0" w:after="0" w:line="240" w:lineRule="auto"/>
+              <w:jc w:val="left"/>
+            </w:pPr>
+            <w:r>
+              <w:rPr>
+                <w:b w:val="0"/>
+                <w:i w:val="0"/>
+                <w:color w:val="222222"/>
+                <w:sz w:val="14"/>
+              </w:rPr>
+              <w:t>Ekspansi PLTU Captive berkorelasi positif dengan lonjakan deforestasi komoditas</w:t>
+            </w:r>
+          </w:p>
+        </w:tc>
+        <w:tc>
+          <w:tcPr>
+            <w:tcW w:type="dxa" w:w="2948"/>
+            <w:shd w:val="clear" w:color="auto" w:fill="FFFFFF"/>
+            <w:tcMar>
+              <w:top w:w="16" w:type="dxa"/>
+              <w:bottom w:w="16" w:type="dxa"/>
+              <w:left w:w="40" w:type="dxa"/>
+              <w:right w:w="40" w:type="dxa"/>
+            </w:tcMar>
+            <w:tcBorders>
+              <w:top w:val="single" w:sz="4" w:color="D8D8D8" w:space="0"/>
+              <w:left w:val="single" w:sz="4" w:color="D8D8D8" w:space="0"/>
+              <w:bottom w:val="single" w:sz="4" w:color="D8D8D8" w:space="0"/>
+              <w:right w:val="single" w:sz="4" w:color="D8D8D8" w:space="0"/>
+            </w:tcBorders>
+          </w:tcPr>
+          <w:p>
+            <w:pPr>
+              <w:spacing w:before="0" w:after="0" w:line="240" w:lineRule="auto"/>
+              <w:jc w:val="left"/>
+            </w:pPr>
+            <w:r>
+              <w:rPr>
+                <w:b w:val="0"/>
+                <w:i w:val="0"/>
+                <w:color w:val="222222"/>
+                <w:sz w:val="14"/>
+              </w:rPr>
+              <w:t>Tingginya penerbitan izin / luas konsesi berhubungan positif dengan laju deforestasi</w:t>
+            </w:r>
+          </w:p>
+        </w:tc>
+        <w:tc>
+          <w:tcPr>
+            <w:tcW w:type="dxa" w:w="2891"/>
+            <w:shd w:val="clear" w:color="auto" w:fill="FFFFFF"/>
+            <w:tcMar>
+              <w:top w:w="16" w:type="dxa"/>
+              <w:bottom w:w="16" w:type="dxa"/>
+              <w:left w:w="40" w:type="dxa"/>
+              <w:right w:w="40" w:type="dxa"/>
+            </w:tcMar>
+            <w:tcBorders>
+              <w:top w:val="single" w:sz="4" w:color="D8D8D8" w:space="0"/>
+              <w:left w:val="single" w:sz="4" w:color="D8D8D8" w:space="0"/>
+              <w:bottom w:val="single" w:sz="4" w:color="D8D8D8" w:space="0"/>
+              <w:right w:val="single" w:sz="4" w:color="D8D8D8" w:space="0"/>
+            </w:tcBorders>
+          </w:tcPr>
+          <w:p>
+            <w:pPr>
+              <w:spacing w:before="0" w:after="0" w:line="240" w:lineRule="auto"/>
+              <w:jc w:val="left"/>
+            </w:pPr>
+            <w:r>
+              <w:rPr>
+                <w:b w:val="0"/>
+                <w:i w:val="0"/>
+                <w:color w:val="222222"/>
+                <w:sz w:val="14"/>
+              </w:rPr>
+              <w:t>Tingginya realisasi investasi PMDN berhubungan positif dengan laju deforestasi</w:t>
+            </w:r>
+          </w:p>
+        </w:tc>
+      </w:tr>
+      <w:tr>
+        <w:tc>
+          <w:tcPr>
+            <w:tcW w:type="dxa" w:w="1814"/>
+            <w:shd w:val="clear" w:color="auto" w:fill="F9FBF9"/>
+            <w:tcMar>
+              <w:top w:w="16" w:type="dxa"/>
+              <w:bottom w:w="16" w:type="dxa"/>
+              <w:left w:w="40" w:type="dxa"/>
+              <w:right w:w="40" w:type="dxa"/>
+            </w:tcMar>
+            <w:tcBorders>
+              <w:top w:val="single" w:sz="4" w:color="D8D8D8" w:space="0"/>
+              <w:left w:val="single" w:sz="4" w:color="D8D8D8" w:space="0"/>
+              <w:bottom w:val="single" w:sz="4" w:color="D8D8D8" w:space="0"/>
+              <w:right w:val="single" w:sz="4" w:color="D8D8D8" w:space="0"/>
+            </w:tcBorders>
+          </w:tcPr>
+          <w:p>
+            <w:pPr>
+              <w:spacing w:before="0" w:after="0" w:line="240" w:lineRule="auto"/>
+              <w:jc w:val="left"/>
+            </w:pPr>
+            <w:r>
+              <w:rPr>
+                <w:b/>
+                <w:i w:val="0"/>
+                <w:color w:val="222222"/>
+                <w:sz w:val="14"/>
+              </w:rPr>
+              <w:t>Decision Rule (Alpha 5%)</w:t>
+            </w:r>
+          </w:p>
+        </w:tc>
+        <w:tc>
+          <w:tcPr>
+            <w:tcW w:type="dxa" w:w="2891"/>
+            <w:shd w:val="clear" w:color="auto" w:fill="F9FBF9"/>
+            <w:tcMar>
+              <w:top w:w="16" w:type="dxa"/>
+              <w:bottom w:w="16" w:type="dxa"/>
+              <w:left w:w="40" w:type="dxa"/>
+              <w:right w:w="40" w:type="dxa"/>
+            </w:tcMar>
+            <w:tcBorders>
+              <w:top w:val="single" w:sz="4" w:color="D8D8D8" w:space="0"/>
+              <w:left w:val="single" w:sz="4" w:color="D8D8D8" w:space="0"/>
+              <w:bottom w:val="single" w:sz="4" w:color="D8D8D8" w:space="0"/>
+              <w:right w:val="single" w:sz="4" w:color="D8D8D8" w:space="0"/>
+            </w:tcBorders>
+          </w:tcPr>
+          <w:p>
+            <w:pPr>
+              <w:spacing w:before="0" w:after="0" w:line="240" w:lineRule="auto"/>
+              <w:jc w:val="left"/>
+            </w:pPr>
+            <w:r>
+              <w:rPr>
+                <w:b w:val="0"/>
+                <w:i w:val="0"/>
+                <w:color w:val="222222"/>
+                <w:sz w:val="14"/>
+              </w:rPr>
+              <w:t>Tolak H0 jika P-Value &lt; 0.05</w:t>
+            </w:r>
+          </w:p>
+        </w:tc>
+        <w:tc>
+          <w:tcPr>
+            <w:tcW w:type="dxa" w:w="2948"/>
+            <w:shd w:val="clear" w:color="auto" w:fill="F9FBF9"/>
+            <w:tcMar>
+              <w:top w:w="16" w:type="dxa"/>
+              <w:bottom w:w="16" w:type="dxa"/>
+              <w:left w:w="40" w:type="dxa"/>
+              <w:right w:w="40" w:type="dxa"/>
+            </w:tcMar>
+            <w:tcBorders>
+              <w:top w:val="single" w:sz="4" w:color="D8D8D8" w:space="0"/>
+              <w:left w:val="single" w:sz="4" w:color="D8D8D8" w:space="0"/>
+              <w:bottom w:val="single" w:sz="4" w:color="D8D8D8" w:space="0"/>
+              <w:right w:val="single" w:sz="4" w:color="D8D8D8" w:space="0"/>
+            </w:tcBorders>
+          </w:tcPr>
+          <w:p>
+            <w:pPr>
+              <w:spacing w:before="0" w:after="0" w:line="240" w:lineRule="auto"/>
+              <w:jc w:val="left"/>
+            </w:pPr>
+            <w:r>
+              <w:rPr>
+                <w:b w:val="0"/>
+                <w:i w:val="0"/>
+                <w:color w:val="222222"/>
+                <w:sz w:val="14"/>
+              </w:rPr>
+              <w:t>Tolak H0 jika P-Value &lt; 0.05</w:t>
+            </w:r>
+          </w:p>
+        </w:tc>
+        <w:tc>
+          <w:tcPr>
+            <w:tcW w:type="dxa" w:w="2891"/>
+            <w:shd w:val="clear" w:color="auto" w:fill="F9FBF9"/>
+            <w:tcMar>
+              <w:top w:w="16" w:type="dxa"/>
+              <w:bottom w:w="16" w:type="dxa"/>
+              <w:left w:w="40" w:type="dxa"/>
+              <w:right w:w="40" w:type="dxa"/>
+            </w:tcMar>
+            <w:tcBorders>
+              <w:top w:val="single" w:sz="4" w:color="D8D8D8" w:space="0"/>
+              <w:left w:val="single" w:sz="4" w:color="D8D8D8" w:space="0"/>
+              <w:bottom w:val="single" w:sz="4" w:color="D8D8D8" w:space="0"/>
+              <w:right w:val="single" w:sz="4" w:color="D8D8D8" w:space="0"/>
+            </w:tcBorders>
+          </w:tcPr>
+          <w:p>
+            <w:pPr>
+              <w:spacing w:before="0" w:after="0" w:line="240" w:lineRule="auto"/>
+              <w:jc w:val="left"/>
+            </w:pPr>
+            <w:r>
+              <w:rPr>
+                <w:b w:val="0"/>
+                <w:i w:val="0"/>
+                <w:color w:val="222222"/>
+                <w:sz w:val="14"/>
+              </w:rPr>
+              <w:t>Tolak H0 jika P-Value &lt; 0.05</w:t>
+            </w:r>
+          </w:p>
+        </w:tc>
+      </w:tr>
+      <w:tr>
+        <w:tc>
+          <w:tcPr>
+            <w:tcW w:type="dxa" w:w="1814"/>
+            <w:shd w:val="clear" w:color="auto" w:fill="FFFFFF"/>
+            <w:tcMar>
+              <w:top w:w="16" w:type="dxa"/>
+              <w:bottom w:w="16" w:type="dxa"/>
+              <w:left w:w="40" w:type="dxa"/>
+              <w:right w:w="40" w:type="dxa"/>
+            </w:tcMar>
+            <w:tcBorders>
+              <w:top w:val="single" w:sz="4" w:color="D8D8D8" w:space="0"/>
+              <w:left w:val="single" w:sz="4" w:color="D8D8D8" w:space="0"/>
+              <w:bottom w:val="single" w:sz="4" w:color="D8D8D8" w:space="0"/>
+              <w:right w:val="single" w:sz="4" w:color="D8D8D8" w:space="0"/>
+            </w:tcBorders>
+          </w:tcPr>
+          <w:p>
+            <w:pPr>
+              <w:spacing w:before="0" w:after="0" w:line="240" w:lineRule="auto"/>
+              <w:jc w:val="left"/>
+            </w:pPr>
+            <w:r>
+              <w:rPr>
+                <w:b/>
+                <w:i w:val="0"/>
+                <w:color w:val="222222"/>
+                <w:sz w:val="14"/>
+              </w:rPr>
+              <w:t>Threshold Kategori (Median Panel)</w:t>
+            </w:r>
+          </w:p>
+        </w:tc>
+        <w:tc>
+          <w:tcPr>
+            <w:tcW w:type="dxa" w:w="2891"/>
+            <w:shd w:val="clear" w:color="auto" w:fill="FFFFFF"/>
+            <w:tcMar>
+              <w:top w:w="16" w:type="dxa"/>
+              <w:bottom w:w="16" w:type="dxa"/>
+              <w:left w:w="40" w:type="dxa"/>
+              <w:right w:w="40" w:type="dxa"/>
+            </w:tcMar>
+            <w:tcBorders>
+              <w:top w:val="single" w:sz="4" w:color="D8D8D8" w:space="0"/>
+              <w:left w:val="single" w:sz="4" w:color="D8D8D8" w:space="0"/>
+              <w:bottom w:val="single" w:sz="4" w:color="D8D8D8" w:space="0"/>
+              <w:right w:val="single" w:sz="4" w:color="D8D8D8" w:space="0"/>
+            </w:tcBorders>
+          </w:tcPr>
+          <w:p>
+            <w:pPr>
+              <w:spacing w:before="0" w:after="0" w:line="240" w:lineRule="auto"/>
+              <w:jc w:val="left"/>
+            </w:pPr>
+            <w:r>
+              <w:rPr>
+                <w:b w:val="0"/>
+                <w:i w:val="0"/>
+                <w:color w:val="222222"/>
+                <w:sz w:val="14"/>
+              </w:rPr>
+              <w:t>X &gt; 0 MW (PLTU aktif); Y &gt;= 10,961.8 Ha (N=60)</w:t>
+            </w:r>
+          </w:p>
+        </w:tc>
+        <w:tc>
+          <w:tcPr>
+            <w:tcW w:type="dxa" w:w="2948"/>
+            <w:shd w:val="clear" w:color="auto" w:fill="FFFFFF"/>
+            <w:tcMar>
+              <w:top w:w="16" w:type="dxa"/>
+              <w:bottom w:w="16" w:type="dxa"/>
+              <w:left w:w="40" w:type="dxa"/>
+              <w:right w:w="40" w:type="dxa"/>
+            </w:tcMar>
+            <w:tcBorders>
+              <w:top w:val="single" w:sz="4" w:color="D8D8D8" w:space="0"/>
+              <w:left w:val="single" w:sz="4" w:color="D8D8D8" w:space="0"/>
+              <w:bottom w:val="single" w:sz="4" w:color="D8D8D8" w:space="0"/>
+              <w:right w:val="single" w:sz="4" w:color="D8D8D8" w:space="0"/>
+            </w:tcBorders>
+          </w:tcPr>
+          <w:p>
+            <w:pPr>
+              <w:spacing w:before="0" w:after="0" w:line="240" w:lineRule="auto"/>
+              <w:jc w:val="left"/>
+            </w:pPr>
+            <w:r>
+              <w:rPr>
+                <w:b w:val="0"/>
+                <w:i w:val="0"/>
+                <w:color w:val="222222"/>
+                <w:sz w:val="14"/>
+              </w:rPr>
+              <w:t>X &gt;= 2.0 izin; Y &gt;= 10,961.8 Ha (N=60)</w:t>
+            </w:r>
+          </w:p>
+        </w:tc>
+        <w:tc>
+          <w:tcPr>
+            <w:tcW w:type="dxa" w:w="2891"/>
+            <w:shd w:val="clear" w:color="auto" w:fill="FFFFFF"/>
+            <w:tcMar>
+              <w:top w:w="16" w:type="dxa"/>
+              <w:bottom w:w="16" w:type="dxa"/>
+              <w:left w:w="40" w:type="dxa"/>
+              <w:right w:w="40" w:type="dxa"/>
+            </w:tcMar>
+            <w:tcBorders>
+              <w:top w:val="single" w:sz="4" w:color="D8D8D8" w:space="0"/>
+              <w:left w:val="single" w:sz="4" w:color="D8D8D8" w:space="0"/>
+              <w:bottom w:val="single" w:sz="4" w:color="D8D8D8" w:space="0"/>
+              <w:right w:val="single" w:sz="4" w:color="D8D8D8" w:space="0"/>
+            </w:tcBorders>
+          </w:tcPr>
+          <w:p>
+            <w:pPr>
+              <w:spacing w:before="0" w:after="0" w:line="240" w:lineRule="auto"/>
+              <w:jc w:val="left"/>
+            </w:pPr>
+            <w:r>
+              <w:rPr>
+                <w:b w:val="0"/>
+                <w:i w:val="0"/>
+                <w:color w:val="222222"/>
+                <w:sz w:val="14"/>
+              </w:rPr>
+              <w:t>X &gt; 3,146.4 Juta Rp; Y &gt;= 10,451.7 Ha (N=48)</w:t>
+            </w:r>
+          </w:p>
+        </w:tc>
+      </w:tr>
+      <w:tr>
+        <w:tc>
+          <w:tcPr>
+            <w:tcW w:type="dxa" w:w="1814"/>
+            <w:shd w:val="clear" w:color="auto" w:fill="F9FBF9"/>
+            <w:tcMar>
+              <w:top w:w="16" w:type="dxa"/>
+              <w:bottom w:w="16" w:type="dxa"/>
+              <w:left w:w="40" w:type="dxa"/>
+              <w:right w:w="40" w:type="dxa"/>
+            </w:tcMar>
+            <w:tcBorders>
+              <w:top w:val="single" w:sz="4" w:color="D8D8D8" w:space="0"/>
+              <w:left w:val="single" w:sz="4" w:color="D8D8D8" w:space="0"/>
+              <w:bottom w:val="single" w:sz="4" w:color="D8D8D8" w:space="0"/>
+              <w:right w:val="single" w:sz="4" w:color="D8D8D8" w:space="0"/>
+            </w:tcBorders>
+          </w:tcPr>
+          <w:p>
+            <w:pPr>
+              <w:spacing w:before="0" w:after="0" w:line="240" w:lineRule="auto"/>
+              <w:jc w:val="left"/>
+            </w:pPr>
+            <w:r>
+              <w:rPr>
+                <w:b/>
+                <w:i w:val="0"/>
+                <w:color w:val="222222"/>
+                <w:sz w:val="14"/>
+              </w:rPr>
+              <w:t>Orientasi Odds Ratio</w:t>
+            </w:r>
+          </w:p>
+        </w:tc>
+        <w:tc>
+          <w:tcPr>
+            <w:tcW w:type="dxa" w:w="2891"/>
+            <w:shd w:val="clear" w:color="auto" w:fill="F9FBF9"/>
+            <w:tcMar>
+              <w:top w:w="16" w:type="dxa"/>
+              <w:bottom w:w="16" w:type="dxa"/>
+              <w:left w:w="40" w:type="dxa"/>
+              <w:right w:w="40" w:type="dxa"/>
+            </w:tcMar>
+            <w:tcBorders>
+              <w:top w:val="single" w:sz="4" w:color="D8D8D8" w:space="0"/>
+              <w:left w:val="single" w:sz="4" w:color="D8D8D8" w:space="0"/>
+              <w:bottom w:val="single" w:sz="4" w:color="D8D8D8" w:space="0"/>
+              <w:right w:val="single" w:sz="4" w:color="D8D8D8" w:space="0"/>
+            </w:tcBorders>
+          </w:tcPr>
+          <w:p>
+            <w:pPr>
+              <w:spacing w:before="0" w:after="0" w:line="240" w:lineRule="auto"/>
+              <w:jc w:val="left"/>
+            </w:pPr>
+            <w:r>
+              <w:rPr>
+                <w:b w:val="0"/>
+                <w:i w:val="0"/>
+                <w:color w:val="222222"/>
+                <w:sz w:val="14"/>
+              </w:rPr>
+              <w:t>a = PLTU Tinggi &amp; Deforestasi Tinggi (risiko lonjakan deforestasi)</w:t>
+            </w:r>
+          </w:p>
+        </w:tc>
+        <w:tc>
+          <w:tcPr>
+            <w:tcW w:type="dxa" w:w="2948"/>
+            <w:shd w:val="clear" w:color="auto" w:fill="F9FBF9"/>
+            <w:tcMar>
+              <w:top w:w="16" w:type="dxa"/>
+              <w:bottom w:w="16" w:type="dxa"/>
+              <w:left w:w="40" w:type="dxa"/>
+              <w:right w:w="40" w:type="dxa"/>
+            </w:tcMar>
+            <w:tcBorders>
+              <w:top w:val="single" w:sz="4" w:color="D8D8D8" w:space="0"/>
+              <w:left w:val="single" w:sz="4" w:color="D8D8D8" w:space="0"/>
+              <w:bottom w:val="single" w:sz="4" w:color="D8D8D8" w:space="0"/>
+              <w:right w:val="single" w:sz="4" w:color="D8D8D8" w:space="0"/>
+            </w:tcBorders>
+          </w:tcPr>
+          <w:p>
+            <w:pPr>
+              <w:spacing w:before="0" w:after="0" w:line="240" w:lineRule="auto"/>
+              <w:jc w:val="left"/>
+            </w:pPr>
+            <w:r>
+              <w:rPr>
+                <w:b w:val="0"/>
+                <w:i w:val="0"/>
+                <w:color w:val="222222"/>
+                <w:sz w:val="14"/>
+              </w:rPr>
+              <w:t>a = Izin Tinggi &amp; Deforestasi Tinggi (risiko deforestasi tinggi)</w:t>
+            </w:r>
+          </w:p>
+        </w:tc>
+        <w:tc>
+          <w:tcPr>
+            <w:tcW w:type="dxa" w:w="2891"/>
+            <w:shd w:val="clear" w:color="auto" w:fill="F9FBF9"/>
+            <w:tcMar>
+              <w:top w:w="16" w:type="dxa"/>
+              <w:bottom w:w="16" w:type="dxa"/>
+              <w:left w:w="40" w:type="dxa"/>
+              <w:right w:w="40" w:type="dxa"/>
+            </w:tcMar>
+            <w:tcBorders>
+              <w:top w:val="single" w:sz="4" w:color="D8D8D8" w:space="0"/>
+              <w:left w:val="single" w:sz="4" w:color="D8D8D8" w:space="0"/>
+              <w:bottom w:val="single" w:sz="4" w:color="D8D8D8" w:space="0"/>
+              <w:right w:val="single" w:sz="4" w:color="D8D8D8" w:space="0"/>
+            </w:tcBorders>
+          </w:tcPr>
+          <w:p>
+            <w:pPr>
+              <w:spacing w:before="0" w:after="0" w:line="240" w:lineRule="auto"/>
+              <w:jc w:val="left"/>
+            </w:pPr>
+            <w:r>
+              <w:rPr>
+                <w:b w:val="0"/>
+                <w:i w:val="0"/>
+                <w:color w:val="222222"/>
+                <w:sz w:val="14"/>
+              </w:rPr>
+              <w:t>a = Investasi Tinggi &amp; Deforestasi Tinggi (risiko deforestasi tinggi)</w:t>
+            </w:r>
+          </w:p>
+        </w:tc>
+      </w:tr>
+    </w:tbl>
+    <w:p>
+      <w:pPr>
+        <w:spacing w:before="40" w:after="20"/>
+      </w:pPr>
+      <w:r>
+        <w:rPr>
+          <w:b/>
+          <w:i/>
+          <w:color w:val="2E7D32"/>
+          <w:sz w:val="15"/>
+        </w:rPr>
+        <w:t>Tabel 1.4: Ringkasan Hasil Uji Independensi Chi-Square (χ²) dan Odds Ratio (OR) Data Panel Bab 1 (N=60)</w:t>
       </w:r>
     </w:p>
     <w:tbl>
@@ -5001,7 +5968,7 @@
           <w:color w:val="2E7D32"/>
           <w:sz w:val="15"/>
         </w:rPr>
-        <w:t>Tabel 1.4: Inventarisasi Enam Simpul Pelabuhan dan Terminal Khusus Ekspor Nikel di Pulau Sulawesi</w:t>
+        <w:t>Tabel 1.5: Inventarisasi Enam Simpul Pelabuhan dan Terminal Khusus Ekspor Nikel di Pulau Sulawesi</w:t>
       </w:r>
     </w:p>
     <w:tbl>
@@ -6480,7 +7447,7 @@
           <w:color w:val="104010"/>
           <w:sz w:val="14"/>
         </w:rPr>
-        <w:t>Kurva(t) = ( 1 - t )² * P_Asal + 2 * ( 1 - t ) * t * P_Kontrol + t² * P_Tujuan ,  t ∈ [0, 1]</w:t>
+        <w:t>Titik Kurva Pelayaran = ( 1 - t )² × Pelabuhan Asal + 2 × ( 1 - t ) × t × Titik Kontrol + t² × Pelabuhan Tujuan ,  t bergerak dari 0 ke 1</w:t>
         <w:br/>
       </w:r>
       <w:r>
@@ -6501,9 +7468,9 @@
           <w:color w:val="222222"/>
           <w:sz w:val="14"/>
         </w:rPr>
-        <w:t>Kapasitas_Kapal_Maksimum = 52.378 DWT (Setara ~5.200 Truk Tronton per Pengapalan)</w:t>
+        <w:t>Kapasitas Kapal Maksimum = 52.378 DWT (Setara ~5.200 Truk Tronton per Pengapalan)</w:t>
         <w:br/>
-        <w:t>Orientasi_Logistik = Lebih dari 78% kargo bertolak langsung ke pelabuhan Tiongkok (Ningbo, Qingdao) dan Jepang (Chiba)</w:t>
+        <w:t>Orientasi Logistik: Lebih dari 78% kargo bertolak langsung ke pelabuhan Tiongkok (Ningbo, Qingdao) dan Jepang (Chiba)</w:t>
       </w:r>
       <w:r>
         <w:rPr>
@@ -6513,7 +7480,7 @@
           <w:sz w:val="14"/>
         </w:rPr>
         <w:br/>
-        <w:t>Ket: P_Asal: koordinat pelabuhan Sulawesi, P_Kontrol: jangkar perairan internasional, P_Tujuan: pelabuhan bongkar.</w:t>
+        <w:t>Ket: Pelabuhan Asal: koordinat pelabuhan muat Sulawesi; Titik Kontrol: jangkar lengkung di perairan internasional; Pelabuhan Tujuan: pelabuhan bongkar negara tujuan.</w:t>
       </w:r>
     </w:p>
     <w:p>
@@ -6544,7 +7511,7 @@
           <w:color w:val="2E7D32"/>
           <w:sz w:val="15"/>
         </w:rPr>
-        <w:t>Tabel 1.5: Matriks Indikator dan Sumber Data Primer Resmi Bab 1</w:t>
+        <w:t>Tabel 1.6: Matriks Indikator dan Sumber Data Primer Resmi Bab 1</w:t>
       </w:r>
     </w:p>
     <w:tbl>
@@ -6556,13 +7523,12 @@
         <w:tblLook w:firstColumn="1" w:firstRow="1" w:lastColumn="0" w:lastRow="0" w:noHBand="0" w:noVBand="1" w:val="04A0"/>
       </w:tblPr>
       <w:tblGrid>
-        <w:gridCol w:w="1554"/>
-        <w:gridCol w:w="1554"/>
-        <w:gridCol w:w="1554"/>
-        <w:gridCol w:w="1554"/>
-        <w:gridCol w:w="1554"/>
-        <w:gridCol w:w="1554"/>
-        <w:gridCol w:w="1554"/>
+        <w:gridCol w:w="1813"/>
+        <w:gridCol w:w="1813"/>
+        <w:gridCol w:w="1813"/>
+        <w:gridCol w:w="1813"/>
+        <w:gridCol w:w="1813"/>
+        <w:gridCol w:w="1813"/>
       </w:tblGrid>
       <w:tr>
         <w:tc>
@@ -6600,7 +7566,7 @@
         </w:tc>
         <w:tc>
           <w:tcPr>
-            <w:tcW w:type="dxa" w:w="1928"/>
+            <w:tcW w:type="dxa" w:w="2154"/>
             <w:shd w:val="clear" w:color="auto" w:fill="2E7D32"/>
             <w:tcMar>
               <w:top w:w="18" w:type="dxa"/>
@@ -6633,7 +7599,7 @@
         </w:tc>
         <w:tc>
           <w:tcPr>
-            <w:tcW w:type="dxa" w:w="1474"/>
+            <w:tcW w:type="dxa" w:w="1701"/>
             <w:shd w:val="clear" w:color="auto" w:fill="2E7D32"/>
             <w:tcMar>
               <w:top w:w="18" w:type="dxa"/>
@@ -6666,7 +7632,7 @@
         </w:tc>
         <w:tc>
           <w:tcPr>
-            <w:tcW w:type="dxa" w:w="794"/>
+            <w:tcW w:type="dxa" w:w="907"/>
             <w:shd w:val="clear" w:color="auto" w:fill="2E7D32"/>
             <w:tcMar>
               <w:top w:w="18" w:type="dxa"/>
@@ -6732,7 +7698,7 @@
         </w:tc>
         <w:tc>
           <w:tcPr>
-            <w:tcW w:type="dxa" w:w="2494"/>
+            <w:tcW w:type="dxa" w:w="4309"/>
             <w:shd w:val="clear" w:color="auto" w:fill="2E7D32"/>
             <w:tcMar>
               <w:top w:w="18" w:type="dxa"/>
@@ -6759,40 +7725,7 @@
                 <w:color w:val="FFFFFF"/>
                 <w:sz w:val="15"/>
               </w:rPr>
-              <w:t>Institusi Sumber Data Primer</w:t>
-            </w:r>
-          </w:p>
-        </w:tc>
-        <w:tc>
-          <w:tcPr>
-            <w:tcW w:type="dxa" w:w="2381"/>
-            <w:shd w:val="clear" w:color="auto" w:fill="2E7D32"/>
-            <w:tcMar>
-              <w:top w:w="18" w:type="dxa"/>
-              <w:bottom w:w="18" w:type="dxa"/>
-              <w:left w:w="40" w:type="dxa"/>
-              <w:right w:w="40" w:type="dxa"/>
-            </w:tcMar>
-            <w:tcBorders>
-              <w:top w:val="single" w:sz="4" w:color="D8D8D8" w:space="0"/>
-              <w:left w:val="single" w:sz="4" w:color="D8D8D8" w:space="0"/>
-              <w:bottom w:val="single" w:sz="8" w:color="1B5E20" w:space="0"/>
-              <w:right w:val="single" w:sz="4" w:color="D8D8D8" w:space="0"/>
-            </w:tcBorders>
-          </w:tcPr>
-          <w:p>
-            <w:pPr>
-              <w:spacing w:before="0" w:after="0" w:line="240" w:lineRule="auto"/>
-              <w:jc w:val="left"/>
-            </w:pPr>
-            <w:r>
-              <w:rPr>
-                <w:b/>
-                <w:i w:val="0"/>
-                <w:color w:val="FFFFFF"/>
-                <w:sz w:val="15"/>
-              </w:rPr>
-              <w:t>Dataset File</w:t>
+              <w:t>Institusi Sumber Data Primer Resmi</w:t>
             </w:r>
           </w:p>
         </w:tc>
@@ -6833,7 +7766,7 @@
         </w:tc>
         <w:tc>
           <w:tcPr>
-            <w:tcW w:type="dxa" w:w="1928"/>
+            <w:tcW w:type="dxa" w:w="2154"/>
             <w:shd w:val="clear" w:color="auto" w:fill="FFFFFF"/>
             <w:tcMar>
               <w:top w:w="16" w:type="dxa"/>
@@ -6866,7 +7799,7 @@
         </w:tc>
         <w:tc>
           <w:tcPr>
-            <w:tcW w:type="dxa" w:w="1474"/>
+            <w:tcW w:type="dxa" w:w="1701"/>
             <w:shd w:val="clear" w:color="auto" w:fill="FFFFFF"/>
             <w:tcMar>
               <w:top w:w="16" w:type="dxa"/>
@@ -6899,7 +7832,7 @@
         </w:tc>
         <w:tc>
           <w:tcPr>
-            <w:tcW w:type="dxa" w:w="794"/>
+            <w:tcW w:type="dxa" w:w="907"/>
             <w:shd w:val="clear" w:color="auto" w:fill="FFFFFF"/>
             <w:tcMar>
               <w:top w:w="16" w:type="dxa"/>
@@ -6965,7 +7898,7 @@
         </w:tc>
         <w:tc>
           <w:tcPr>
-            <w:tcW w:type="dxa" w:w="2494"/>
+            <w:tcW w:type="dxa" w:w="4309"/>
             <w:shd w:val="clear" w:color="auto" w:fill="FFFFFF"/>
             <w:tcMar>
               <w:top w:w="16" w:type="dxa"/>
@@ -6992,40 +7925,7 @@
                 <w:color w:val="222222"/>
                 <w:sz w:val="14"/>
               </w:rPr>
-              <w:t>ESDM MODI (Minerbaone)</w:t>
-            </w:r>
-          </w:p>
-        </w:tc>
-        <w:tc>
-          <w:tcPr>
-            <w:tcW w:type="dxa" w:w="2381"/>
-            <w:shd w:val="clear" w:color="auto" w:fill="FFFFFF"/>
-            <w:tcMar>
-              <w:top w:w="16" w:type="dxa"/>
-              <w:bottom w:w="16" w:type="dxa"/>
-              <w:left w:w="40" w:type="dxa"/>
-              <w:right w:w="40" w:type="dxa"/>
-            </w:tcMar>
-            <w:tcBorders>
-              <w:top w:val="single" w:sz="4" w:color="D8D8D8" w:space="0"/>
-              <w:left w:val="single" w:sz="4" w:color="D8D8D8" w:space="0"/>
-              <w:bottom w:val="single" w:sz="4" w:color="D8D8D8" w:space="0"/>
-              <w:right w:val="single" w:sz="4" w:color="D8D8D8" w:space="0"/>
-            </w:tcBorders>
-          </w:tcPr>
-          <w:p>
-            <w:pPr>
-              <w:spacing w:before="0" w:after="0" w:line="240" w:lineRule="auto"/>
-              <w:jc w:val="left"/>
-            </w:pPr>
-            <w:r>
-              <w:rPr>
-                <w:b w:val="0"/>
-                <w:i w:val="0"/>
-                <w:color w:val="222222"/>
-                <w:sz w:val="14"/>
-              </w:rPr>
-              <w:t>sulawesi_izin_baru_per_tahun.csv</w:t>
+              <w:t>Kementerian ESDM — MODI (Minerbaone)</w:t>
             </w:r>
           </w:p>
         </w:tc>
@@ -7066,7 +7966,7 @@
         </w:tc>
         <w:tc>
           <w:tcPr>
-            <w:tcW w:type="dxa" w:w="1928"/>
+            <w:tcW w:type="dxa" w:w="2154"/>
             <w:shd w:val="clear" w:color="auto" w:fill="F9FBF9"/>
             <w:tcMar>
               <w:top w:w="16" w:type="dxa"/>
@@ -7099,7 +7999,7 @@
         </w:tc>
         <w:tc>
           <w:tcPr>
-            <w:tcW w:type="dxa" w:w="1474"/>
+            <w:tcW w:type="dxa" w:w="1701"/>
             <w:shd w:val="clear" w:color="auto" w:fill="F9FBF9"/>
             <w:tcMar>
               <w:top w:w="16" w:type="dxa"/>
@@ -7132,7 +8032,7 @@
         </w:tc>
         <w:tc>
           <w:tcPr>
-            <w:tcW w:type="dxa" w:w="794"/>
+            <w:tcW w:type="dxa" w:w="907"/>
             <w:shd w:val="clear" w:color="auto" w:fill="F9FBF9"/>
             <w:tcMar>
               <w:top w:w="16" w:type="dxa"/>
@@ -7198,7 +8098,7 @@
         </w:tc>
         <w:tc>
           <w:tcPr>
-            <w:tcW w:type="dxa" w:w="2494"/>
+            <w:tcW w:type="dxa" w:w="4309"/>
             <w:shd w:val="clear" w:color="auto" w:fill="F9FBF9"/>
             <w:tcMar>
               <w:top w:w="16" w:type="dxa"/>
@@ -7225,40 +8125,7 @@
                 <w:color w:val="222222"/>
                 <w:sz w:val="14"/>
               </w:rPr>
-              <w:t>ESDM MODI (Minerbaone)</w:t>
-            </w:r>
-          </w:p>
-        </w:tc>
-        <w:tc>
-          <w:tcPr>
-            <w:tcW w:type="dxa" w:w="2381"/>
-            <w:shd w:val="clear" w:color="auto" w:fill="F9FBF9"/>
-            <w:tcMar>
-              <w:top w:w="16" w:type="dxa"/>
-              <w:bottom w:w="16" w:type="dxa"/>
-              <w:left w:w="40" w:type="dxa"/>
-              <w:right w:w="40" w:type="dxa"/>
-            </w:tcMar>
-            <w:tcBorders>
-              <w:top w:val="single" w:sz="4" w:color="D8D8D8" w:space="0"/>
-              <w:left w:val="single" w:sz="4" w:color="D8D8D8" w:space="0"/>
-              <w:bottom w:val="single" w:sz="4" w:color="D8D8D8" w:space="0"/>
-              <w:right w:val="single" w:sz="4" w:color="D8D8D8" w:space="0"/>
-            </w:tcBorders>
-          </w:tcPr>
-          <w:p>
-            <w:pPr>
-              <w:spacing w:before="0" w:after="0" w:line="240" w:lineRule="auto"/>
-              <w:jc w:val="left"/>
-            </w:pPr>
-            <w:r>
-              <w:rPr>
-                <w:b w:val="0"/>
-                <w:i w:val="0"/>
-                <w:color w:val="222222"/>
-                <w:sz w:val="14"/>
-              </w:rPr>
-              <w:t>sulawesi_kawasan_nikel_luas.csv</w:t>
+              <w:t>Kementerian ESDM — MODI (Minerbaone)</w:t>
             </w:r>
           </w:p>
         </w:tc>
@@ -7299,7 +8166,7 @@
         </w:tc>
         <w:tc>
           <w:tcPr>
-            <w:tcW w:type="dxa" w:w="1928"/>
+            <w:tcW w:type="dxa" w:w="2154"/>
             <w:shd w:val="clear" w:color="auto" w:fill="FFFFFF"/>
             <w:tcMar>
               <w:top w:w="16" w:type="dxa"/>
@@ -7332,7 +8199,7 @@
         </w:tc>
         <w:tc>
           <w:tcPr>
-            <w:tcW w:type="dxa" w:w="1474"/>
+            <w:tcW w:type="dxa" w:w="1701"/>
             <w:shd w:val="clear" w:color="auto" w:fill="FFFFFF"/>
             <w:tcMar>
               <w:top w:w="16" w:type="dxa"/>
@@ -7365,7 +8232,7 @@
         </w:tc>
         <w:tc>
           <w:tcPr>
-            <w:tcW w:type="dxa" w:w="794"/>
+            <w:tcW w:type="dxa" w:w="907"/>
             <w:shd w:val="clear" w:color="auto" w:fill="FFFFFF"/>
             <w:tcMar>
               <w:top w:w="16" w:type="dxa"/>
@@ -7431,7 +8298,7 @@
         </w:tc>
         <w:tc>
           <w:tcPr>
-            <w:tcW w:type="dxa" w:w="2494"/>
+            <w:tcW w:type="dxa" w:w="4309"/>
             <w:shd w:val="clear" w:color="auto" w:fill="FFFFFF"/>
             <w:tcMar>
               <w:top w:w="16" w:type="dxa"/>
@@ -7459,39 +8326,6 @@
                 <w:sz w:val="14"/>
               </w:rPr>
               <w:t>Global Energy Monitor (GEM)</w:t>
-            </w:r>
-          </w:p>
-        </w:tc>
-        <w:tc>
-          <w:tcPr>
-            <w:tcW w:type="dxa" w:w="2381"/>
-            <w:shd w:val="clear" w:color="auto" w:fill="FFFFFF"/>
-            <w:tcMar>
-              <w:top w:w="16" w:type="dxa"/>
-              <w:bottom w:w="16" w:type="dxa"/>
-              <w:left w:w="40" w:type="dxa"/>
-              <w:right w:w="40" w:type="dxa"/>
-            </w:tcMar>
-            <w:tcBorders>
-              <w:top w:val="single" w:sz="4" w:color="D8D8D8" w:space="0"/>
-              <w:left w:val="single" w:sz="4" w:color="D8D8D8" w:space="0"/>
-              <w:bottom w:val="single" w:sz="4" w:color="D8D8D8" w:space="0"/>
-              <w:right w:val="single" w:sz="4" w:color="D8D8D8" w:space="0"/>
-            </w:tcBorders>
-          </w:tcPr>
-          <w:p>
-            <w:pPr>
-              <w:spacing w:before="0" w:after="0" w:line="240" w:lineRule="auto"/>
-              <w:jc w:val="left"/>
-            </w:pPr>
-            <w:r>
-              <w:rPr>
-                <w:b w:val="0"/>
-                <w:i w:val="0"/>
-                <w:color w:val="222222"/>
-                <w:sz w:val="14"/>
-              </w:rPr>
-              <w:t>sulawesi_pltu_captive.csv</w:t>
             </w:r>
           </w:p>
         </w:tc>
@@ -7532,7 +8366,7 @@
         </w:tc>
         <w:tc>
           <w:tcPr>
-            <w:tcW w:type="dxa" w:w="1928"/>
+            <w:tcW w:type="dxa" w:w="2154"/>
             <w:shd w:val="clear" w:color="auto" w:fill="F9FBF9"/>
             <w:tcMar>
               <w:top w:w="16" w:type="dxa"/>
@@ -7565,7 +8399,7 @@
         </w:tc>
         <w:tc>
           <w:tcPr>
-            <w:tcW w:type="dxa" w:w="1474"/>
+            <w:tcW w:type="dxa" w:w="1701"/>
             <w:shd w:val="clear" w:color="auto" w:fill="F9FBF9"/>
             <w:tcMar>
               <w:top w:w="16" w:type="dxa"/>
@@ -7598,7 +8432,7 @@
         </w:tc>
         <w:tc>
           <w:tcPr>
-            <w:tcW w:type="dxa" w:w="794"/>
+            <w:tcW w:type="dxa" w:w="907"/>
             <w:shd w:val="clear" w:color="auto" w:fill="F9FBF9"/>
             <w:tcMar>
               <w:top w:w="16" w:type="dxa"/>
@@ -7664,7 +8498,7 @@
         </w:tc>
         <w:tc>
           <w:tcPr>
-            <w:tcW w:type="dxa" w:w="2494"/>
+            <w:tcW w:type="dxa" w:w="4309"/>
             <w:shd w:val="clear" w:color="auto" w:fill="F9FBF9"/>
             <w:tcMar>
               <w:top w:w="16" w:type="dxa"/>
@@ -7691,40 +8525,7 @@
                 <w:color w:val="222222"/>
                 <w:sz w:val="14"/>
               </w:rPr>
-              <w:t>ESDM &amp; Center for Global Sustainability</w:t>
-            </w:r>
-          </w:p>
-        </w:tc>
-        <w:tc>
-          <w:tcPr>
-            <w:tcW w:type="dxa" w:w="2381"/>
-            <w:shd w:val="clear" w:color="auto" w:fill="F9FBF9"/>
-            <w:tcMar>
-              <w:top w:w="16" w:type="dxa"/>
-              <w:bottom w:w="16" w:type="dxa"/>
-              <w:left w:w="40" w:type="dxa"/>
-              <w:right w:w="40" w:type="dxa"/>
-            </w:tcMar>
-            <w:tcBorders>
-              <w:top w:val="single" w:sz="4" w:color="D8D8D8" w:space="0"/>
-              <w:left w:val="single" w:sz="4" w:color="D8D8D8" w:space="0"/>
-              <w:bottom w:val="single" w:sz="4" w:color="D8D8D8" w:space="0"/>
-              <w:right w:val="single" w:sz="4" w:color="D8D8D8" w:space="0"/>
-            </w:tcBorders>
-          </w:tcPr>
-          <w:p>
-            <w:pPr>
-              <w:spacing w:before="0" w:after="0" w:line="240" w:lineRule="auto"/>
-              <w:jc w:val="left"/>
-            </w:pPr>
-            <w:r>
-              <w:rPr>
-                <w:b w:val="0"/>
-                <w:i w:val="0"/>
-                <w:color w:val="222222"/>
-                <w:sz w:val="14"/>
-              </w:rPr>
-              <w:t>sulawesi_esdm_nikel.csv</w:t>
+              <w:t>Kementerian ESDM &amp; Center for Global Sustainability</w:t>
             </w:r>
           </w:p>
         </w:tc>
@@ -7765,7 +8566,7 @@
         </w:tc>
         <w:tc>
           <w:tcPr>
-            <w:tcW w:type="dxa" w:w="1928"/>
+            <w:tcW w:type="dxa" w:w="2154"/>
             <w:shd w:val="clear" w:color="auto" w:fill="FFFFFF"/>
             <w:tcMar>
               <w:top w:w="16" w:type="dxa"/>
@@ -7798,7 +8599,7 @@
         </w:tc>
         <w:tc>
           <w:tcPr>
-            <w:tcW w:type="dxa" w:w="1474"/>
+            <w:tcW w:type="dxa" w:w="1701"/>
             <w:shd w:val="clear" w:color="auto" w:fill="FFFFFF"/>
             <w:tcMar>
               <w:top w:w="16" w:type="dxa"/>
@@ -7831,7 +8632,7 @@
         </w:tc>
         <w:tc>
           <w:tcPr>
-            <w:tcW w:type="dxa" w:w="794"/>
+            <w:tcW w:type="dxa" w:w="907"/>
             <w:shd w:val="clear" w:color="auto" w:fill="FFFFFF"/>
             <w:tcMar>
               <w:top w:w="16" w:type="dxa"/>
@@ -7897,7 +8698,7 @@
         </w:tc>
         <w:tc>
           <w:tcPr>
-            <w:tcW w:type="dxa" w:w="2494"/>
+            <w:tcW w:type="dxa" w:w="4309"/>
             <w:shd w:val="clear" w:color="auto" w:fill="FFFFFF"/>
             <w:tcMar>
               <w:top w:w="16" w:type="dxa"/>
@@ -7925,39 +8726,6 @@
                 <w:sz w:val="14"/>
               </w:rPr>
               <w:t>Kementerian Investasi / BKPM &amp; BPS</w:t>
-            </w:r>
-          </w:p>
-        </w:tc>
-        <w:tc>
-          <w:tcPr>
-            <w:tcW w:type="dxa" w:w="2381"/>
-            <w:shd w:val="clear" w:color="auto" w:fill="FFFFFF"/>
-            <w:tcMar>
-              <w:top w:w="16" w:type="dxa"/>
-              <w:bottom w:w="16" w:type="dxa"/>
-              <w:left w:w="40" w:type="dxa"/>
-              <w:right w:w="40" w:type="dxa"/>
-            </w:tcMar>
-            <w:tcBorders>
-              <w:top w:val="single" w:sz="4" w:color="D8D8D8" w:space="0"/>
-              <w:left w:val="single" w:sz="4" w:color="D8D8D8" w:space="0"/>
-              <w:bottom w:val="single" w:sz="4" w:color="D8D8D8" w:space="0"/>
-              <w:right w:val="single" w:sz="4" w:color="D8D8D8" w:space="0"/>
-            </w:tcBorders>
-          </w:tcPr>
-          <w:p>
-            <w:pPr>
-              <w:spacing w:before="0" w:after="0" w:line="240" w:lineRule="auto"/>
-              <w:jc w:val="left"/>
-            </w:pPr>
-            <w:r>
-              <w:rPr>
-                <w:b w:val="0"/>
-                <w:i w:val="0"/>
-                <w:color w:val="222222"/>
-                <w:sz w:val="14"/>
-              </w:rPr>
-              <w:t>sulawesi_investasi_pmdn_2016_2024.csv</w:t>
             </w:r>
           </w:p>
         </w:tc>
@@ -7998,7 +8766,7 @@
         </w:tc>
         <w:tc>
           <w:tcPr>
-            <w:tcW w:type="dxa" w:w="1928"/>
+            <w:tcW w:type="dxa" w:w="2154"/>
             <w:shd w:val="clear" w:color="auto" w:fill="F9FBF9"/>
             <w:tcMar>
               <w:top w:w="16" w:type="dxa"/>
@@ -8031,7 +8799,7 @@
         </w:tc>
         <w:tc>
           <w:tcPr>
-            <w:tcW w:type="dxa" w:w="1474"/>
+            <w:tcW w:type="dxa" w:w="1701"/>
             <w:shd w:val="clear" w:color="auto" w:fill="F9FBF9"/>
             <w:tcMar>
               <w:top w:w="16" w:type="dxa"/>
@@ -8064,7 +8832,7 @@
         </w:tc>
         <w:tc>
           <w:tcPr>
-            <w:tcW w:type="dxa" w:w="794"/>
+            <w:tcW w:type="dxa" w:w="907"/>
             <w:shd w:val="clear" w:color="auto" w:fill="F9FBF9"/>
             <w:tcMar>
               <w:top w:w="16" w:type="dxa"/>
@@ -8130,7 +8898,7 @@
         </w:tc>
         <w:tc>
           <w:tcPr>
-            <w:tcW w:type="dxa" w:w="2494"/>
+            <w:tcW w:type="dxa" w:w="4309"/>
             <w:shd w:val="clear" w:color="auto" w:fill="F9FBF9"/>
             <w:tcMar>
               <w:top w:w="16" w:type="dxa"/>
@@ -8157,40 +8925,7 @@
                 <w:color w:val="222222"/>
                 <w:sz w:val="14"/>
               </w:rPr>
-              <w:t>BPS Provinsi (Subject 52)</w:t>
-            </w:r>
-          </w:p>
-        </w:tc>
-        <w:tc>
-          <w:tcPr>
-            <w:tcW w:type="dxa" w:w="2381"/>
-            <w:shd w:val="clear" w:color="auto" w:fill="F9FBF9"/>
-            <w:tcMar>
-              <w:top w:w="16" w:type="dxa"/>
-              <w:bottom w:w="16" w:type="dxa"/>
-              <w:left w:w="40" w:type="dxa"/>
-              <w:right w:w="40" w:type="dxa"/>
-            </w:tcMar>
-            <w:tcBorders>
-              <w:top w:val="single" w:sz="4" w:color="D8D8D8" w:space="0"/>
-              <w:left w:val="single" w:sz="4" w:color="D8D8D8" w:space="0"/>
-              <w:bottom w:val="single" w:sz="4" w:color="D8D8D8" w:space="0"/>
-              <w:right w:val="single" w:sz="4" w:color="D8D8D8" w:space="0"/>
-            </w:tcBorders>
-          </w:tcPr>
-          <w:p>
-            <w:pPr>
-              <w:spacing w:before="0" w:after="0" w:line="240" w:lineRule="auto"/>
-              <w:jc w:val="left"/>
-            </w:pPr>
-            <w:r>
-              <w:rPr>
-                <w:b w:val="0"/>
-                <w:i w:val="0"/>
-                <w:color w:val="222222"/>
-                <w:sz w:val="14"/>
-              </w:rPr>
-              <w:t>sulawesi_pdrb_sektoral_2016_2024.csv</w:t>
+              <w:t>BPS Provinsi se-Sulawesi (Subject 52)</w:t>
             </w:r>
           </w:p>
         </w:tc>
@@ -8231,7 +8966,7 @@
         </w:tc>
         <w:tc>
           <w:tcPr>
-            <w:tcW w:type="dxa" w:w="1928"/>
+            <w:tcW w:type="dxa" w:w="2154"/>
             <w:shd w:val="clear" w:color="auto" w:fill="FFFFFF"/>
             <w:tcMar>
               <w:top w:w="16" w:type="dxa"/>
@@ -8264,7 +8999,7 @@
         </w:tc>
         <w:tc>
           <w:tcPr>
-            <w:tcW w:type="dxa" w:w="1474"/>
+            <w:tcW w:type="dxa" w:w="1701"/>
             <w:shd w:val="clear" w:color="auto" w:fill="FFFFFF"/>
             <w:tcMar>
               <w:top w:w="16" w:type="dxa"/>
@@ -8297,7 +9032,7 @@
         </w:tc>
         <w:tc>
           <w:tcPr>
-            <w:tcW w:type="dxa" w:w="794"/>
+            <w:tcW w:type="dxa" w:w="907"/>
             <w:shd w:val="clear" w:color="auto" w:fill="FFFFFF"/>
             <w:tcMar>
               <w:top w:w="16" w:type="dxa"/>
@@ -8363,7 +9098,7 @@
         </w:tc>
         <w:tc>
           <w:tcPr>
-            <w:tcW w:type="dxa" w:w="2494"/>
+            <w:tcW w:type="dxa" w:w="4309"/>
             <w:shd w:val="clear" w:color="auto" w:fill="FFFFFF"/>
             <w:tcMar>
               <w:top w:w="16" w:type="dxa"/>
@@ -8390,40 +9125,7 @@
                 <w:color w:val="222222"/>
                 <w:sz w:val="14"/>
               </w:rPr>
-              <w:t>BPS Kabupaten se-Sulteng</w:t>
-            </w:r>
-          </w:p>
-        </w:tc>
-        <w:tc>
-          <w:tcPr>
-            <w:tcW w:type="dxa" w:w="2381"/>
-            <w:shd w:val="clear" w:color="auto" w:fill="FFFFFF"/>
-            <w:tcMar>
-              <w:top w:w="16" w:type="dxa"/>
-              <w:bottom w:w="16" w:type="dxa"/>
-              <w:left w:w="40" w:type="dxa"/>
-              <w:right w:w="40" w:type="dxa"/>
-            </w:tcMar>
-            <w:tcBorders>
-              <w:top w:val="single" w:sz="4" w:color="D8D8D8" w:space="0"/>
-              <w:left w:val="single" w:sz="4" w:color="D8D8D8" w:space="0"/>
-              <w:bottom w:val="single" w:sz="4" w:color="D8D8D8" w:space="0"/>
-              <w:right w:val="single" w:sz="4" w:color="D8D8D8" w:space="0"/>
-            </w:tcBorders>
-          </w:tcPr>
-          <w:p>
-            <w:pPr>
-              <w:spacing w:before="0" w:after="0" w:line="240" w:lineRule="auto"/>
-              <w:jc w:val="left"/>
-            </w:pPr>
-            <w:r>
-              <w:rPr>
-                <w:b w:val="0"/>
-                <w:i w:val="0"/>
-                <w:color w:val="222222"/>
-                <w:sz w:val="14"/>
-              </w:rPr>
-              <w:t>sulawesi_pdrb_sektoral_kabupaten_2016_2024.csv</w:t>
+              <w:t>BPS Kabupaten se-Sulawesi Tengah</w:t>
             </w:r>
           </w:p>
         </w:tc>
@@ -8464,7 +9166,7 @@
         </w:tc>
         <w:tc>
           <w:tcPr>
-            <w:tcW w:type="dxa" w:w="1928"/>
+            <w:tcW w:type="dxa" w:w="2154"/>
             <w:shd w:val="clear" w:color="auto" w:fill="F9FBF9"/>
             <w:tcMar>
               <w:top w:w="16" w:type="dxa"/>
@@ -8497,7 +9199,7 @@
         </w:tc>
         <w:tc>
           <w:tcPr>
-            <w:tcW w:type="dxa" w:w="1474"/>
+            <w:tcW w:type="dxa" w:w="1701"/>
             <w:shd w:val="clear" w:color="auto" w:fill="F9FBF9"/>
             <w:tcMar>
               <w:top w:w="16" w:type="dxa"/>
@@ -8530,7 +9232,7 @@
         </w:tc>
         <w:tc>
           <w:tcPr>
-            <w:tcW w:type="dxa" w:w="794"/>
+            <w:tcW w:type="dxa" w:w="907"/>
             <w:shd w:val="clear" w:color="auto" w:fill="F9FBF9"/>
             <w:tcMar>
               <w:top w:w="16" w:type="dxa"/>
@@ -8596,7 +9298,7 @@
         </w:tc>
         <w:tc>
           <w:tcPr>
-            <w:tcW w:type="dxa" w:w="2494"/>
+            <w:tcW w:type="dxa" w:w="4309"/>
             <w:shd w:val="clear" w:color="auto" w:fill="F9FBF9"/>
             <w:tcMar>
               <w:top w:w="16" w:type="dxa"/>
@@ -8623,40 +9325,7 @@
                 <w:color w:val="222222"/>
                 <w:sz w:val="14"/>
               </w:rPr>
-              <w:t>Global Forest Watch (GFW API v2)</w:t>
-            </w:r>
-          </w:p>
-        </w:tc>
-        <w:tc>
-          <w:tcPr>
-            <w:tcW w:type="dxa" w:w="2381"/>
-            <w:shd w:val="clear" w:color="auto" w:fill="F9FBF9"/>
-            <w:tcMar>
-              <w:top w:w="16" w:type="dxa"/>
-              <w:bottom w:w="16" w:type="dxa"/>
-              <w:left w:w="40" w:type="dxa"/>
-              <w:right w:w="40" w:type="dxa"/>
-            </w:tcMar>
-            <w:tcBorders>
-              <w:top w:val="single" w:sz="4" w:color="D8D8D8" w:space="0"/>
-              <w:left w:val="single" w:sz="4" w:color="D8D8D8" w:space="0"/>
-              <w:bottom w:val="single" w:sz="4" w:color="D8D8D8" w:space="0"/>
-              <w:right w:val="single" w:sz="4" w:color="D8D8D8" w:space="0"/>
-            </w:tcBorders>
-          </w:tcPr>
-          <w:p>
-            <w:pPr>
-              <w:spacing w:before="0" w:after="0" w:line="240" w:lineRule="auto"/>
-              <w:jc w:val="left"/>
-            </w:pPr>
-            <w:r>
-              <w:rPr>
-                <w:b w:val="0"/>
-                <w:i w:val="0"/>
-                <w:color w:val="222222"/>
-                <w:sz w:val="14"/>
-              </w:rPr>
-              <w:t>sulawesi_gfw_master_1_dekade_2014_2023_v3.csv</w:t>
+              <w:t>Global Forest Watch (University of Maryland)</w:t>
             </w:r>
           </w:p>
         </w:tc>
@@ -8697,7 +9366,7 @@
         </w:tc>
         <w:tc>
           <w:tcPr>
-            <w:tcW w:type="dxa" w:w="1928"/>
+            <w:tcW w:type="dxa" w:w="2154"/>
             <w:shd w:val="clear" w:color="auto" w:fill="FFFFFF"/>
             <w:tcMar>
               <w:top w:w="16" w:type="dxa"/>
@@ -8730,7 +9399,7 @@
         </w:tc>
         <w:tc>
           <w:tcPr>
-            <w:tcW w:type="dxa" w:w="1474"/>
+            <w:tcW w:type="dxa" w:w="1701"/>
             <w:shd w:val="clear" w:color="auto" w:fill="FFFFFF"/>
             <w:tcMar>
               <w:top w:w="16" w:type="dxa"/>
@@ -8763,7 +9432,7 @@
         </w:tc>
         <w:tc>
           <w:tcPr>
-            <w:tcW w:type="dxa" w:w="794"/>
+            <w:tcW w:type="dxa" w:w="907"/>
             <w:shd w:val="clear" w:color="auto" w:fill="FFFFFF"/>
             <w:tcMar>
               <w:top w:w="16" w:type="dxa"/>
@@ -8829,7 +9498,7 @@
         </w:tc>
         <w:tc>
           <w:tcPr>
-            <w:tcW w:type="dxa" w:w="2494"/>
+            <w:tcW w:type="dxa" w:w="4309"/>
             <w:shd w:val="clear" w:color="auto" w:fill="FFFFFF"/>
             <w:tcMar>
               <w:top w:w="16" w:type="dxa"/>
@@ -8857,39 +9526,6 @@
                 <w:sz w:val="14"/>
               </w:rPr>
               <w:t>KNKT, Perpres PSN, Laporan Korporasi</w:t>
-            </w:r>
-          </w:p>
-        </w:tc>
-        <w:tc>
-          <w:tcPr>
-            <w:tcW w:type="dxa" w:w="2381"/>
-            <w:shd w:val="clear" w:color="auto" w:fill="FFFFFF"/>
-            <w:tcMar>
-              <w:top w:w="16" w:type="dxa"/>
-              <w:bottom w:w="16" w:type="dxa"/>
-              <w:left w:w="40" w:type="dxa"/>
-              <w:right w:w="40" w:type="dxa"/>
-            </w:tcMar>
-            <w:tcBorders>
-              <w:top w:val="single" w:sz="4" w:color="D8D8D8" w:space="0"/>
-              <w:left w:val="single" w:sz="4" w:color="D8D8D8" w:space="0"/>
-              <w:bottom w:val="single" w:sz="4" w:color="D8D8D8" w:space="0"/>
-              <w:right w:val="single" w:sz="4" w:color="D8D8D8" w:space="0"/>
-            </w:tcBorders>
-          </w:tcPr>
-          <w:p>
-            <w:pPr>
-              <w:spacing w:before="0" w:after="0" w:line="240" w:lineRule="auto"/>
-              <w:jc w:val="left"/>
-            </w:pPr>
-            <w:r>
-              <w:rPr>
-                <w:b w:val="0"/>
-                <w:i w:val="0"/>
-                <w:color w:val="222222"/>
-                <w:sz w:val="14"/>
-              </w:rPr>
-              <w:t>sulawesi_logistik_simpul_nikel.csv</w:t>
             </w:r>
           </w:p>
         </w:tc>
@@ -8923,7 +9559,7 @@
           <w:color w:val="2E7D32"/>
           <w:sz w:val="15"/>
         </w:rPr>
-        <w:t>Tabel 1.6: Matriks Tahapan dan Alur Kerangka Kerja Riset Bab 1</w:t>
+        <w:t>Tabel 1.7: Matriks Tahapan dan Alur Kerangka Kerja Riset Bab 1</w:t>
       </w:r>
     </w:p>
     <w:tbl>

</xml_diff>